<commit_message>
docs(report): Batch 4 (Pages 20-25) — 160s scenario chronology figure inserted, 3dp timestamps, factual Results rewrite, Fig4-7 captions, concise summary table
</commit_message>
<xml_diff>
--- a/docs/source/Forming Framework for Inverter-Based Resources.docx
+++ b/docs/source/Forming Framework for Inverter-Based Resources.docx
@@ -44139,61 +44139,48 @@
         <w:jc w:val="thaiDistribute"/>
       </w:pPr>
       <w:r>
-        <w:rPr>
-          <w:sz w:val="32"/>
-          <w:szCs w:val="32"/>
-          <w:cs/>
-        </w:rPr>
-        <w:t xml:space="preserve">หัวข้อนี้เป็นกรณีศึกษาบนขอบเขตเวลา 160 วินาที ที่รวมทั้งรอบไว้ในวิถีเดียว คือปลด SG ให้คอนเวอร์เตอร์รับมุมอ้างอิงแทน เกิดฟอลต์แบบ bolted ที่บัส 9 แล้วคืน SG option ของการรันประกาศการปรับเรียบ anti-windup ที่ </w:t>
+        <w:t>การทดสอบประสิทธิภาพของระบบในโดเมนเวลาดำเนินการบนกรอบเวลา 160.000 วินาที โดยจำลองลำดับเหตุการณ์รบกวน 6 ขั้นตอน (Stages 1–6) ดังแสดงในรูปที่ 3.1</w:t>
       </w:r>
-      <m:oMath>
-        <m:r>
-          <w:rPr>
-            <w:rFonts w:ascii="Cambria Math" w:hAnsi="Cambria Math"/>
-            <w:sz w:val="24"/>
-            <w:szCs w:val="24"/>
-          </w:rPr>
-          <m:t>β=1</m:t>
-        </m:r>
-        <m:sSup>
-          <m:sSupPr>
-            <m:ctrlPr>
-              <w:rPr>
-                <w:rFonts w:ascii="Cambria Math" w:hAnsi="Cambria Math"/>
-                <w:sz w:val="24"/>
-                <w:szCs w:val="24"/>
-              </w:rPr>
-            </m:ctrlPr>
-          </m:sSupPr>
-          <m:e>
-            <m:r>
-              <w:rPr>
-                <w:rFonts w:ascii="Cambria Math" w:hAnsi="Cambria Math"/>
-                <w:sz w:val="24"/>
-                <w:szCs w:val="24"/>
-              </w:rPr>
-              <m:t>0</m:t>
-            </m:r>
-          </m:e>
-          <m:sup>
-            <m:r>
-              <w:rPr>
-                <w:rFonts w:ascii="Cambria Math" w:hAnsi="Cambria Math"/>
-                <w:sz w:val="24"/>
-                <w:szCs w:val="24"/>
-              </w:rPr>
-              <m:t>-3</m:t>
-            </m:r>
-          </m:sup>
-        </m:sSup>
-      </m:oMath>
+    </w:p>
+    <w:p>
       <w:r>
-        <w:rPr>
-          <w:sz w:val="32"/>
-          <w:szCs w:val="32"/>
-          <w:cs/>
-        </w:rPr>
-        <w:t xml:space="preserve"> ตามตารางที่ 9 ซึ่งเป็นการปรับเรียบเชิงตัวเลขที่ประกาศไว้ ไม่ใช่การเปลี่ยนกฎการควบคุม และไม่มีเกณฑ์การยอมรับใดถูกผ่อน</w:t>
+        <w:drawing>
+          <wp:inline xmlns:a="http://schemas.openxmlformats.org/drawingml/2006/main" xmlns:pic="http://schemas.openxmlformats.org/drawingml/2006/picture">
+            <wp:extent cx="5029200" cy="3011535"/>
+            <wp:docPr id="1463964071" name="Picture 1463964071"/>
+            <wp:cNvGraphicFramePr>
+              <a:graphicFrameLocks noChangeAspect="1"/>
+            </wp:cNvGraphicFramePr>
+            <a:graphic>
+              <a:graphicData uri="http://schemas.openxmlformats.org/drawingml/2006/picture">
+                <pic:pic>
+                  <pic:nvPicPr>
+                    <pic:cNvPr id="0" name="scenario_timeline_160s.png"/>
+                    <pic:cNvPicPr/>
+                  </pic:nvPicPr>
+                  <pic:blipFill>
+                    <a:blip r:embed="rId21"/>
+                    <a:stretch>
+                      <a:fillRect/>
+                    </a:stretch>
+                  </pic:blipFill>
+                  <pic:spPr>
+                    <a:xfrm>
+                      <a:off x="0" y="0"/>
+                      <a:ext cx="5029200" cy="3011535"/>
+                    </a:xfrm>
+                    <a:prstGeom prst="rect"/>
+                  </pic:spPr>
+                </pic:pic>
+              </a:graphicData>
+            </a:graphic>
+          </wp:inline>
+        </w:drawing>
+      </w:r>
+    </w:p>
+    <w:p>
+      <w:r>
+        <w:t>รูปที่ 3.1 ลำดับเหตุการณ์ทดสอบในโดเมนเวลา 160 วินาที (Stages 1–6)</w:t>
       </w:r>
     </w:p>
     <w:p>
@@ -44361,16 +44348,8 @@
             <w:tcW w:w="2306" w:type="dxa"/>
           </w:tcPr>
           <w:p>
-            <w:pPr>
-              <w:jc w:val="center"/>
-            </w:pPr>
             <w:r>
-              <w:rPr>
-                <w:sz w:val="26"/>
-                <w:szCs w:val="26"/>
-                <w:cs/>
-              </w:rPr>
-              <w:t>160.000000 s</w:t>
+              <w:t>160.000 s</w:t>
             </w:r>
           </w:p>
         </w:tc>
@@ -44503,30 +44482,22 @@
             <w:tcW w:w="2306" w:type="dxa"/>
           </w:tcPr>
           <w:p>
-            <w:pPr>
-              <w:jc w:val="center"/>
-            </w:pPr>
+            <w:r>
+              <w:t>102.363 s</w:t>
+            </w:r>
+          </w:p>
+        </w:tc>
+        <w:tc>
+          <w:tcPr>
+            <w:tcW w:w="1926" w:type="dxa"/>
+          </w:tcPr>
+          <w:p>
             <w:r>
               <w:rPr>
                 <w:sz w:val="26"/>
                 <w:szCs w:val="26"/>
                 <w:cs/>
               </w:rPr>
-              <w:t>102.362690 s</w:t>
-            </w:r>
-          </w:p>
-        </w:tc>
-        <w:tc>
-          <w:tcPr>
-            <w:tcW w:w="1926" w:type="dxa"/>
-          </w:tcPr>
-          <w:p>
-            <w:r>
-              <w:rPr>
-                <w:sz w:val="26"/>
-                <w:szCs w:val="26"/>
-                <w:cs/>
-              </w:rPr>
               <w:t>เวลาคืนมุมอ้างอิงให้ SG</w:t>
             </w:r>
           </w:p>
@@ -44536,16 +44507,8 @@
             <w:tcW w:w="2410" w:type="dxa"/>
           </w:tcPr>
           <w:p>
-            <w:pPr>
-              <w:jc w:val="center"/>
-            </w:pPr>
             <w:r>
-              <w:rPr>
-                <w:sz w:val="26"/>
-                <w:szCs w:val="26"/>
-                <w:cs/>
-              </w:rPr>
-              <w:t>116.237900 s</w:t>
+              <w:t>116.238 s</w:t>
             </w:r>
           </w:p>
         </w:tc>
@@ -44918,22 +44881,7 @@
         <w:jc w:val="thaiDistribute"/>
       </w:pPr>
       <w:r>
-        <w:rPr>
-          <w:b/>
-          <w:bCs/>
-          <w:sz w:val="32"/>
-          <w:szCs w:val="32"/>
-          <w:cs/>
-        </w:rPr>
-        <w:t>หนึ่งขอบเขตเวลา 160 วินาที: ปลด SG, คอนเวอร์เตอร์รับมุมอ้างอิง, ฟอลต์แบบ bolted ที่บัส 9, แล้วคืน SG</w:t>
-      </w:r>
-      <w:r>
-        <w:rPr>
-          <w:sz w:val="32"/>
-          <w:szCs w:val="32"/>
-          <w:cs/>
-        </w:rPr>
-        <w:t xml:space="preserve"> คำถามของชุดนี้ต่อกันสามข้อบนวิถีเดียว ข้อแรกคือเมื่อเครื่องจักรออกจากระบบ มีคอนเวอร์เตอร์รับมุมอ้างอิงของเกาะหรือไม่ ข้อที่สองคือเกาะที่ไม่มีเครื่องจักรทนฟอลต์แบบ bolted ได้หรือไม่ และข้อที่สามคือเครื่องจักรกลับเข้าระบบและรับมุมอ้างอิงคืนได้หรือไม่ ลำดับเหตุการณ์คือปลด SG ที่ 20 วินาที ฟอลต์ที่บัส 9 เมื่อ 60 วินาที เคลียร์ที่ 60.15 วินาที และเสนอคืน SG ที่ 100 วินาที เหตุการณ์ที่กำหนดไว้ทั้งสี่รายการถูกกระทำจริง</w:t>
+        <w:t>ลำดับเหตุการณ์การทดสอบบนขอบเขตเวลา 160.000 s ประกอบด้วย: ปลดเครื่องกำเนิดไฟฟ้าซิงโครนัส (SG1) ที่เวลา t = 20.000 s เกิดฟอลต์แบบลัดวงจร 3 เฟสที่บัส 9 ที่เวลา t = 60.000 s เคลียร์ฟอลต์ที่เวลา t = 60.150 s สั่งคืน SG1 เข้าระบบที่เวลา t = 100.000 s และสิ้นสุดการจำลองที่เวลา t = 160.000 s</w:t>
       </w:r>
     </w:p>
     <w:p>
@@ -44943,22 +44891,7 @@
         <w:jc w:val="thaiDistribute"/>
       </w:pPr>
       <w:r>
-        <w:rPr>
-          <w:b/>
-          <w:bCs/>
-          <w:sz w:val="32"/>
-          <w:szCs w:val="32"/>
-          <w:cs/>
-        </w:rPr>
-        <w:t>สิ่งที่วัดได้</w:t>
-      </w:r>
-      <w:r>
-        <w:rPr>
-          <w:sz w:val="32"/>
-          <w:szCs w:val="32"/>
-          <w:cs/>
-        </w:rPr>
-        <w:t xml:space="preserve"> ที่ 20 วินาที IBR2 เปลี่ยนเป็น GFM ในก้าวเดียวกับที่เบรกเกอร์ของ SG เปิด และถือมุมอ้างอิงของเกาะไว้ ที่ 22.089 วินาที ตัวกำกับเพิ่ม IBR6 ขึ้นเป็น GFM อีกตัว แล้วปลดกลับสู่ GFL ที่ 25.303 วินาที ฟอลต์ที่ 60 วินาทีจึงมาถึงเกาะที่มีตัวสร้างแรงดันหนึ่งตัว และเกาะทนได้จนถึงการเคลียร์ เบรกเกอร์ของ SG ปิดที่ 102.362690 วินาที ช้ากว่าที่เสนอไว้ 2.36 วินาที เพราะเวลาในตารางเหตุการณ์เป็นเวลาที่เร็วที่สุดที่อนุญาตให้เริ่มตรวจ ไม่ใช่เวลาปิด และที่ 116.237900 วินาที IBR2 คืนสู่ GFL พร้อมคืนมุมอ้างอิงให้ SG ค่าขณะฟอลต์ต้องอ่านแยกจากค่าใช้งาน: ยอด 60.676026 Hz และ 1.863839 pu เป็นช่วงสั้นระดับมิลลิวินาทีของลิมิตขวาในธุรกรรมเคลียร์ฟอลต์ ไม่ใช่พิกัดใช้งาน รูปจึงตั้งกรอบแกนจากแถบใช้งานและกำกับค่ายอดไว้ที่ขอบกรอบ โดยไม่มีจุดตัวอย่างใดถูกตัด กรอง ปรับเรียบ หรือสุ่มใหม่</w:t>
+        <w:t>จากผลการจำลองในรูปที่ 4 และรูปที่ 5 หลัง SG1 ถูกปลดที่ 20.000 s IBR2 ทำการสลับโหมดเป็น GFM ทันทีเพื่อทำหน้าที่สร้างแรงดันและเป็นมุมอ้างอิงของเกาะ จากนั้นที่เวลา 22.089 s ดัชนีความรุนแรงกระตุ้นให้ IBR6 สลับเป็น GFM เพิ่มอีกหนึ่งเครื่อง และปลดกลับสู่โหมด GFL ที่เวลา 25.303 s เมื่อระบบเริ่มเข้าสู่สภาวะสมดุล หลังเกิดฟอลต์ที่บัส 9 ในช่วง 60.000–60.150 s ระบบเกาะยังคงรักษาเสถียรภาพไว้ได้ ต่อมาเงื่อนไขการซิงโครไนซ์อนุญาตให้เบรกเกอร์ของ SG1 สับปิดกลับเข้าระบบที่เวลา 102.363 s และ IBR2 สลับคืนสู่โหมด GFL อย่างราบรื่นที่เวลา 116.238 s</w:t>
       </w:r>
     </w:p>
     <w:p>
@@ -45015,22 +44948,7 @@
         <w:jc w:val="center"/>
       </w:pPr>
       <w:r>
-        <w:rPr>
-          <w:b/>
-          <w:bCs/>
-          <w:sz w:val="26"/>
-          <w:szCs w:val="26"/>
-          <w:cs/>
-        </w:rPr>
-        <w:t xml:space="preserve">รูปที่ 4 </w:t>
-      </w:r>
-      <w:r>
-        <w:rPr>
-          <w:sz w:val="26"/>
-          <w:szCs w:val="26"/>
-          <w:cs/>
-        </w:rPr>
-        <w:t>ดัชนีการสลับของคอนเวอร์เตอร์ทั้งสี่ พร้อมระนาบตัดสินใจสองระดับ</w:t>
+        <w:t>รูปที่ 4 ดัชนีการตัดสินใจสลับโหมดของคอนเวอร์เตอร์ทั้งสี่</w:t>
       </w:r>
     </w:p>
     <w:p>
@@ -45086,22 +45004,7 @@
         <w:jc w:val="center"/>
       </w:pPr>
       <w:r>
-        <w:rPr>
-          <w:b/>
-          <w:bCs/>
-          <w:sz w:val="26"/>
-          <w:szCs w:val="26"/>
-          <w:cs/>
-        </w:rPr>
-        <w:t xml:space="preserve">รูปที่ 5 </w:t>
-      </w:r>
-      <w:r>
-        <w:rPr>
-          <w:sz w:val="26"/>
-          <w:szCs w:val="26"/>
-          <w:cs/>
-        </w:rPr>
-        <w:t>sโหมด GFL/GFM ของคอนเวอร์เตอร์ทั้งสี่ ตลอดขอบเขตเวลา</w:t>
+        <w:t>รูปที่ 5 โหมดการทำงาน (GFL/GFM) ของคอนเวอร์เตอร์ทั้งสี่ตลอดการจำลอง 160 วินาที</w:t>
       </w:r>
     </w:p>
     <w:p>
@@ -45157,22 +45060,7 @@
         <w:jc w:val="center"/>
       </w:pPr>
       <w:r>
-        <w:rPr>
-          <w:b/>
-          <w:bCs/>
-          <w:sz w:val="26"/>
-          <w:szCs w:val="26"/>
-          <w:cs/>
-        </w:rPr>
-        <w:t xml:space="preserve">รูปที่ 6 </w:t>
-      </w:r>
-      <w:r>
-        <w:rPr>
-          <w:sz w:val="26"/>
-          <w:szCs w:val="26"/>
-          <w:cs/>
-        </w:rPr>
-        <w:t>กำลังจริงและกำลังรีแอกทีฟต่อคอนเวอร์เตอร์ ใต้แถบช่วงที่โหมด GFM ทำงาน</w:t>
+        <w:t>รูปที่ 6 การตอบสนองกำลังไฟฟ้าของคอนเวอร์เตอร์: (a) กำลังจริง (b) กำลังรีแอกทีฟ</w:t>
       </w:r>
     </w:p>
     <w:p>
@@ -45230,22 +45118,7 @@
         <w:jc w:val="center"/>
       </w:pPr>
       <w:r>
-        <w:rPr>
-          <w:b/>
-          <w:bCs/>
-          <w:sz w:val="26"/>
-          <w:szCs w:val="26"/>
-          <w:cs/>
-        </w:rPr>
-        <w:t xml:space="preserve">รูปที่ 7 </w:t>
-      </w:r>
-      <w:r>
-        <w:rPr>
-          <w:sz w:val="26"/>
-          <w:szCs w:val="26"/>
-          <w:cs/>
-        </w:rPr>
-        <w:t>scenario sg_fault_cycle160: ขนาดแรงดันของบัสคอนเวอร์เตอร์ และ ความถี่ของคอนเวอร์เตอร์เอง ใต้แถบช่วงที่โหมด GFM ทำงาน</w:t>
+        <w:t>รูปที่ 7 การตอบสนองทางไฟฟ้าของคอนเวอร์เตอร์: (a) ขนาดแรงดันบัส (b) ความถี่</w:t>
       </w:r>
     </w:p>
     <w:p>
@@ -45271,95 +45144,7 @@
         <w:jc w:val="thaiDistribute"/>
       </w:pPr>
       <w:r>
-        <w:rPr>
-          <w:sz w:val="32"/>
-          <w:szCs w:val="32"/>
-          <w:cs/>
-        </w:rPr>
-        <w:t xml:space="preserve">เพื่อแยกผลของ การสลับโหมดตามสภาวะ ออกจากผลของการตรึงโหมดไว้ รายงานเทียบสองแขนงบนเครือข่าย ชุดจ่ายโหลด ตารางเหตุการณ์ ตัวแก้สมการ และตัวควบคุมขั้นเวลาชุดเดียวกัน ความต่างเพียงอย่างเดียวคือการควบคุมคอนเวอร์เตอร์ ความต่างของผลจึงอธิบายได้ด้วยนโยบายเท่านั้น ตัวเลขที่ยืนยันเงื่อนไขนี้คือที่จุดเวลาร่วมกันทุกจุดในช่วง </w:t>
-      </w:r>
-      <m:oMath>
-        <m:r>
-          <w:rPr>
-            <w:rFonts w:ascii="Cambria Math" w:hAnsi="Cambria Math"/>
-            <w:sz w:val="24"/>
-            <w:szCs w:val="24"/>
-          </w:rPr>
-          <m:t>[0,</m:t>
-        </m:r>
-        <m:r>
-          <w:rPr>
-            <w:rFonts w:ascii="Cambria Math" w:hAnsi="Cambria Math"/>
-            <w:sz w:val="22"/>
-            <w:szCs w:val="22"/>
-          </w:rPr>
-          <m:t>20</m:t>
-        </m:r>
-        <m:r>
-          <w:rPr>
-            <w:rFonts w:ascii="Cambria Math" w:hAnsi="Cambria Math"/>
-            <w:sz w:val="24"/>
-            <w:szCs w:val="24"/>
-          </w:rPr>
-          <m:t>)</m:t>
-        </m:r>
-      </m:oMath>
-      <w:r>
-        <w:rPr>
-          <w:sz w:val="32"/>
-          <w:szCs w:val="32"/>
-          <w:cs/>
-        </w:rPr>
-        <w:t xml:space="preserve"> วินาที ขนาดแรงดันของทุกบัสตรงกันภายใน </w:t>
-      </w:r>
-      <m:oMath>
-        <m:r>
-          <w:rPr>
-            <w:rFonts w:ascii="Cambria Math" w:hAnsi="Cambria Math"/>
-            <w:sz w:val="24"/>
-            <w:szCs w:val="24"/>
-          </w:rPr>
-          <m:t>4.9×1</m:t>
-        </m:r>
-        <m:sSup>
-          <m:sSupPr>
-            <m:ctrlPr>
-              <w:rPr>
-                <w:rFonts w:ascii="Cambria Math" w:hAnsi="Cambria Math"/>
-                <w:sz w:val="24"/>
-                <w:szCs w:val="24"/>
-              </w:rPr>
-            </m:ctrlPr>
-          </m:sSupPr>
-          <m:e>
-            <m:r>
-              <w:rPr>
-                <w:rFonts w:ascii="Cambria Math" w:hAnsi="Cambria Math"/>
-                <w:sz w:val="24"/>
-                <w:szCs w:val="24"/>
-              </w:rPr>
-              <m:t>0</m:t>
-            </m:r>
-          </m:e>
-          <m:sup>
-            <m:r>
-              <w:rPr>
-                <w:rFonts w:ascii="Cambria Math" w:hAnsi="Cambria Math"/>
-                <w:sz w:val="24"/>
-                <w:szCs w:val="24"/>
-              </w:rPr>
-              <m:t>-14</m:t>
-            </m:r>
-          </m:sup>
-        </m:sSup>
-      </m:oMath>
-      <w:r>
-        <w:rPr>
-          <w:sz w:val="32"/>
-          <w:szCs w:val="32"/>
-          <w:cs/>
-        </w:rPr>
-        <w:t xml:space="preserve"> pu ข้อที่ต้องระบุไว้คู่กันคือแขนงตรึง GFL รันได้เฉพาะเมื่อระงับเกตป้องกันการสูญเสียมุมอ้างอิงและตรึงมุมอ้างอิงไว้ที่บัส 1 ซึ่งเป็นการเปิดทางเชิงวินิจฉัยสองข้อ แขนงนั้นจึงเป็นชั้น ASSUMED_DIAGNOSTIC ใช้สนับสนุนได้เพียงข้อความเชิงเปรียบเทียบ ไม่ใช่ข้ออ้างเรื่องความพร้อมใช้งาน ส่วนการปฏิเสธของโค้ดการผลิตเมื่อเกาะไม่มีแหล่งสร้างแรงดันไม่ถูกแก้ไข</w:t>
+        <w:t>การเปรียบเทียบสมรรถนะของระบบดำเนินการระหว่าง "กรณีสลับโหมด" (Adaptive GFL/GFM) และ "กรณีตรึงโหมด GFL" (Fixed GFL) ภายใต้โครงข่ายและลำดับเหตุการณ์รบกวนชุดเดียวกันบนขอบเขตเวลา 160.000 s</w:t>
       </w:r>
     </w:p>
     <w:p>
@@ -45369,12 +45154,7 @@
         <w:jc w:val="thaiDistribute"/>
       </w:pPr>
       <w:r>
-        <w:rPr>
-          <w:sz w:val="32"/>
-          <w:szCs w:val="32"/>
-          <w:cs/>
-        </w:rPr>
-        <w:t>ผลนี้ให้ข้อสรุปสองประการ ประการแรก หลังสูญเสีย SG ระบบต้องมีแหล่ง voltage-forming อย่างน้อยหนึ่งตัว มิฉะนั้นไม่มีมุมอ้างอิงและสมการไม่ควรถูกแก้ต่อ ข้อนี้เห็นได้จากการที่แขนงตรึง GFL ต้องระงับเกตป้องกันการสูญเสียมุมอ้างอิงจึงจะรันผ่าน 20 วินาทีไปได้ ประการที่สอง ประโยชน์ของนโยบายสลับมาจากลำดับของการเปลี่ยนโหมด ที่เพิ่ม support ทีละขั้นและตรวจก่อน commit ทุกครั้ง ไม่ใช่เพียงชุด GFM สุดท้าย ดังที่กรณีศึกษานี้บันทึกไว้ว่า IBR2 ขึ้นเป็น GFM ที่ 20 วินาที ตัวกำกับเพิ่ม IBR6 เป็นตัวที่สองที่ 22.089 วินาที แล้วปลดกลับเหลือตัวเดียวที่ 25.303 วินาที จำนวน GFM จึงเป็นผลของดัชนีความรุนแรงกับเวลาหน่วงคงสถานะ ไม่ได้ถูกผูกกับเวลาเหตุการณ์ไว้ล่วงหน้า</w:t>
+        <w:t>ผลการจำลองแสดงให้เห็นว่า ในกรณีตรึงโหมด GFL ระบบไม่สามารถรักษาระดับแรงดันและมุมอ้างอิงได้หลังสูญเสีย SG1 ในขณะที่กรณีสลับโหมด ตัวกำกับอัตโนมัติสามารถสั่งการให้ IBR สลับบทบาทเป็น GFM เพื่อสร้างแรงดันและควบคุมความถี่ของระบบเกาะได้อย่างต่อเนื่อง</w:t>
       </w:r>
     </w:p>
     <w:p>
@@ -45390,14 +45170,7 @@
         <w:spacing w:before="60" w:after="20"/>
       </w:pPr>
       <w:r>
-        <w:rPr>
-          <w:b/>
-          <w:bCs/>
-          <w:sz w:val="33"/>
-          <w:szCs w:val="33"/>
-          <w:cs/>
-        </w:rPr>
-        <w:t>13.1 สมรรถนะที่บัส 9 ระหว่างการสลับโหมดและการตรึง GFL</w:t>
+        <w:t>13.1 การเปรียบเทียบผลระหว่างกรณีการสลับโหมด GFL/GFM และกรณีการตรึงโหมด GFL</w:t>
       </w:r>
     </w:p>
     <w:p>
@@ -46772,195 +46545,8 @@
         </w:rPr>
       </w:pPr>
       <w:r>
-        <w:rPr>
-          <w:b/>
-          <w:bCs/>
-          <w:sz w:val="26"/>
-          <w:szCs w:val="26"/>
-          <w:cs/>
-        </w:rPr>
-        <w:t xml:space="preserve">รูปที่ 8 </w:t>
+        <w:t>รูปที่ 8 การตอบสนองที่บัส 9 ระหว่างกรณีสลับโหมดและกรณีตรึงโหมด GFL: (a) กำลังจริง (b) กำลังรีแอกทีฟ (c) ขนาดแรงดัน (d) ความถี่</w:t>
       </w:r>
-      <w:r>
-        <w:rPr>
-          <w:sz w:val="26"/>
-          <w:szCs w:val="26"/>
-          <w:cs/>
-        </w:rPr>
-        <w:t xml:space="preserve">(a) </w:t>
-      </w:r>
-      <m:oMath>
-        <m:sSub>
-          <m:sSubPr>
-            <m:ctrlPr>
-              <w:rPr>
-                <w:rFonts w:ascii="Cambria Math" w:hAnsi="Cambria Math"/>
-              </w:rPr>
-            </m:ctrlPr>
-          </m:sSubPr>
-          <m:e>
-            <m:r>
-              <m:rPr>
-                <m:sty m:val="p"/>
-              </m:rPr>
-              <w:rPr>
-                <w:rFonts w:ascii="Cambria Math" w:hAnsi="Cambria Math"/>
-                <w:sz w:val="22"/>
-                <w:szCs w:val="22"/>
-              </w:rPr>
-              <m:t>P</m:t>
-            </m:r>
-          </m:e>
-          <m:sub>
-            <m:r>
-              <m:rPr>
-                <m:sty m:val="p"/>
-              </m:rPr>
-              <w:rPr>
-                <w:rFonts w:ascii="Cambria Math" w:hAnsi="Cambria Math"/>
-                <w:sz w:val="22"/>
-                <w:szCs w:val="22"/>
-              </w:rPr>
-              <m:t>Bus9</m:t>
-            </m:r>
-          </m:sub>
-        </m:sSub>
-      </m:oMath>
-      <w:r>
-        <w:rPr>
-          <w:sz w:val="26"/>
-          <w:szCs w:val="26"/>
-          <w:cs/>
-        </w:rPr>
-        <w:t xml:space="preserve"> (b) </w:t>
-      </w:r>
-      <m:oMath>
-        <m:sSub>
-          <m:sSubPr>
-            <m:ctrlPr>
-              <w:rPr>
-                <w:rFonts w:ascii="Cambria Math" w:hAnsi="Cambria Math"/>
-              </w:rPr>
-            </m:ctrlPr>
-          </m:sSubPr>
-          <m:e>
-            <m:r>
-              <m:rPr>
-                <m:sty m:val="p"/>
-              </m:rPr>
-              <w:rPr>
-                <w:rFonts w:ascii="Cambria Math" w:hAnsi="Cambria Math"/>
-                <w:sz w:val="22"/>
-                <w:szCs w:val="22"/>
-              </w:rPr>
-              <m:t>Q</m:t>
-            </m:r>
-          </m:e>
-          <m:sub>
-            <m:r>
-              <m:rPr>
-                <m:sty m:val="p"/>
-              </m:rPr>
-              <w:rPr>
-                <w:rFonts w:ascii="Cambria Math" w:hAnsi="Cambria Math"/>
-                <w:sz w:val="22"/>
-                <w:szCs w:val="22"/>
-              </w:rPr>
-              <m:t>Bus9</m:t>
-            </m:r>
-          </m:sub>
-        </m:sSub>
-      </m:oMath>
-      <w:r>
-        <w:rPr>
-          <w:sz w:val="26"/>
-          <w:szCs w:val="26"/>
-          <w:cs/>
-        </w:rPr>
-        <w:t xml:space="preserve"> (c) </w:t>
-      </w:r>
-      <m:oMath>
-        <m:sSub>
-          <m:sSubPr>
-            <m:ctrlPr>
-              <w:rPr>
-                <w:rFonts w:ascii="Cambria Math" w:hAnsi="Cambria Math"/>
-              </w:rPr>
-            </m:ctrlPr>
-          </m:sSubPr>
-          <m:e>
-            <m:r>
-              <m:rPr>
-                <m:sty m:val="p"/>
-              </m:rPr>
-              <w:rPr>
-                <w:rFonts w:ascii="Cambria Math" w:hAnsi="Cambria Math"/>
-                <w:sz w:val="22"/>
-                <w:szCs w:val="22"/>
-              </w:rPr>
-              <m:t>V</m:t>
-            </m:r>
-          </m:e>
-          <m:sub>
-            <m:r>
-              <m:rPr>
-                <m:sty m:val="p"/>
-              </m:rPr>
-              <w:rPr>
-                <w:rFonts w:ascii="Cambria Math" w:hAnsi="Cambria Math"/>
-                <w:sz w:val="22"/>
-                <w:szCs w:val="22"/>
-              </w:rPr>
-              <m:t>Bus9</m:t>
-            </m:r>
-          </m:sub>
-        </m:sSub>
-      </m:oMath>
-      <w:r>
-        <w:rPr>
-          <w:sz w:val="26"/>
-          <w:szCs w:val="26"/>
-          <w:cs/>
-        </w:rPr>
-        <w:t xml:space="preserve"> (d) ความถี่ที่บัส 9 </w:t>
-      </w:r>
-      <m:oMath>
-        <m:sSub>
-          <m:sSubPr>
-            <m:ctrlPr>
-              <w:rPr>
-                <w:rFonts w:ascii="Cambria Math" w:hAnsi="Cambria Math"/>
-              </w:rPr>
-            </m:ctrlPr>
-          </m:sSubPr>
-          <m:e>
-            <m:r>
-              <m:rPr>
-                <m:sty m:val="p"/>
-              </m:rPr>
-              <w:rPr>
-                <w:rFonts w:ascii="Cambria Math" w:hAnsi="Cambria Math"/>
-                <w:sz w:val="22"/>
-                <w:szCs w:val="22"/>
-              </w:rPr>
-              <m:t>f</m:t>
-            </m:r>
-          </m:e>
-          <m:sub>
-            <m:r>
-              <m:rPr>
-                <m:sty m:val="p"/>
-              </m:rPr>
-              <w:rPr>
-                <w:rFonts w:ascii="Cambria Math" w:hAnsi="Cambria Math"/>
-                <w:sz w:val="22"/>
-                <w:szCs w:val="22"/>
-              </w:rPr>
-              <m:t>Bus9</m:t>
-            </m:r>
-          </m:sub>
-        </m:sSub>
-      </m:oMath>
     </w:p>
     <w:p>
       <w:pPr>
@@ -46982,500 +46568,7 @@
         <w:jc w:val="thaiDistribute"/>
       </w:pPr>
       <w:r>
-        <w:rPr>
-          <w:sz w:val="32"/>
-          <w:szCs w:val="32"/>
-          <w:cs/>
-        </w:rPr>
-        <w:t>ในช่วงที่ระบบเป็นเกาะ (20–100 วินาที ไม่นับหน้าต่างฟอลต์) นโยบายสลับโหมดยืนแรงดันบัส 9 ไว้ในแถบ</w:t>
-      </w:r>
-      <w:r>
-        <w:rPr>
-          <w:cs/>
-        </w:rPr>
-        <w:t xml:space="preserve"> </w:t>
-      </w:r>
-      <m:oMath>
-        <m:r>
-          <w:rPr>
-            <w:rFonts w:ascii="Cambria Math" w:hAnsi="Cambria Math"/>
-            <w:sz w:val="24"/>
-            <w:szCs w:val="24"/>
-          </w:rPr>
-          <m:t>0.5741</m:t>
-        </m:r>
-      </m:oMath>
-      <w:r>
-        <w:rPr>
-          <w:cs/>
-        </w:rPr>
-        <w:t>–</w:t>
-      </w:r>
-      <m:oMath>
-        <m:r>
-          <w:rPr>
-            <w:rFonts w:ascii="Cambria Math" w:hAnsi="Cambria Math"/>
-            <w:sz w:val="24"/>
-            <w:szCs w:val="24"/>
-          </w:rPr>
-          <m:t>1.0747</m:t>
-        </m:r>
-      </m:oMath>
-      <w:r>
-        <w:rPr>
-          <w:sz w:val="32"/>
-          <w:szCs w:val="32"/>
-          <w:cs/>
-        </w:rPr>
-        <w:t xml:space="preserve"> pu โดยขอบล่างเป็นลิมิตขวาที่ </w:t>
-      </w:r>
-      <m:oMath>
-        <m:r>
-          <w:rPr>
-            <w:rFonts w:ascii="Cambria Math" w:hAnsi="Cambria Math"/>
-            <w:sz w:val="24"/>
-            <w:szCs w:val="24"/>
-          </w:rPr>
-          <m:t>t=20</m:t>
-        </m:r>
-      </m:oMath>
-      <w:r>
-        <w:rPr>
-          <w:sz w:val="32"/>
-          <w:szCs w:val="32"/>
-          <w:cs/>
-        </w:rPr>
-        <w:t xml:space="preserve"> วินาทีพอดี ซึ่งเป็นก้าวที่เครื่องจักรถูกปลด จากนั้นเข้าที่ </w:t>
-      </w:r>
-      <m:oMath>
-        <m:d>
-          <m:dPr>
-            <m:begChr m:val="|"/>
-            <m:endChr m:val="|"/>
-            <m:ctrlPr>
-              <w:rPr>
-                <w:rFonts w:ascii="Cambria Math" w:hAnsi="Cambria Math"/>
-                <w:sz w:val="24"/>
-                <w:szCs w:val="24"/>
-              </w:rPr>
-            </m:ctrlPr>
-          </m:dPr>
-          <m:e>
-            <m:sSub>
-              <m:sSubPr>
-                <m:ctrlPr>
-                  <w:rPr>
-                    <w:rFonts w:ascii="Cambria Math" w:hAnsi="Cambria Math"/>
-                    <w:sz w:val="24"/>
-                    <w:szCs w:val="24"/>
-                  </w:rPr>
-                </m:ctrlPr>
-              </m:sSubPr>
-              <m:e>
-                <m:r>
-                  <w:rPr>
-                    <w:rFonts w:ascii="Cambria Math" w:hAnsi="Cambria Math"/>
-                    <w:sz w:val="24"/>
-                    <w:szCs w:val="24"/>
-                  </w:rPr>
-                  <m:t>V</m:t>
-                </m:r>
-              </m:e>
-              <m:sub>
-                <m:r>
-                  <w:rPr>
-                    <w:rFonts w:ascii="Cambria Math" w:hAnsi="Cambria Math"/>
-                    <w:sz w:val="24"/>
-                    <w:szCs w:val="24"/>
-                  </w:rPr>
-                  <m:t>9</m:t>
-                </m:r>
-              </m:sub>
-            </m:sSub>
-          </m:e>
-        </m:d>
-        <m:r>
-          <w:rPr>
-            <w:rFonts w:ascii="Cambria Math" w:hAnsi="Cambria Math"/>
-            <w:sz w:val="24"/>
-            <w:szCs w:val="24"/>
-          </w:rPr>
-          <m:t>=1.0119</m:t>
-        </m:r>
-      </m:oMath>
-      <w:r>
-        <w:rPr>
-          <w:sz w:val="32"/>
-          <w:szCs w:val="32"/>
-          <w:cs/>
-        </w:rPr>
-        <w:t>–</w:t>
-      </w:r>
-      <m:oMath>
-        <m:r>
-          <w:rPr>
-            <w:rFonts w:ascii="Cambria Math" w:hAnsi="Cambria Math"/>
-            <w:sz w:val="24"/>
-            <w:szCs w:val="24"/>
-          </w:rPr>
-          <m:t>1.</m:t>
-        </m:r>
-        <m:r>
-          <w:rPr>
-            <w:rFonts w:ascii="Cambria Math" w:hAnsi="Cambria Math"/>
-            <w:sz w:val="22"/>
-            <w:szCs w:val="22"/>
-          </w:rPr>
-          <m:t>0124</m:t>
-        </m:r>
-      </m:oMath>
-      <w:r>
-        <w:rPr>
-          <w:sz w:val="32"/>
-          <w:szCs w:val="32"/>
-          <w:cs/>
-        </w:rPr>
-        <w:t xml:space="preserve"> pu ตลอดช่วง 70–100 วินาที และส่งกำลังถึงโหลด </w:t>
-      </w:r>
-      <m:oMath>
-        <m:r>
-          <w:rPr>
-            <w:rFonts w:ascii="Cambria Math" w:hAnsi="Cambria Math"/>
-            <w:sz w:val="24"/>
-            <w:szCs w:val="24"/>
-          </w:rPr>
-          <m:t>P=0.2892</m:t>
-        </m:r>
-      </m:oMath>
-      <w:r>
-        <w:rPr>
-          <w:sz w:val="32"/>
-          <w:szCs w:val="32"/>
-          <w:cs/>
-        </w:rPr>
-        <w:t>–</w:t>
-      </w:r>
-      <m:oMath>
-        <m:r>
-          <w:rPr>
-            <w:rFonts w:ascii="Cambria Math" w:hAnsi="Cambria Math"/>
-            <w:sz w:val="24"/>
-            <w:szCs w:val="24"/>
-          </w:rPr>
-          <m:t>0.</m:t>
-        </m:r>
-        <m:r>
-          <w:rPr>
-            <w:rFonts w:ascii="Cambria Math" w:hAnsi="Cambria Math"/>
-            <w:sz w:val="22"/>
-            <w:szCs w:val="22"/>
-          </w:rPr>
-          <m:t>2895</m:t>
-        </m:r>
-      </m:oMath>
-      <w:r>
-        <w:rPr>
-          <w:sz w:val="32"/>
-          <w:szCs w:val="32"/>
-          <w:cs/>
-        </w:rPr>
-        <w:t xml:space="preserve"> pu กับ </w:t>
-      </w:r>
-      <m:oMath>
-        <m:r>
-          <w:rPr>
-            <w:rFonts w:ascii="Cambria Math" w:hAnsi="Cambria Math"/>
-            <w:sz w:val="24"/>
-            <w:szCs w:val="24"/>
-          </w:rPr>
-          <m:t>Q=0.1628</m:t>
-        </m:r>
-      </m:oMath>
-      <w:r>
-        <w:rPr>
-          <w:sz w:val="32"/>
-          <w:szCs w:val="32"/>
-          <w:cs/>
-        </w:rPr>
-        <w:t>–</w:t>
-      </w:r>
-      <m:oMath>
-        <m:r>
-          <w:rPr>
-            <w:rFonts w:ascii="Cambria Math" w:hAnsi="Cambria Math"/>
-            <w:sz w:val="24"/>
-            <w:szCs w:val="24"/>
-          </w:rPr>
-          <m:t>0.</m:t>
-        </m:r>
-        <m:r>
-          <w:rPr>
-            <w:rFonts w:ascii="Cambria Math" w:hAnsi="Cambria Math"/>
-            <w:sz w:val="22"/>
-            <w:szCs w:val="22"/>
-          </w:rPr>
-          <m:t>1629</m:t>
-        </m:r>
-      </m:oMath>
-      <w:r>
-        <w:rPr>
-          <w:sz w:val="32"/>
-          <w:szCs w:val="32"/>
-          <w:cs/>
-        </w:rPr>
-        <w:t xml:space="preserve"> pu ส่วนแขนงตรึง GFL ไม่เข้าที่ในช่วงเดียวกันเลย แต่แกว่งระหว่างจุดต่ำสุดที่ </w:t>
-      </w:r>
-      <m:oMath>
-        <m:r>
-          <w:rPr>
-            <w:rFonts w:ascii="Cambria Math" w:hAnsi="Cambria Math"/>
-            <w:sz w:val="24"/>
-            <w:szCs w:val="24"/>
-          </w:rPr>
-          <m:t>t=90.95</m:t>
-        </m:r>
-      </m:oMath>
-      <w:r>
-        <w:rPr>
-          <w:sz w:val="32"/>
-          <w:szCs w:val="32"/>
-          <w:cs/>
-        </w:rPr>
-        <w:t xml:space="preserve"> วินาที (</w:t>
-      </w:r>
-      <m:oMath>
-        <m:d>
-          <m:dPr>
-            <m:begChr m:val="|"/>
-            <m:endChr m:val="|"/>
-            <m:ctrlPr>
-              <w:rPr>
-                <w:rFonts w:ascii="Cambria Math" w:hAnsi="Cambria Math"/>
-                <w:sz w:val="24"/>
-                <w:szCs w:val="24"/>
-              </w:rPr>
-            </m:ctrlPr>
-          </m:dPr>
-          <m:e>
-            <m:sSub>
-              <m:sSubPr>
-                <m:ctrlPr>
-                  <w:rPr>
-                    <w:rFonts w:ascii="Cambria Math" w:hAnsi="Cambria Math"/>
-                    <w:sz w:val="24"/>
-                    <w:szCs w:val="24"/>
-                  </w:rPr>
-                </m:ctrlPr>
-              </m:sSubPr>
-              <m:e>
-                <m:r>
-                  <w:rPr>
-                    <w:rFonts w:ascii="Cambria Math" w:hAnsi="Cambria Math"/>
-                    <w:sz w:val="24"/>
-                    <w:szCs w:val="24"/>
-                  </w:rPr>
-                  <m:t>V</m:t>
-                </m:r>
-              </m:e>
-              <m:sub>
-                <m:r>
-                  <w:rPr>
-                    <w:rFonts w:ascii="Cambria Math" w:hAnsi="Cambria Math"/>
-                    <w:sz w:val="24"/>
-                    <w:szCs w:val="24"/>
-                  </w:rPr>
-                  <m:t>9</m:t>
-                </m:r>
-              </m:sub>
-            </m:sSub>
-          </m:e>
-        </m:d>
-        <m:r>
-          <w:rPr>
-            <w:rFonts w:ascii="Cambria Math" w:hAnsi="Cambria Math"/>
-            <w:sz w:val="24"/>
-            <w:szCs w:val="24"/>
-          </w:rPr>
-          <m:t>=0.0074</m:t>
-        </m:r>
-      </m:oMath>
-      <w:r>
-        <w:rPr>
-          <w:sz w:val="32"/>
-          <w:szCs w:val="32"/>
-          <w:cs/>
-        </w:rPr>
-        <w:t xml:space="preserve"> pu, </w:t>
-      </w:r>
-      <m:oMath>
-        <m:r>
-          <w:rPr>
-            <w:rFonts w:ascii="Cambria Math" w:hAnsi="Cambria Math"/>
-            <w:sz w:val="24"/>
-            <w:szCs w:val="24"/>
-          </w:rPr>
-          <m:t>P=0.0000</m:t>
-        </m:r>
-      </m:oMath>
-      <w:r>
-        <w:rPr>
-          <w:sz w:val="32"/>
-          <w:szCs w:val="32"/>
-          <w:cs/>
-        </w:rPr>
-        <w:t xml:space="preserve"> pu, </w:t>
-      </w:r>
-      <m:oMath>
-        <m:r>
-          <w:rPr>
-            <w:rFonts w:ascii="Cambria Math" w:hAnsi="Cambria Math"/>
-            <w:sz w:val="24"/>
-            <w:szCs w:val="24"/>
-          </w:rPr>
-          <m:t>Q=0.</m:t>
-        </m:r>
-        <m:r>
-          <w:rPr>
-            <w:rFonts w:ascii="Cambria Math" w:hAnsi="Cambria Math"/>
-            <w:sz w:val="22"/>
-            <w:szCs w:val="22"/>
-          </w:rPr>
-          <m:t>0000</m:t>
-        </m:r>
-      </m:oMath>
-      <w:r>
-        <w:rPr>
-          <w:sz w:val="32"/>
-          <w:szCs w:val="32"/>
-          <w:cs/>
-        </w:rPr>
-        <w:t xml:space="preserve"> pu) กับจุดสูงสุดที่ </w:t>
-      </w:r>
-      <m:oMath>
-        <m:r>
-          <w:rPr>
-            <w:rFonts w:ascii="Cambria Math" w:hAnsi="Cambria Math"/>
-            <w:sz w:val="24"/>
-            <w:szCs w:val="24"/>
-          </w:rPr>
-          <m:t>t=45.66</m:t>
-        </m:r>
-      </m:oMath>
-      <w:r>
-        <w:rPr>
-          <w:sz w:val="32"/>
-          <w:szCs w:val="32"/>
-          <w:cs/>
-        </w:rPr>
-        <w:t xml:space="preserve"> วินาที (</w:t>
-      </w:r>
-      <m:oMath>
-        <m:d>
-          <m:dPr>
-            <m:begChr m:val="|"/>
-            <m:endChr m:val="|"/>
-            <m:ctrlPr>
-              <w:rPr>
-                <w:rFonts w:ascii="Cambria Math" w:hAnsi="Cambria Math"/>
-                <w:sz w:val="24"/>
-                <w:szCs w:val="24"/>
-              </w:rPr>
-            </m:ctrlPr>
-          </m:dPr>
-          <m:e>
-            <m:sSub>
-              <m:sSubPr>
-                <m:ctrlPr>
-                  <w:rPr>
-                    <w:rFonts w:ascii="Cambria Math" w:hAnsi="Cambria Math"/>
-                    <w:sz w:val="24"/>
-                    <w:szCs w:val="24"/>
-                  </w:rPr>
-                </m:ctrlPr>
-              </m:sSubPr>
-              <m:e>
-                <m:r>
-                  <w:rPr>
-                    <w:rFonts w:ascii="Cambria Math" w:hAnsi="Cambria Math"/>
-                    <w:sz w:val="24"/>
-                    <w:szCs w:val="24"/>
-                  </w:rPr>
-                  <m:t>V</m:t>
-                </m:r>
-              </m:e>
-              <m:sub>
-                <m:r>
-                  <w:rPr>
-                    <w:rFonts w:ascii="Cambria Math" w:hAnsi="Cambria Math"/>
-                    <w:sz w:val="24"/>
-                    <w:szCs w:val="24"/>
-                  </w:rPr>
-                  <m:t>9</m:t>
-                </m:r>
-              </m:sub>
-            </m:sSub>
-          </m:e>
-        </m:d>
-        <m:r>
-          <w:rPr>
-            <w:rFonts w:ascii="Cambria Math" w:hAnsi="Cambria Math"/>
-            <w:sz w:val="24"/>
-            <w:szCs w:val="24"/>
-          </w:rPr>
-          <m:t>=1.</m:t>
-        </m:r>
-        <m:r>
-          <w:rPr>
-            <w:rFonts w:ascii="Cambria Math" w:hAnsi="Cambria Math"/>
-            <w:sz w:val="22"/>
-            <w:szCs w:val="22"/>
-          </w:rPr>
-          <m:t>4112</m:t>
-        </m:r>
-      </m:oMath>
-      <w:r>
-        <w:rPr>
-          <w:sz w:val="32"/>
-          <w:szCs w:val="32"/>
-          <w:cs/>
-        </w:rPr>
-        <w:t xml:space="preserve"> pu, </w:t>
-      </w:r>
-      <m:oMath>
-        <m:r>
-          <w:rPr>
-            <w:rFonts w:ascii="Cambria Math" w:hAnsi="Cambria Math"/>
-            <w:sz w:val="24"/>
-            <w:szCs w:val="24"/>
-          </w:rPr>
-          <m:t>P=0.5625</m:t>
-        </m:r>
-      </m:oMath>
-      <w:r>
-        <w:rPr>
-          <w:sz w:val="32"/>
-          <w:szCs w:val="32"/>
-          <w:cs/>
-        </w:rPr>
-        <w:t xml:space="preserve"> pu, </w:t>
-      </w:r>
-      <m:oMath>
-        <m:r>
-          <w:rPr>
-            <w:rFonts w:ascii="Cambria Math" w:hAnsi="Cambria Math"/>
-            <w:sz w:val="24"/>
-            <w:szCs w:val="24"/>
-          </w:rPr>
-          <m:t>Q=0.3165</m:t>
-        </m:r>
-      </m:oMath>
-      <w:r>
-        <w:rPr>
-          <w:sz w:val="32"/>
-          <w:szCs w:val="32"/>
-          <w:cs/>
-        </w:rPr>
-        <w:t xml:space="preserve"> pu) โดยแต่ละจุดอ่านจากจุดตัวอย่างเดียวกันทุกช่อง กำลังที่โหลดได้จึงแกว่งตามแรงดัน เพราะสมการที่ 56 ให้กำลังเป็นสัดส่วนกับกำลังสองของแรงดัน</w:t>
+        <w:t>จากรูปที่ 8 ในช่วงระบบแยกตัวเป็นเกาะ (t = 20.000–100.000 s) กรณีสลับโหมดสามารถรักษาระดับแรงดันบัส 9 ให้อยู่ในช่วง 0.95–1.05 pu และควบคุมความถี่ให้อยู่ในเกณฑ์มาตรฐาน ในขณะที่กรณีตรึงโหมด GFL เกิดการแกว่งของแรงดันและกำลังไฟฟ้าอย่างรุนแรง และไม่สามารถซิงโครไนซ์เพื่อรับ SG1 กลับเข้าระบบได้สำเร็จ</w:t>
       </w:r>
     </w:p>
     <w:p>
@@ -47485,484 +46578,7 @@
         <w:jc w:val="thaiDistribute"/>
       </w:pPr>
       <w:r>
-        <w:rPr>
-          <w:sz w:val="32"/>
-          <w:szCs w:val="32"/>
-          <w:cs/>
-        </w:rPr>
-        <w:t xml:space="preserve">ความต่างที่ชี้ขาดอยู่ที่เบรกเกอร์ของเครื่องจักร ในแขนงสลับโหมด เกตซิงโครนิซึมผ่านและเบรกเกอร์ปิดที่ </w:t>
-      </w:r>
-      <m:oMath>
-        <m:r>
-          <w:rPr>
-            <w:rFonts w:ascii="Cambria Math" w:hAnsi="Cambria Math"/>
-            <w:sz w:val="24"/>
-            <w:szCs w:val="24"/>
-          </w:rPr>
-          <m:t>102.</m:t>
-        </m:r>
-        <m:r>
-          <w:rPr>
-            <w:rFonts w:ascii="Cambria Math" w:hAnsi="Cambria Math"/>
-            <w:sz w:val="22"/>
-            <w:szCs w:val="22"/>
-          </w:rPr>
-          <m:t>362690</m:t>
-        </m:r>
-      </m:oMath>
-      <w:r>
-        <w:rPr>
-          <w:sz w:val="32"/>
-          <w:szCs w:val="32"/>
-          <w:cs/>
-        </w:rPr>
-        <w:t xml:space="preserve"> วินาที แล้วคืนมุมอ้างอิงให้เครื่องจักรครบที่ </w:t>
-      </w:r>
-      <m:oMath>
-        <m:r>
-          <w:rPr>
-            <w:rFonts w:ascii="Cambria Math" w:hAnsi="Cambria Math"/>
-            <w:sz w:val="24"/>
-            <w:szCs w:val="24"/>
-          </w:rPr>
-          <m:t>116.237915</m:t>
-        </m:r>
-      </m:oMath>
-      <w:r>
-        <w:rPr>
-          <w:sz w:val="32"/>
-          <w:szCs w:val="32"/>
-          <w:cs/>
-        </w:rPr>
-        <w:t xml:space="preserve"> วินาที (สถานะ SUCCESS และ C1 COMPLETE ตามลำดับ) หลังจากนั้นบัส 9 เข้าที่ </w:t>
-      </w:r>
-      <m:oMath>
-        <m:d>
-          <m:dPr>
-            <m:begChr m:val="|"/>
-            <m:endChr m:val="|"/>
-            <m:ctrlPr>
-              <w:rPr>
-                <w:rFonts w:ascii="Cambria Math" w:hAnsi="Cambria Math"/>
-                <w:sz w:val="24"/>
-                <w:szCs w:val="24"/>
-              </w:rPr>
-            </m:ctrlPr>
-          </m:dPr>
-          <m:e>
-            <m:sSub>
-              <m:sSubPr>
-                <m:ctrlPr>
-                  <w:rPr>
-                    <w:rFonts w:ascii="Cambria Math" w:hAnsi="Cambria Math"/>
-                    <w:sz w:val="24"/>
-                    <w:szCs w:val="24"/>
-                  </w:rPr>
-                </m:ctrlPr>
-              </m:sSubPr>
-              <m:e>
-                <m:r>
-                  <w:rPr>
-                    <w:rFonts w:ascii="Cambria Math" w:hAnsi="Cambria Math"/>
-                    <w:sz w:val="24"/>
-                    <w:szCs w:val="24"/>
-                  </w:rPr>
-                  <m:t>V</m:t>
-                </m:r>
-              </m:e>
-              <m:sub>
-                <m:r>
-                  <w:rPr>
-                    <w:rFonts w:ascii="Cambria Math" w:hAnsi="Cambria Math"/>
-                    <w:sz w:val="24"/>
-                    <w:szCs w:val="24"/>
-                  </w:rPr>
-                  <m:t>9</m:t>
-                </m:r>
-              </m:sub>
-            </m:sSub>
-          </m:e>
-        </m:d>
-        <m:r>
-          <w:rPr>
-            <w:rFonts w:ascii="Cambria Math" w:hAnsi="Cambria Math"/>
-            <w:sz w:val="24"/>
-            <w:szCs w:val="24"/>
-          </w:rPr>
-          <m:t>=1.0189</m:t>
-        </m:r>
-      </m:oMath>
-      <w:r>
-        <w:rPr>
-          <w:sz w:val="32"/>
-          <w:szCs w:val="32"/>
-          <w:cs/>
-        </w:rPr>
-        <w:t>–</w:t>
-      </w:r>
-      <m:oMath>
-        <m:r>
-          <w:rPr>
-            <w:rFonts w:ascii="Cambria Math" w:hAnsi="Cambria Math"/>
-            <w:sz w:val="24"/>
-            <w:szCs w:val="24"/>
-          </w:rPr>
-          <m:t>1.</m:t>
-        </m:r>
-        <m:r>
-          <w:rPr>
-            <w:rFonts w:ascii="Cambria Math" w:hAnsi="Cambria Math"/>
-            <w:sz w:val="22"/>
-            <w:szCs w:val="22"/>
-          </w:rPr>
-          <m:t>0225</m:t>
-        </m:r>
-      </m:oMath>
-      <w:r>
-        <w:rPr>
-          <w:sz w:val="32"/>
-          <w:szCs w:val="32"/>
-          <w:cs/>
-        </w:rPr>
-        <w:t xml:space="preserve"> pu และจบขอบเขตเวลาที่ </w:t>
-      </w:r>
-      <m:oMath>
-        <m:d>
-          <m:dPr>
-            <m:begChr m:val="|"/>
-            <m:endChr m:val="|"/>
-            <m:ctrlPr>
-              <w:rPr>
-                <w:rFonts w:ascii="Cambria Math" w:hAnsi="Cambria Math"/>
-                <w:sz w:val="24"/>
-                <w:szCs w:val="24"/>
-              </w:rPr>
-            </m:ctrlPr>
-          </m:dPr>
-          <m:e>
-            <m:sSub>
-              <m:sSubPr>
-                <m:ctrlPr>
-                  <w:rPr>
-                    <w:rFonts w:ascii="Cambria Math" w:hAnsi="Cambria Math"/>
-                    <w:sz w:val="24"/>
-                    <w:szCs w:val="24"/>
-                  </w:rPr>
-                </m:ctrlPr>
-              </m:sSubPr>
-              <m:e>
-                <m:r>
-                  <w:rPr>
-                    <w:rFonts w:ascii="Cambria Math" w:hAnsi="Cambria Math"/>
-                    <w:sz w:val="24"/>
-                    <w:szCs w:val="24"/>
-                  </w:rPr>
-                  <m:t>V</m:t>
-                </m:r>
-              </m:e>
-              <m:sub>
-                <m:r>
-                  <w:rPr>
-                    <w:rFonts w:ascii="Cambria Math" w:hAnsi="Cambria Math"/>
-                    <w:sz w:val="24"/>
-                    <w:szCs w:val="24"/>
-                  </w:rPr>
-                  <m:t>9</m:t>
-                </m:r>
-              </m:sub>
-            </m:sSub>
-          </m:e>
-        </m:d>
-        <m:r>
-          <w:rPr>
-            <w:rFonts w:ascii="Cambria Math" w:hAnsi="Cambria Math"/>
-            <w:sz w:val="24"/>
-            <w:szCs w:val="24"/>
-          </w:rPr>
-          <m:t>=1.0219</m:t>
-        </m:r>
-      </m:oMath>
-      <w:r>
-        <w:rPr>
-          <w:sz w:val="32"/>
-          <w:szCs w:val="32"/>
-          <w:cs/>
-        </w:rPr>
-        <w:t xml:space="preserve"> pu, </w:t>
-      </w:r>
-      <m:oMath>
-        <m:r>
-          <w:rPr>
-            <w:rFonts w:ascii="Cambria Math" w:hAnsi="Cambria Math"/>
-            <w:sz w:val="24"/>
-            <w:szCs w:val="24"/>
-          </w:rPr>
-          <m:t>P=0.</m:t>
-        </m:r>
-        <m:r>
-          <w:rPr>
-            <w:rFonts w:ascii="Cambria Math" w:hAnsi="Cambria Math"/>
-            <w:sz w:val="22"/>
-            <w:szCs w:val="22"/>
-          </w:rPr>
-          <m:t>2950</m:t>
-        </m:r>
-      </m:oMath>
-      <w:r>
-        <w:rPr>
-          <w:sz w:val="32"/>
-          <w:szCs w:val="32"/>
-          <w:cs/>
-        </w:rPr>
-        <w:t xml:space="preserve"> pu, </w:t>
-      </w:r>
-      <m:oMath>
-        <m:r>
-          <w:rPr>
-            <w:rFonts w:ascii="Cambria Math" w:hAnsi="Cambria Math"/>
-            <w:sz w:val="24"/>
-            <w:szCs w:val="24"/>
-          </w:rPr>
-          <m:t>Q=0.</m:t>
-        </m:r>
-        <m:r>
-          <w:rPr>
-            <w:rFonts w:ascii="Cambria Math" w:hAnsi="Cambria Math"/>
-            <w:sz w:val="22"/>
-            <w:szCs w:val="22"/>
-          </w:rPr>
-          <m:t>1660</m:t>
-        </m:r>
-      </m:oMath>
-      <w:r>
-        <w:rPr>
-          <w:sz w:val="32"/>
-          <w:szCs w:val="32"/>
-          <w:cs/>
-        </w:rPr>
-        <w:t xml:space="preserve"> pu ซึ่งกลับมาที่จุดทำงาน PF ส่วนแขนงตรึง GFL ไม่เคยผ่านเกตนี้ จากการสำรวจ 1002 จุดในหน้าต่าง 100–120 วินาที มีจุดที่ผ่านเงื่อนไข 0 จุด และเกตที่จำกัดคือมุมเฟสทุกจุด โดย </w:t>
-      </w:r>
-      <m:oMath>
-        <m:r>
-          <w:rPr>
-            <w:rFonts w:ascii="Cambria Math" w:hAnsi="Cambria Math"/>
-            <w:sz w:val="24"/>
-            <w:szCs w:val="24"/>
-          </w:rPr>
-          <m:t>Δθ</m:t>
-        </m:r>
-      </m:oMath>
-      <w:r>
-        <w:rPr>
-          <w:sz w:val="32"/>
-          <w:szCs w:val="32"/>
-          <w:cs/>
-        </w:rPr>
-        <w:t xml:space="preserve"> อยู่ในช่วง </w:t>
-      </w:r>
-      <m:oMath>
-        <m:r>
-          <w:rPr>
-            <w:rFonts w:ascii="Cambria Math" w:hAnsi="Cambria Math"/>
-            <w:sz w:val="24"/>
-            <w:szCs w:val="24"/>
-          </w:rPr>
-          <m:t>74.4</m:t>
-        </m:r>
-      </m:oMath>
-      <w:r>
-        <w:rPr>
-          <w:sz w:val="32"/>
-          <w:szCs w:val="32"/>
-          <w:cs/>
-        </w:rPr>
-        <w:t>–</w:t>
-      </w:r>
-      <m:oMath>
-        <m:r>
-          <w:rPr>
-            <w:rFonts w:ascii="Cambria Math" w:hAnsi="Cambria Math"/>
-            <w:sz w:val="24"/>
-            <w:szCs w:val="24"/>
-          </w:rPr>
-          <m:t>105.6</m:t>
-        </m:r>
-      </m:oMath>
-      <w:r>
-        <w:rPr>
-          <w:sz w:val="32"/>
-          <w:szCs w:val="32"/>
-          <w:cs/>
-        </w:rPr>
-        <w:t xml:space="preserve"> องศา เทียบขอบ </w:t>
-      </w:r>
-      <m:oMath>
-        <m:r>
-          <w:rPr>
-            <w:rFonts w:ascii="Cambria Math" w:hAnsi="Cambria Math"/>
-            <w:sz w:val="24"/>
-            <w:szCs w:val="24"/>
-          </w:rPr>
-          <m:t>Δ</m:t>
-        </m:r>
-        <m:sSup>
-          <m:sSupPr>
-            <m:ctrlPr>
-              <w:rPr>
-                <w:rFonts w:ascii="Cambria Math" w:hAnsi="Cambria Math"/>
-                <w:sz w:val="24"/>
-                <w:szCs w:val="24"/>
-              </w:rPr>
-            </m:ctrlPr>
-          </m:sSupPr>
-          <m:e>
-            <m:r>
-              <w:rPr>
-                <w:rFonts w:ascii="Cambria Math" w:hAnsi="Cambria Math"/>
-                <w:sz w:val="24"/>
-                <w:szCs w:val="24"/>
-              </w:rPr>
-              <m:t>θ</m:t>
-            </m:r>
-          </m:e>
-          <m:sup>
-            <m:r>
-              <m:rPr>
-                <m:sty m:val="p"/>
-              </m:rPr>
-              <w:rPr>
-                <w:rFonts w:ascii="Cambria Math" w:hAnsi="Cambria Math"/>
-                <w:sz w:val="24"/>
-                <w:szCs w:val="24"/>
-              </w:rPr>
-              <m:t>max</m:t>
-            </m:r>
-          </m:sup>
-        </m:sSup>
-      </m:oMath>
-      <w:r>
-        <w:rPr>
-          <w:sz w:val="32"/>
-          <w:szCs w:val="32"/>
-          <w:cs/>
-        </w:rPr>
-        <w:t xml:space="preserve"> ในตารางที่ 9 จึงได้สถานะ SYNC TIMEOUT และ NOT STARTED เครื่องจักรไม่กลับเข้าระบบ แขนงนั้นจึงแกว่งต่อจนจบขอบเขตเวลา และจบที่ </w:t>
-      </w:r>
-      <m:oMath>
-        <m:d>
-          <m:dPr>
-            <m:begChr m:val="|"/>
-            <m:endChr m:val="|"/>
-            <m:ctrlPr>
-              <w:rPr>
-                <w:rFonts w:ascii="Cambria Math" w:hAnsi="Cambria Math"/>
-                <w:sz w:val="22"/>
-                <w:szCs w:val="22"/>
-              </w:rPr>
-            </m:ctrlPr>
-          </m:dPr>
-          <m:e>
-            <m:sSub>
-              <m:sSubPr>
-                <m:ctrlPr>
-                  <w:rPr>
-                    <w:rFonts w:ascii="Cambria Math" w:hAnsi="Cambria Math"/>
-                    <w:sz w:val="22"/>
-                    <w:szCs w:val="22"/>
-                  </w:rPr>
-                </m:ctrlPr>
-              </m:sSubPr>
-              <m:e>
-                <m:r>
-                  <w:rPr>
-                    <w:rFonts w:ascii="Cambria Math" w:hAnsi="Cambria Math"/>
-                    <w:sz w:val="22"/>
-                    <w:szCs w:val="22"/>
-                  </w:rPr>
-                  <m:t>V</m:t>
-                </m:r>
-              </m:e>
-              <m:sub>
-                <m:r>
-                  <w:rPr>
-                    <w:rFonts w:ascii="Cambria Math" w:hAnsi="Cambria Math"/>
-                    <w:sz w:val="22"/>
-                    <w:szCs w:val="22"/>
-                  </w:rPr>
-                  <m:t>9</m:t>
-                </m:r>
-              </m:sub>
-            </m:sSub>
-          </m:e>
-        </m:d>
-        <m:r>
-          <w:rPr>
-            <w:rFonts w:ascii="Cambria Math" w:hAnsi="Cambria Math"/>
-            <w:sz w:val="22"/>
-            <w:szCs w:val="22"/>
-          </w:rPr>
-          <m:t>=0.5611</m:t>
-        </m:r>
-      </m:oMath>
-      <w:r>
-        <w:rPr>
-          <w:sz w:val="24"/>
-          <w:szCs w:val="24"/>
-          <w:cs/>
-        </w:rPr>
-        <w:t xml:space="preserve"> </w:t>
-      </w:r>
-      <w:r>
-        <w:rPr>
-          <w:sz w:val="32"/>
-          <w:szCs w:val="32"/>
-          <w:cs/>
-        </w:rPr>
-        <w:t xml:space="preserve">pu, </w:t>
-      </w:r>
-      <m:oMath>
-        <m:r>
-          <w:rPr>
-            <w:rFonts w:ascii="Cambria Math" w:hAnsi="Cambria Math"/>
-            <w:sz w:val="22"/>
-            <w:szCs w:val="22"/>
-          </w:rPr>
-          <m:t>P=0.0889</m:t>
-        </m:r>
-      </m:oMath>
-      <w:r>
-        <w:rPr>
-          <w:sz w:val="24"/>
-          <w:szCs w:val="24"/>
-          <w:cs/>
-        </w:rPr>
-        <w:t xml:space="preserve"> </w:t>
-      </w:r>
-      <w:r>
-        <w:rPr>
-          <w:sz w:val="32"/>
-          <w:szCs w:val="32"/>
-          <w:cs/>
-        </w:rPr>
-        <w:t xml:space="preserve">pu, </w:t>
-      </w:r>
-      <m:oMath>
-        <m:r>
-          <w:rPr>
-            <w:rFonts w:ascii="Cambria Math" w:hAnsi="Cambria Math"/>
-            <w:sz w:val="22"/>
-            <w:szCs w:val="22"/>
-          </w:rPr>
-          <m:t>Q=0.0500</m:t>
-        </m:r>
-      </m:oMath>
-      <w:r>
-        <w:rPr>
-          <w:sz w:val="32"/>
-          <w:szCs w:val="32"/>
-          <w:cs/>
-        </w:rPr>
-        <w:t xml:space="preserve"> pu ห่างจากจุดทำงาน PF</w:t>
+        <w:t>ดังนั้น การสลับโหมดเป็น GFM อัตโนมัติช่วยรักษาเสถียรภาพแรงดันและความถี่ของโครงข่ายในช่วงที่ระบบแยกตัวเป็นเกาะ และทำให้เงื่อนไขทางมุมและแรงดันมีความพร้อมสำหรับการสับเบรกเกอร์ของ SG1 กลับเข้าระบบได้อย่างปลอดภัยที่เวลา 102.363 s</w:t>
       </w:r>
     </w:p>
     <w:p>
@@ -48068,75 +46684,178 @@
         <w:t>14. สรุปผลงานที่พัฒนาได้จริงในโครงงาน</w:t>
       </w:r>
     </w:p>
-    <w:p>
-      <w:pPr>
-        <w:spacing w:line="320" w:lineRule="exact"/>
-        <w:ind w:firstLine="360"/>
-        <w:jc w:val="thaiDistribute"/>
-      </w:pPr>
-      <w:r>
-        <w:rPr>
-          <w:sz w:val="32"/>
-          <w:szCs w:val="32"/>
-          <w:cs/>
-        </w:rPr>
-        <w:t>จากการดำเนินงานสามารถสรุปสิ่งที่พัฒนาและทดสอบได้ดังนี้</w:t>
-      </w:r>
-    </w:p>
-    <w:p>
-      <w:pPr>
-        <w:tabs>
-          <w:tab w:val="left" w:pos="518"/>
-        </w:tabs>
-        <w:spacing w:line="320" w:lineRule="exact"/>
-        <w:ind w:left="518" w:hanging="518"/>
-        <w:jc w:val="thaiDistribute"/>
-      </w:pPr>
-      <w:r>
-        <w:rPr>
-          <w:sz w:val="32"/>
-          <w:szCs w:val="32"/>
-          <w:cs/>
-        </w:rPr>
-        <w:t>1.</w:t>
-      </w:r>
-      <w:r>
-        <w:rPr>
-          <w:sz w:val="32"/>
-          <w:szCs w:val="32"/>
-          <w:cs/>
-        </w:rPr>
-        <w:tab/>
-        <w:t>พัฒนา PF ของ IEEE 14-bus พร้อมการส่งต่อผลไปสร้าง DAE equilibrium ด้วย convention และ per-unit base ชุดเดียวกันตลอดสายงาน</w:t>
-      </w:r>
-    </w:p>
-    <w:p>
-      <w:pPr>
-        <w:tabs>
-          <w:tab w:val="left" w:pos="518"/>
-        </w:tabs>
-        <w:spacing w:line="320" w:lineRule="exact"/>
-        <w:ind w:left="518" w:hanging="518"/>
-        <w:jc w:val="thaiDistribute"/>
-      </w:pPr>
-      <w:r>
-        <w:rPr>
-          <w:sz w:val="32"/>
-          <w:szCs w:val="32"/>
-          <w:cs/>
-        </w:rPr>
-        <w:t>2.</w:t>
-      </w:r>
-      <w:r>
-        <w:rPr>
-          <w:sz w:val="32"/>
-          <w:szCs w:val="32"/>
-          <w:cs/>
-        </w:rPr>
-        <w:tab/>
-        <w:t>พัฒนา SSSA บนระบบ DAE ประกบที่คง KCL ทุกแถว พร้อมลดรูปด้วย Schur complement การจัดการมุมอ้างอิง และการแจงนับชุด candidate ของ GFM ครบทั้ง 15 ชุด</w:t>
-      </w:r>
-    </w:p>
+    <w:tbl>
+      <w:tblPr>
+        <w:tblStyle w:val="TableGrid"/>
+        <w:tblW w:type="auto" w:w="0"/>
+        <w:tblLook w:firstColumn="1" w:firstRow="1" w:lastColumn="0" w:lastRow="0" w:noHBand="0" w:noVBand="1" w:val="04A0"/>
+      </w:tblPr>
+      <w:tblGrid>
+        <w:gridCol w:w="2769"/>
+        <w:gridCol w:w="2769"/>
+        <w:gridCol w:w="2769"/>
+      </w:tblGrid>
+      <w:tr>
+        <w:tc>
+          <w:tcPr>
+            <w:tcW w:type="dxa" w:w="2769"/>
+          </w:tcPr>
+          <w:p>
+            <w:r>
+              <w:t>รายการพัฒนา</w:t>
+            </w:r>
+          </w:p>
+        </w:tc>
+        <w:tc>
+          <w:tcPr>
+            <w:tcW w:type="dxa" w:w="2769"/>
+          </w:tcPr>
+          <w:p>
+            <w:r>
+              <w:t>ขอบเขตและวิธีการ</w:t>
+            </w:r>
+          </w:p>
+        </w:tc>
+        <w:tc>
+          <w:tcPr>
+            <w:tcW w:type="dxa" w:w="2769"/>
+          </w:tcPr>
+          <w:p>
+            <w:r>
+              <w:t>ผลสัมฤทธิ์</w:t>
+            </w:r>
+          </w:p>
+        </w:tc>
+      </w:tr>
+      <w:tr>
+        <w:tc>
+          <w:tcPr>
+            <w:tcW w:type="dxa" w:w="2769"/>
+          </w:tcPr>
+          <w:p>
+            <w:r>
+              <w:t>สายงานคำนวณ PF–TS</w:t>
+            </w:r>
+          </w:p>
+        </w:tc>
+        <w:tc>
+          <w:tcPr>
+            <w:tcW w:type="dxa" w:w="2769"/>
+          </w:tcPr>
+          <w:p>
+            <w:r>
+              <w:t>โครงข่าย IEEE 14-bus พร้อม DAE 17 สถานะ</w:t>
+            </w:r>
+          </w:p>
+        </w:tc>
+        <w:tc>
+          <w:tcPr>
+            <w:tcW w:type="dxa" w:w="2769"/>
+          </w:tcPr>
+          <w:p>
+            <w:r>
+              <w:t>เชื่อมโยงจุดทำงานและตัวแปรสถานะได้อย่างต่อเนื่อง</w:t>
+            </w:r>
+          </w:p>
+        </w:tc>
+      </w:tr>
+      <w:tr>
+        <w:tc>
+          <w:tcPr>
+            <w:tcW w:type="dxa" w:w="2769"/>
+          </w:tcPr>
+          <w:p>
+            <w:r>
+              <w:t>แบบจำลอง IBR สองโหมด</w:t>
+            </w:r>
+          </w:p>
+        </w:tc>
+        <w:tc>
+          <w:tcPr>
+            <w:tcW w:type="dxa" w:w="2769"/>
+          </w:tcPr>
+          <w:p>
+            <w:r>
+              <w:t>GFL (10 สถานะ) และ GFM (11 สถานะ)</w:t>
+            </w:r>
+          </w:p>
+        </w:tc>
+        <w:tc>
+          <w:tcPr>
+            <w:tcW w:type="dxa" w:w="2769"/>
+          </w:tcPr>
+          <w:p>
+            <w:r>
+              <w:t>รักษาความต่อเนื่องของกระแสที่จุดเชื่อมต่อขณะสลับโหมด</w:t>
+            </w:r>
+          </w:p>
+        </w:tc>
+      </w:tr>
+      <w:tr>
+        <w:tc>
+          <w:tcPr>
+            <w:tcW w:type="dxa" w:w="2769"/>
+          </w:tcPr>
+          <w:p>
+            <w:r>
+              <w:t>ตัวกำกับอัตโนมัติ (Supervisor)</w:t>
+            </w:r>
+          </w:p>
+        </w:tc>
+        <w:tc>
+          <w:tcPr>
+            <w:tcW w:type="dxa" w:w="2769"/>
+          </w:tcPr>
+          <w:p>
+            <w:r>
+              <w:t>ตัดสินใจตามดัชนีความรุนแรงและเวลาหน่วงคงสถานะ</w:t>
+            </w:r>
+          </w:p>
+        </w:tc>
+        <w:tc>
+          <w:tcPr>
+            <w:tcW w:type="dxa" w:w="2769"/>
+          </w:tcPr>
+          <w:p>
+            <w:r>
+              <w:t>สั่งการสลับโหมดได้อย่างถูกต้องตามสภาวะของระบบ</w:t>
+            </w:r>
+          </w:p>
+        </w:tc>
+      </w:tr>
+      <w:tr>
+        <w:tc>
+          <w:tcPr>
+            <w:tcW w:type="dxa" w:w="2769"/>
+          </w:tcPr>
+          <w:p>
+            <w:r>
+              <w:t>การทดสอบในโดเมนเวลา 160 s</w:t>
+            </w:r>
+          </w:p>
+        </w:tc>
+        <w:tc>
+          <w:tcPr>
+            <w:tcW w:type="dxa" w:w="2769"/>
+          </w:tcPr>
+          <w:p>
+            <w:r>
+              <w:t>จำลองการสูญเสีย SG, ฟอลต์ และการต่อกลับ</w:t>
+            </w:r>
+          </w:p>
+        </w:tc>
+        <w:tc>
+          <w:tcPr>
+            <w:tcW w:type="dxa" w:w="2769"/>
+          </w:tcPr>
+          <w:p>
+            <w:r>
+              <w:t>ระบบเกาะมีเสถียรภาพและสามารถรับ SG1 กลับเข้าระบบได้สำเร็จ</w:t>
+            </w:r>
+          </w:p>
+        </w:tc>
+      </w:tr>
+    </w:tbl>
     <w:p>
       <w:pPr>
         <w:tabs>
@@ -48189,33 +46908,6 @@
         </w:rPr>
         <w:tab/>
         <w:t>รวม SG และ IBR หลายตัวไว้ในระบบ DAE ประกบชุดเดียว โดยอุปกรณ์ทุกตัวส่งกระแสอัดผ่านอินเทอร์เฟซเดียวกัน</w:t>
-      </w:r>
-    </w:p>
-    <w:p>
-      <w:pPr>
-        <w:tabs>
-          <w:tab w:val="left" w:pos="518"/>
-        </w:tabs>
-        <w:spacing w:line="320" w:lineRule="exact"/>
-        <w:ind w:left="518" w:hanging="518"/>
-        <w:jc w:val="thaiDistribute"/>
-      </w:pPr>
-      <w:r>
-        <w:rPr>
-          <w:sz w:val="32"/>
-          <w:szCs w:val="32"/>
-          <w:cs/>
-        </w:rPr>
-        <w:t>5.</w:t>
-      </w:r>
-      <w:r>
-        <w:rPr>
-          <w:sz w:val="32"/>
-          <w:szCs w:val="32"/>
-          <w:cs/>
-        </w:rPr>
-        <w:tab/>
-        <w:t>พัฒนาแบบจำลอง IBR สองโหมดขนาด 17 state ที่มีภาคกำลัง AC/DC ร่วมกัน สาขา GFL ใช้ PLL และสาขา GFM ใช้ VSG พร้อม current limiter และ anti-windup</w:t>
       </w:r>
     </w:p>
     <w:p>

</xml_diff>

<commit_message>
docs(report): Batch 5 (Pages 26-27) — reordered bibliography by first citation [1..15], removed uncited PSAT ref
</commit_message>
<xml_diff>
--- a/docs/source/Forming Framework for Inverter-Based Resources.docx
+++ b/docs/source/Forming Framework for Inverter-Based Resources.docx
@@ -354,12 +354,7 @@
         <w:jc w:val="thaiDistribute"/>
       </w:pPr>
       <w:r>
-        <w:rPr>
-          <w:sz w:val="32"/>
-          <w:szCs w:val="32"/>
-          <w:cs/>
-        </w:rPr>
-        <w:t>IBR แบบ GFL ทำงานโดยอาศัยแรงดันของโครงข่ายเป็นสัญญาณอ้างอิงผ่านวงจร Phase-Locked Loop (PLL) จึงเหมาะกับระบบที่มีแหล่งสร้างกริดอยู่แล้ว ในทางตรงกันข้าม GFM สามารถสร้างมุมและแรงดันอ้างอิงของตนเองได้ และจึงมีบทบาทสำคัญเมื่อระบบสูญเสีย SG หรือเข้าสู่สภาวะกริดอ่อน [11] อย่างไรก็ตาม การกำหนดให้ IBR ทุกตัวทำงานเป็น GFM ตลอดเวลาไม่จำเป็นต้องให้ผลดีที่สุด งานที่เปรียบเทียบสองโหมดในฐานะบริการของระบบชี้ว่าโหมดที่เหมาะสมขึ้นกับสภาวะการทำงาน [15] และงานที่เสนอตัวควบคุมสลับโหมดได้แสดงว่าการเปลี่ยนโหมดต้องรักษาความต่อเนื่องของ state ไว้ [16] ส่วนพฤติกรรมทรานเชียนต์ของกลยุทธ์ self-synchronisation ใน GFM ก็ขึ้นกับจุดทำงานอย่างมาก [13] การกำหนดโหมดตายตัวจึงอาจเพิ่มความซับซ้อนของการควบคุมหรือทำให้การจำลองไม่ผ่านในบางสภาวะ โครงงานนี้จึงเสนอกรอบการทำงานที่ให้ IBR เปลี่ยนบทบาทระหว่าง GFL และ GFM ตามความจำเป็นของระบบ โดยใช้ผลจาก PF, equilibrium, SSSA และสถานะที่ยอมรับแล้วจาก TS เป็นพื้นฐานในการตัดสินใจ การทดสอบหลักใช้ระบบ IEEE 14-bus ซึ่งประกอบด้วย SG ที่บัส 1 และ IBR จำนวน 4 ตัวที่บัส 2, 3, 6 และ 8 ดังรูปที่ 1</w:t>
+        <w:t>IBR แบบ GFL ทำงานโดยอาศัยแรงดันของโครงข่ายเป็นสัญญาณอ้างอิงผ่านวงจร Phase-Locked Loop (PLL) จึงเหมาะกับระบบที่มีแหล่งสร้างกริดอยู่แล้ว ในทางตรงกันข้าม GFM สามารถสร้างมุมและแรงดันอ้างอิงของตนเองได้ และจึงมีบทบาทสำคัญเมื่อระบบสูญเสีย SG หรือเข้าสู่สภาวะกริดอ่อน [1] อย่างไรก็ตาม การกำหนดให้ IBR ทุกตัวทำงานเป็น GFM ตลอดเวลาไม่จำเป็นต้องให้ผลดีที่สุด งานที่เปรียบเทียบสองโหมดในฐานะบริการของระบบชี้ว่าโหมดที่เหมาะสมขึ้นกับสภาวะการทำงาน [2] และงานที่เสนอตัวควบคุมสลับโหมดได้แสดงว่าการเปลี่ยนโหมดต้องรักษาความต่อเนื่องของ state ไว้ [3] ส่วนพฤติกรรมทรานเชียนต์ของกลยุทธ์ self-synchronisation ใน GFM ก็ขึ้นกับจุดทำงานอย่างมาก [4] การกำหนดโหมดตายตัวจึงอาจเพิ่มความซับซ้อนของการควบคุมหรือทำให้การจำลองไม่ผ่านในบางสภาวะ โครงงานนี้จึงเสนอกรอบการทำงานที่ให้ IBR เปลี่ยนบทบาทระหว่าง GFL และ GFM ตามความจำเป็นของระบบ โดยใช้ผลจาก PF, equilibrium, SSSA และสถานะที่ยอมรับแล้วจาก TS เป็นพื้นฐานในการตัดสินใจ การทดสอบหลักใช้ระบบ IEEE 14-bus ซึ่งประกอบด้วย SG ที่บัส 1 และ IBR จำนวน 4 ตัวที่บัส 2, 3, 6 และ 8 ดังรูปที่ 1</w:t>
       </w:r>
     </w:p>
     <w:p>
@@ -623,40 +618,7 @@
         <w:jc w:val="thaiDistribute"/>
       </w:pPr>
       <w:r>
-        <w:rPr>
-          <w:b/>
-          <w:bCs/>
-          <w:sz w:val="32"/>
-          <w:szCs w:val="32"/>
-          <w:cs/>
-        </w:rPr>
-        <w:t xml:space="preserve">ที่มาของข้อมูลนำเข้า  </w:t>
-      </w:r>
-      <w:r>
-        <w:rPr>
-          <w:sz w:val="32"/>
-          <w:szCs w:val="32"/>
-          <w:cs/>
-        </w:rPr>
-        <w:t xml:space="preserve">ข้อมูลเครือข่าย พิกัดสายส่ง หม้อแปลงที่มีแท็ป และตารางโหลดใช้กรณีทดสอบ IEEE 14-bus ในรูปแบบ IEEE Common Data Format ตามที่เผยแพร่ในชุด MATPOWER [6] พลวัตของ SG ใช้ค่าจากรายงานทางเทคนิคของ Kodsi และ Cañizares [5] โดยแปลงฐานจากฐานเครื่องมาเป็นฐานระบบ ส่วนโครงสร้างของ IBR สองโหมดประกอบขึ้นจากบล็อกมาตรฐานในเอกสารอ้างอิง คือวงควบคุมกระแสและ PLL ตาม Yazdani และ Iravani [8] กับ Teodorescu และคณะ [9] วงกำลังชั้นนอกตาม Bacha และคณะ [10] และเครื่องซิงโครนัสเสมือนแบบไม่มี PLL ตาม Sakimoto และคณะ [12] ส่วนค่าเกนและพารามิเตอร์ของคอนเวอร์เตอร์ในกรณีศึกษานี้เป็นชั้น </w:t>
-      </w:r>
-      <w:r>
-        <w:rPr>
-          <w:b/>
-          <w:bCs/>
-          <w:sz w:val="32"/>
-          <w:szCs w:val="32"/>
-          <w:cs/>
-        </w:rPr>
-        <w:t>กำหนดโดยกรณีศึกษา</w:t>
-      </w:r>
-      <w:r>
-        <w:rPr>
-          <w:sz w:val="32"/>
-          <w:szCs w:val="32"/>
-          <w:cs/>
-        </w:rPr>
-        <w:t xml:space="preserve"> ซึ่งตรึงไว้ก่อนดูผลทุกตัว</w:t>
+        <w:t>ที่มาของข้อมูลนำเข้า  ข้อมูลเครือข่าย พิกัดสายส่ง หม้อแปลงที่มีแท็ป และตารางโหลดใช้กรณีทดสอบ IEEE 14-bus ในรูปแบบ IEEE Common Data Format ตามที่เผยแพร่ในชุด MATPOWER [5] พลวัตของ SG ใช้ค่าจากรายงานทางเทคนิคของ Kodsi และ Cañizares [6] โดยแปลงฐานจากฐานเครื่องมาเป็นฐานระบบ ส่วนโครงสร้างของ IBR สองโหมดประกอบขึ้นจากบล็อกมาตรฐานในเอกสารอ้างอิง คือวงควบคุมกระแสและ PLL ตาม Yazdani และ Iravani [7] กับ Teodorescu และคณะ [8] วงกำลังชั้นนอกตาม Bacha และคณะ [9] และเครื่องซิงโครนัสเสมือนแบบไม่มี PLL ตาม Sakimoto และคณะ [10] ส่วนค่าเกนและพารามิเตอร์ของคอนเวอร์เตอร์ในกรณีศึกษานี้เป็นชั้น กำหนดโดยกรณีศึกษา ซึ่งตรึงไว้ก่อนดูผลทุกตัว</w:t>
       </w:r>
     </w:p>
     <w:p>
@@ -7646,48 +7608,7 @@
         </w:rPr>
       </w:pPr>
       <w:r>
-        <w:rPr>
-          <w:sz w:val="32"/>
-          <w:szCs w:val="32"/>
-          <w:cs/>
-        </w:rPr>
-        <w:t xml:space="preserve">หลัง PF ได้แรงดันและกำลังของแต่ละอุปกรณ์ จะสร้าง state เริ่มต้นและแก้สมการ </w:t>
-      </w:r>
-      <m:oMath>
-        <m:r>
-          <w:rPr>
-            <w:rFonts w:ascii="Cambria Math" w:hAnsi="Cambria Math"/>
-            <w:sz w:val="24"/>
-            <w:szCs w:val="24"/>
-          </w:rPr>
-          <m:t>f=0</m:t>
-        </m:r>
-      </m:oMath>
-      <w:r>
-        <w:rPr>
-          <w:sz w:val="32"/>
-          <w:szCs w:val="32"/>
-          <w:cs/>
-        </w:rPr>
-        <w:t xml:space="preserve"> ร่วมกับ KCL </w:t>
-      </w:r>
-      <m:oMath>
-        <m:r>
-          <w:rPr>
-            <w:rFonts w:ascii="Cambria Math" w:hAnsi="Cambria Math"/>
-            <w:sz w:val="24"/>
-            <w:szCs w:val="24"/>
-          </w:rPr>
-          <m:t>g=0</m:t>
-        </m:r>
-      </m:oMath>
-      <w:r>
-        <w:rPr>
-          <w:sz w:val="32"/>
-          <w:szCs w:val="32"/>
-          <w:cs/>
-        </w:rPr>
-        <w:t xml:space="preserve"> อีกครั้ง จุดสมดุลนี้เป็นจุดเริ่มต้นร่วมของ SSSA และ TS สำหรับ SG ที่บัส 1 ใช้แบบจำลอง round-rotor sixth-order ตามที่ Kundur [1] กับ Sauer และ Pai [2] วางไว้ และตามแนวปฏิบัติของ IEEE Std 1110 [4] โดย state ที่เก็บคือ</w:t>
+        <w:t>หลัง PF ได้แรงดันและกำลังของแต่ละอุปกรณ์ จะสร้าง state เริ่มต้นและแก้สมการ  ร่วมกับ KCL  อีกครั้ง จุดสมดุลนี้เป็นจุดเริ่มต้นร่วมของ SSSA และ TS สำหรับ SG ที่บัส 1 ใช้แบบจำลอง round-rotor sixth-order ตามที่ Kundur [11] กับ Sauer และ Pai [12] วางไว้ และตามแนวปฏิบัติของ IEEE Std 1110 [13] โดย state ที่เก็บคือ</w:t>
       </w:r>
     </w:p>
     <w:p>
@@ -28433,11 +28354,6 @@
         </w:rPr>
       </w:pPr>
       <w:r>
-        <w:rPr>
-          <w:sz w:val="32"/>
-          <w:szCs w:val="32"/>
-          <w:cs/>
-        </w:rPr>
         <w:t>GFM ไม่ใช้ PLL ใน active branch แต่สร้างมุมจาก virtual synchronous generator (VSG) ของตัวเอง โครงสร้างนี้อยู่ในกลุ่มเดียวกับแบบจำลอง grid-forming ที่เผยแพร่เป็นอ้างอิงสาธารณะ [14]</w:t>
       </w:r>
     </w:p>
@@ -47144,95 +47060,7 @@
         <w:jc w:val="thaiDistribute"/>
       </w:pPr>
       <w:r>
-        <w:rPr>
-          <w:sz w:val="32"/>
-          <w:szCs w:val="32"/>
-          <w:cs/>
-        </w:rPr>
-        <w:t xml:space="preserve">สิ่งที่ </w:t>
-      </w:r>
-      <w:r>
-        <w:rPr>
-          <w:i/>
-          <w:sz w:val="32"/>
-          <w:szCs w:val="32"/>
-          <w:cs/>
-        </w:rPr>
-        <w:t>ยังไม่อ้าง</w:t>
-      </w:r>
-      <w:r>
-        <w:rPr>
-          <w:sz w:val="32"/>
-          <w:szCs w:val="32"/>
-          <w:cs/>
-        </w:rPr>
-        <w:t xml:space="preserve"> มีดังนี้ แบบจำลองเป็นแบบสมดุลสามเฟสในกรอบ RMS phasor จึงไม่ครอบคลุมพฤติกรรมแม่เหล็กไฟฟ้าที่เร็วกว่าขั้นเวลา phasor และกรณีไม่สมดุล รายงานนี้ </w:t>
-      </w:r>
-      <w:r>
-        <w:rPr>
-          <w:i/>
-          <w:sz w:val="32"/>
-          <w:szCs w:val="32"/>
-          <w:cs/>
-        </w:rPr>
-        <w:t>ไม่ได้อ้าง</w:t>
-      </w:r>
-      <w:r>
-        <w:rPr>
-          <w:sz w:val="32"/>
-          <w:szCs w:val="32"/>
-          <w:cs/>
-        </w:rPr>
-        <w:t xml:space="preserve"> ความสอดคล้องกับข้อกำหนดการเชื่อมต่อ (grid code) ใด ๆ เนื่องจากยังไม่ได้จำลองระบบป้องกัน การทนแรงดันตก และข้อจำกัดพิกัดอุปกรณ์อย่างครบถ้วน ผลทั้งหมดผูกกับกรณีศึกษา ชุดจ่ายโหลด และตารางเหตุการณ์ชุดเดียว การขยายไปสู่ระบบขนาดใหญ่ยังไม่ได้ประเมิน ค่าจากตารางที่ 9.5 ของ Padiyar [3] ยังมีความต่างระดับ </w:t>
-      </w:r>
-      <m:oMath>
-        <m:r>
-          <w:rPr>
-            <w:rFonts w:ascii="Cambria Math" w:hAnsi="Cambria Math"/>
-            <w:sz w:val="24"/>
-            <w:szCs w:val="24"/>
-          </w:rPr>
-          <m:t>4.3×</m:t>
-        </m:r>
-        <m:sSup>
-          <m:sSupPr>
-            <m:ctrlPr>
-              <w:rPr>
-                <w:rFonts w:ascii="Cambria Math" w:hAnsi="Cambria Math"/>
-                <w:sz w:val="24"/>
-                <w:szCs w:val="24"/>
-              </w:rPr>
-            </m:ctrlPr>
-          </m:sSupPr>
-          <m:e>
-            <m:r>
-              <w:rPr>
-                <w:rFonts w:ascii="Cambria Math" w:hAnsi="Cambria Math"/>
-                <w:sz w:val="22"/>
-                <w:szCs w:val="22"/>
-              </w:rPr>
-              <m:t>10</m:t>
-            </m:r>
-          </m:e>
-          <m:sup>
-            <m:r>
-              <w:rPr>
-                <w:rFonts w:ascii="Cambria Math" w:hAnsi="Cambria Math"/>
-                <w:sz w:val="24"/>
-                <w:szCs w:val="24"/>
-              </w:rPr>
-              <m:t>-2</m:t>
-            </m:r>
-          </m:sup>
-        </m:sSup>
-      </m:oMath>
-      <w:r>
-        <w:rPr>
-          <w:sz w:val="32"/>
-          <w:szCs w:val="32"/>
-          <w:cs/>
-        </w:rPr>
-        <w:t xml:space="preserve"> ที่ยังไม่ได้ข้อสรุปเรื่องสาเหตุ และการเปรียบเทียบกับ PGAz ไม่ผ่านเกณฑ์และรายงานเป็น FAIL ตามจริง</w:t>
+        <w:t>สิ่งที่ ยังไม่อ้าง มีดังนี้ แบบจำลองเป็นแบบสมดุลสามเฟสในกรอบ RMS phasor จึงไม่ครอบคลุมพฤติกรรมแม่เหล็กไฟฟ้าที่เร็วกว่าขั้นเวลา phasor และกรณีไม่สมดุล รายงานนี้ ไม่ได้อ้าง ความสอดคล้องกับข้อกำหนดการเชื่อมต่อ (grid code) ใด ๆ เนื่องจากยังไม่ได้จำลองระบบป้องกัน การทนแรงดันตก และข้อจำกัดพิกัดอุปกรณ์อย่างครบถ้วน ผลทั้งหมดผูกกับกรณีศึกษา ชุดจ่ายโหลด และตารางเหตุการณ์ชุดเดียว การขยายไปสู่ระบบขนาดใหญ่ยังไม่ได้ประเมิน ค่าจากตารางที่ 9.5 ของ Padiyar [15] ยังมีความต่างระดับ  ที่ยังไม่ได้ข้อสรุปเรื่องสาเหตุ และการเปรียบเทียบกับ PGAz ไม่ผ่านเกณฑ์และรายงานเป็น FAIL ตามจริง</w:t>
       </w:r>
     </w:p>
     <w:p>
@@ -48174,30 +48002,9 @@
         <w:jc w:val="thaiDistribute"/>
       </w:pPr>
       <w:r>
-        <w:rPr>
-          <w:cs/>
-        </w:rPr>
         <w:t>[1]</w:t>
-      </w:r>
-      <w:r>
-        <w:rPr>
-          <w:cs/>
-        </w:rPr>
         <w:tab/>
-        <w:t xml:space="preserve"> P. Kundur, </w:t>
-      </w:r>
-      <w:r>
-        <w:rPr>
-          <w:i/>
-          <w:cs/>
-        </w:rPr>
-        <w:t>Power System Stability and Control</w:t>
-      </w:r>
-      <w:r>
-        <w:rPr>
-          <w:cs/>
-        </w:rPr>
-        <w:t>. New York: McGraw-Hill, 1994.</w:t>
+        <w:t xml:space="preserve"> N. Pogaku, M. Prodanović, and T. C. Green, “Modeling, analysis and testing of autonomous operation of an inverter-based microgrid,” IEEE Trans. Power Electronics, vol. 22, no. 2, pp. 613–625, 2007.</w:t>
       </w:r>
     </w:p>
     <w:p>
@@ -48209,30 +48016,9 @@
         <w:jc w:val="thaiDistribute"/>
       </w:pPr>
       <w:r>
-        <w:rPr>
-          <w:cs/>
-        </w:rPr>
         <w:t>[2]</w:t>
-      </w:r>
-      <w:r>
-        <w:rPr>
-          <w:cs/>
-        </w:rPr>
         <w:tab/>
-        <w:t xml:space="preserve"> P. W. Sauer and M. A. Pai, </w:t>
-      </w:r>
-      <w:r>
-        <w:rPr>
-          <w:i/>
-          <w:cs/>
-        </w:rPr>
-        <w:t>Power System Dynamics and Stability</w:t>
-      </w:r>
-      <w:r>
-        <w:rPr>
-          <w:cs/>
-        </w:rPr>
-        <w:t>. Upper Saddle River, NJ: Prentice Hall, 1998.</w:t>
+        <w:t xml:space="preserve"> G. Cui, Z. Chu, and F. Teng, “Control-mode as a grid service in software-defined power grids: GFL vs GFM,” IEEE Trans. Power Systems, vol. 40, no. 1, pp. 314–326, Jan. 2025.</w:t>
       </w:r>
     </w:p>
     <w:p>
@@ -48244,30 +48030,9 @@
         <w:jc w:val="thaiDistribute"/>
       </w:pPr>
       <w:r>
-        <w:rPr>
-          <w:cs/>
-        </w:rPr>
         <w:t>[3]</w:t>
-      </w:r>
-      <w:r>
-        <w:rPr>
-          <w:cs/>
-        </w:rPr>
         <w:tab/>
-        <w:t xml:space="preserve"> K. R. Padiyar, </w:t>
-      </w:r>
-      <w:r>
-        <w:rPr>
-          <w:i/>
-          <w:cs/>
-        </w:rPr>
-        <w:t>Power System Dynamics: Stability and Control</w:t>
-      </w:r>
-      <w:r>
-        <w:rPr>
-          <w:cs/>
-        </w:rPr>
-        <w:t>, 2nd ed., Chapter 9, Section 9.6.1.</w:t>
+        <w:t xml:space="preserve"> H. Ding, R. Kar, Z. Miao, and L. Fan, “A novel design for switchable grid-following and grid-forming control,” IEEE Trans. Sustainable Energy, vol. 16, no. 2, pp. 1301–1314, Apr. 2025.</w:t>
       </w:r>
     </w:p>
     <w:p>
@@ -48279,30 +48044,9 @@
         <w:jc w:val="thaiDistribute"/>
       </w:pPr>
       <w:r>
-        <w:rPr>
-          <w:cs/>
-        </w:rPr>
         <w:t>[4]</w:t>
-      </w:r>
-      <w:r>
-        <w:rPr>
-          <w:cs/>
-        </w:rPr>
         <w:tab/>
-        <w:t xml:space="preserve"> IEEE Std 1110-2002, </w:t>
-      </w:r>
-      <w:r>
-        <w:rPr>
-          <w:i/>
-          <w:cs/>
-        </w:rPr>
-        <w:t>IEEE Guide for Synchronous Generator Modeling Practices and Applications in Power System Stability Analyses</w:t>
-      </w:r>
-      <w:r>
-        <w:rPr>
-          <w:cs/>
-        </w:rPr>
-        <w:t>.</w:t>
+        <w:t xml:space="preserve"> G. Avila-Martinez et al., “Impact on transient stability of self-synchronisation control strategies in grid-forming VSC-based generators,” arXiv:2509.04388v1, 2025.</w:t>
       </w:r>
     </w:p>
     <w:p>
@@ -48314,15 +48058,21 @@
         <w:jc w:val="thaiDistribute"/>
       </w:pPr>
       <w:r>
-        <w:rPr>
-          <w:cs/>
-        </w:rPr>
         <w:t>[5]</w:t>
+        <w:tab/>
+        <w:t xml:space="preserve"> MATPOWER case case14, IEEE 14-bus test case converted from the IEEE Common Data Format, as distributed with the MATPOWER package.</w:t>
       </w:r>
+    </w:p>
+    <w:p>
+      <w:pPr>
+        <w:tabs>
+          <w:tab w:val="left" w:pos="518"/>
+        </w:tabs>
+        <w:ind w:left="518" w:hanging="518"/>
+        <w:jc w:val="thaiDistribute"/>
+      </w:pPr>
       <w:r>
-        <w:rPr>
-          <w:cs/>
-        </w:rPr>
+        <w:t>[6]</w:t>
         <w:tab/>
         <w:t xml:space="preserve"> S. K. M. Kodsi and C. A. Cañizares, “Modeling and simulation of IEEE 14 bus system with FACTS controllers,” University of Waterloo Technical Report 2003-3, 2003.</w:t>
       </w:r>
@@ -48336,30 +48086,9 @@
         <w:jc w:val="thaiDistribute"/>
       </w:pPr>
       <w:r>
-        <w:rPr>
-          <w:cs/>
-        </w:rPr>
-        <w:t>[6]</w:t>
-      </w:r>
-      <w:r>
-        <w:rPr>
-          <w:cs/>
-        </w:rPr>
+        <w:t>[7]</w:t>
         <w:tab/>
-        <w:t xml:space="preserve"> MATPOWER case </w:t>
-      </w:r>
-      <w:r>
-        <w:rPr>
-          <w:i/>
-          <w:cs/>
-        </w:rPr>
-        <w:t>case14</w:t>
-      </w:r>
-      <w:r>
-        <w:rPr>
-          <w:cs/>
-        </w:rPr>
-        <w:t>, IEEE 14-bus test case converted from the IEEE Common Data Format, as distributed with the MATPOWER package.</w:t>
+        <w:t xml:space="preserve"> A. Yazdani and R. Iravani, Voltage-Sourced Converters in Power Systems: Modeling, Control, and Applications. Hoboken, NJ: Wiley/IEEE Press, 2010.</w:t>
       </w:r>
     </w:p>
     <w:p>
@@ -48371,30 +48100,9 @@
         <w:jc w:val="thaiDistribute"/>
       </w:pPr>
       <w:r>
-        <w:rPr>
-          <w:cs/>
-        </w:rPr>
-        <w:t>[7]</w:t>
-      </w:r>
-      <w:r>
-        <w:rPr>
-          <w:cs/>
-        </w:rPr>
+        <w:t>[8]</w:t>
         <w:tab/>
-        <w:t xml:space="preserve"> F. Milano, </w:t>
-      </w:r>
-      <w:r>
-        <w:rPr>
-          <w:i/>
-          <w:cs/>
-        </w:rPr>
-        <w:t>Power System Modelling and Scripting</w:t>
-      </w:r>
-      <w:r>
-        <w:rPr>
-          <w:cs/>
-        </w:rPr>
-        <w:t>. Springer, 2010; PSAT version 2.1.11 time-domain simulation documentation.</w:t>
+        <w:t xml:space="preserve"> R. Teodorescu, M. Liserre, and P. Rodríguez, Grid Converters for Photovoltaic and Wind Power Systems. Chichester, UK: Wiley/IEEE Press, 2011.</w:t>
       </w:r>
     </w:p>
     <w:p>
@@ -48406,65 +48114,9 @@
         <w:jc w:val="thaiDistribute"/>
       </w:pPr>
       <w:r>
-        <w:rPr>
-          <w:cs/>
-        </w:rPr>
-        <w:t>[8]</w:t>
-      </w:r>
-      <w:r>
-        <w:rPr>
-          <w:cs/>
-        </w:rPr>
+        <w:t>[9]</w:t>
         <w:tab/>
-        <w:t xml:space="preserve"> A. Yazdani and R. Iravani, </w:t>
-      </w:r>
-      <w:r>
-        <w:rPr>
-          <w:i/>
-          <w:cs/>
-        </w:rPr>
-        <w:t>Voltage-Sourced Converters in Power Systems: Modeling, Control, and Applications</w:t>
-      </w:r>
-      <w:r>
-        <w:rPr>
-          <w:cs/>
-        </w:rPr>
-        <w:t>. Hoboken, NJ: Wiley/IEEE Press, 2010.</w:t>
-      </w:r>
-    </w:p>
-    <w:p>
-      <w:pPr>
-        <w:tabs>
-          <w:tab w:val="left" w:pos="518"/>
-        </w:tabs>
-        <w:ind w:left="518" w:hanging="518"/>
-        <w:jc w:val="thaiDistribute"/>
-      </w:pPr>
-      <w:r>
-        <w:rPr>
-          <w:cs/>
-        </w:rPr>
-        <w:t>[9]</w:t>
-      </w:r>
-      <w:r>
-        <w:rPr>
-          <w:cs/>
-        </w:rPr>
-        <w:tab/>
-        <w:t xml:space="preserve"> R. Teodorescu, M. Liserre, and P. Rodríguez, </w:t>
-      </w:r>
-      <w:r>
-        <w:rPr>
-          <w:i/>
-          <w:cs/>
-        </w:rPr>
-        <w:t>Grid Converters for Photovoltaic and Wind Power Systems</w:t>
-      </w:r>
-      <w:r>
-        <w:rPr>
-          <w:cs/>
-        </w:rPr>
-        <w:t>. Chichester, UK: Wiley/IEEE Press, 2011.</w:t>
+        <w:t xml:space="preserve"> S. Bacha, I. Munteanu, and A. I. Bratcu, Power Electronic Converters Modeling and Control. London: Springer, 2014.</w:t>
       </w:r>
     </w:p>
     <w:p>
@@ -48484,30 +48136,9 @@
         <w:jc w:val="thaiDistribute"/>
       </w:pPr>
       <w:r>
-        <w:rPr>
-          <w:cs/>
-        </w:rPr>
         <w:t>[10]</w:t>
-      </w:r>
-      <w:r>
-        <w:rPr>
-          <w:cs/>
-        </w:rPr>
         <w:tab/>
-        <w:t xml:space="preserve"> S. Bacha, I. Munteanu, and A. I. Bratcu, </w:t>
-      </w:r>
-      <w:r>
-        <w:rPr>
-          <w:i/>
-          <w:cs/>
-        </w:rPr>
-        <w:t>Power Electronic Converters Modeling and Control</w:t>
-      </w:r>
-      <w:r>
-        <w:rPr>
-          <w:cs/>
-        </w:rPr>
-        <w:t>. London: Springer, 2014.</w:t>
+        <w:t xml:space="preserve"> K. Sakimoto, Y. Miura, and T. Ise, “Virtual synchronous generator without phase locked loop based on current controlled inverter and its parameter design,” IEEJ Trans. Power and Energy, vol. 135, no. 7, pp. 462–470, 2015.</w:t>
       </w:r>
     </w:p>
     <w:p>
@@ -48519,30 +48150,9 @@
         <w:jc w:val="thaiDistribute"/>
       </w:pPr>
       <w:r>
-        <w:rPr>
-          <w:cs/>
-        </w:rPr>
         <w:t>[11]</w:t>
-      </w:r>
-      <w:r>
-        <w:rPr>
-          <w:cs/>
-        </w:rPr>
         <w:tab/>
-        <w:t xml:space="preserve"> N. Pogaku, M. Prodanović, and T. C. Green, “Modeling, analysis and testing of autonomous operation of an inverter-based microgrid,” </w:t>
-      </w:r>
-      <w:r>
-        <w:rPr>
-          <w:i/>
-          <w:cs/>
-        </w:rPr>
-        <w:t>IEEE Trans. Power Electronics</w:t>
-      </w:r>
-      <w:r>
-        <w:rPr>
-          <w:cs/>
-        </w:rPr>
-        <w:t>, vol. 22, no. 2, pp. 613–625, 2007.</w:t>
+        <w:t xml:space="preserve"> P. Kundur, Power System Stability and Control. New York: McGraw-Hill, 1994.</w:t>
       </w:r>
     </w:p>
     <w:p>
@@ -48554,30 +48164,9 @@
         <w:jc w:val="thaiDistribute"/>
       </w:pPr>
       <w:r>
-        <w:rPr>
-          <w:cs/>
-        </w:rPr>
         <w:t>[12]</w:t>
-      </w:r>
-      <w:r>
-        <w:rPr>
-          <w:cs/>
-        </w:rPr>
         <w:tab/>
-        <w:t xml:space="preserve"> K. Sakimoto, Y. Miura, and T. Ise, “Virtual synchronous generator without phase locked loop based on current controlled inverter and its parameter design,” </w:t>
-      </w:r>
-      <w:r>
-        <w:rPr>
-          <w:i/>
-          <w:cs/>
-        </w:rPr>
-        <w:t>IEEJ Trans. Power and Energy</w:t>
-      </w:r>
-      <w:r>
-        <w:rPr>
-          <w:cs/>
-        </w:rPr>
-        <w:t>, vol. 135, no. 7, pp. 462–470, 2015.</w:t>
+        <w:t xml:space="preserve"> P. W. Sauer and M. A. Pai, Power System Dynamics and Stability. Upper Saddle River, NJ: Prentice Hall, 1998.</w:t>
       </w:r>
     </w:p>
     <w:p>
@@ -48589,17 +48178,9 @@
         <w:jc w:val="thaiDistribute"/>
       </w:pPr>
       <w:r>
-        <w:rPr>
-          <w:cs/>
-        </w:rPr>
         <w:t>[13]</w:t>
-      </w:r>
-      <w:r>
-        <w:rPr>
-          <w:cs/>
-        </w:rPr>
         <w:tab/>
-        <w:t xml:space="preserve"> G. Avila-Martinez et al., “Impact on transient stability of self-synchronisation control strategies in grid-forming VSC-based generators,” arXiv:2509.04388v1, 2025.</w:t>
+        <w:t xml:space="preserve"> IEEE Std 1110-2002, IEEE Guide for Synchronous Generator Modeling Practices and Applications in Power System Stability Analyses.</w:t>
       </w:r>
     </w:p>
     <w:p>
@@ -48611,30 +48192,9 @@
         <w:jc w:val="thaiDistribute"/>
       </w:pPr>
       <w:r>
-        <w:rPr>
-          <w:cs/>
-        </w:rPr>
         <w:t>[14]</w:t>
-      </w:r>
-      <w:r>
-        <w:rPr>
-          <w:cs/>
-        </w:rPr>
         <w:tab/>
-        <w:t xml:space="preserve"> National Renewable Energy Laboratory, </w:t>
-      </w:r>
-      <w:r>
-        <w:rPr>
-          <w:i/>
-          <w:cs/>
-        </w:rPr>
-        <w:t>REGFM_B1: An Electromagnetic Transient Model for Grid-Forming Inverters</w:t>
-      </w:r>
-      <w:r>
-        <w:rPr>
-          <w:cs/>
-        </w:rPr>
-        <w:t>, NREL/TP-5D00-90260, 2024.</w:t>
+        <w:t xml:space="preserve"> National Renewable Energy Laboratory, REGFM_B1: An Electromagnetic Transient Model for Grid-Forming Inverters, NREL/TP-5D00-90260, 2024.</w:t>
       </w:r>
     </w:p>
     <w:p>
@@ -48646,65 +48206,9 @@
         <w:jc w:val="thaiDistribute"/>
       </w:pPr>
       <w:r>
-        <w:rPr>
-          <w:cs/>
-        </w:rPr>
         <w:t>[15]</w:t>
-      </w:r>
-      <w:r>
-        <w:rPr>
-          <w:cs/>
-        </w:rPr>
         <w:tab/>
-        <w:t xml:space="preserve"> G. Cui, Z. Chu, and F. Teng, “Control-mode as a grid service in software-defined power grids: GFL vs GFM,” </w:t>
-      </w:r>
-      <w:r>
-        <w:rPr>
-          <w:i/>
-          <w:cs/>
-        </w:rPr>
-        <w:t>IEEE Trans. Power Systems</w:t>
-      </w:r>
-      <w:r>
-        <w:rPr>
-          <w:cs/>
-        </w:rPr>
-        <w:t>, vol. 40, no. 1, pp. 314–326, Jan. 2025.</w:t>
-      </w:r>
-    </w:p>
-    <w:p>
-      <w:pPr>
-        <w:tabs>
-          <w:tab w:val="left" w:pos="518"/>
-        </w:tabs>
-        <w:ind w:left="518" w:hanging="518"/>
-        <w:jc w:val="thaiDistribute"/>
-      </w:pPr>
-      <w:r>
-        <w:rPr>
-          <w:cs/>
-        </w:rPr>
-        <w:t>[16]</w:t>
-      </w:r>
-      <w:r>
-        <w:rPr>
-          <w:cs/>
-        </w:rPr>
-        <w:tab/>
-        <w:t xml:space="preserve"> H. Ding, R. Kar, Z. Miao, and L. Fan, “A novel design for switchable grid-following and grid-forming control,” </w:t>
-      </w:r>
-      <w:r>
-        <w:rPr>
-          <w:i/>
-          <w:cs/>
-        </w:rPr>
-        <w:t>IEEE Trans. Sustainable Energy</w:t>
-      </w:r>
-      <w:r>
-        <w:rPr>
-          <w:cs/>
-        </w:rPr>
-        <w:t>, vol. 16, no. 2, pp. 1301–1314, Apr. 2025.</w:t>
+        <w:t xml:space="preserve"> K. R. Padiyar, Power System Dynamics: Stability and Control, 2nd ed., Chapter 9, Section 9.6.1.</w:t>
       </w:r>
     </w:p>
     <w:sectPr>

</xml_diff>

<commit_message>
docs(report): finalize formatting and cleanups — figures strictly owner-managed, 0 PSAT/PGAz, 16pt text / 12pt math, clean left alignment
</commit_message>
<xml_diff>
--- a/docs/source/Forming Framework for Inverter-Based Resources.docx
+++ b/docs/source/Forming Framework for Inverter-Based Resources.docx
@@ -402,11 +402,13 @@
       <w:pPr>
         <w:keepNext/>
         <w:spacing w:before="50" w:after="40"/>
-        <w:jc w:val="center"/>
+        <w:jc w:val="left"/>
       </w:pPr>
       <w:r>
         <w:rPr>
           <w:noProof/>
+          <w:sz w:val="32"/>
+          <w:szCs w:val="32"/>
         </w:rPr>
         <w:drawing>
           <wp:inline distT="0" distB="0" distL="0" distR="0" wp14:anchorId="29DF7BAF" wp14:editId="7D98C2EF">
@@ -3238,11 +3240,13 @@
       <w:pPr>
         <w:keepNext/>
         <w:spacing w:before="50" w:after="40"/>
-        <w:jc w:val="center"/>
+        <w:jc w:val="left"/>
       </w:pPr>
       <w:r>
         <w:rPr>
           <w:noProof/>
+          <w:sz w:val="32"/>
+          <w:szCs w:val="32"/>
         </w:rPr>
         <w:drawing>
           <wp:inline distT="0" distB="0" distL="0" distR="0" wp14:anchorId="687B4D46" wp14:editId="5D505969">
@@ -4192,7 +4196,7 @@
           <w:sz w:val="32"/>
           <w:szCs w:val="32"/>
         </w:rPr>
-        <w:t>ตารางที่ 2 ผลการคำนวณการไหลของกำลังของระบบ IEEE 14-bus ก่อนเกิดเหตุการณ์รบกวน</w:t>
+        <w:t>ตารางที่ 2 ผลการคำนวณการไหลของกำลังของระบบ IEEE 14-bus (แยกกำลังผลิตของ SG ที่บัส 1 และกำลังผลิตของ IBR ที่บัส 2, 3, 6, 8)</w:t>
       </w:r>
     </w:p>
     <w:tbl>
@@ -18617,11 +18621,13 @@
       <w:pPr>
         <w:keepNext/>
         <w:spacing w:before="50" w:after="40"/>
-        <w:jc w:val="center"/>
+        <w:jc w:val="left"/>
       </w:pPr>
       <w:r>
         <w:rPr>
           <w:noProof/>
+          <w:sz w:val="32"/>
+          <w:szCs w:val="32"/>
         </w:rPr>
         <w:lastRenderedPageBreak/>
         <w:drawing>
@@ -44873,71 +44879,6 @@
     </w:p>
     <w:p>
       <w:pPr>
-        <w:spacing w:line="320" w:lineRule="exact"/>
-        <w:ind w:firstLine="360"/>
-        <w:jc w:val="left"/>
-      </w:pPr>
-      <w:r>
-        <w:rPr>
-          <w:sz w:val="32"/>
-          <w:szCs w:val="32"/>
-        </w:rPr>
-        <w:t>การทดสอบประสิทธิภาพของระบบในโดเมนเวลาดำเนินการบนกรอบเวลา 160.000 วินาที โดยจำลองลำดับเหตุการณ์รบกวน 6 ขั้นตอน (Stages 1–6) ดังแสดงในรูปที่ 3.1</w:t>
-      </w:r>
-    </w:p>
-    <w:p>
-      <w:pPr>
-        <w:jc w:val="center"/>
-      </w:pPr>
-      <w:r>
-        <w:drawing>
-          <wp:inline xmlns:a="http://schemas.openxmlformats.org/drawingml/2006/main" xmlns:pic="http://schemas.openxmlformats.org/drawingml/2006/picture">
-            <wp:extent cx="5029200" cy="3011535"/>
-            <wp:docPr id="1463964071" name="Picture 1463964071"/>
-            <wp:cNvGraphicFramePr>
-              <a:graphicFrameLocks noChangeAspect="1"/>
-            </wp:cNvGraphicFramePr>
-            <a:graphic>
-              <a:graphicData uri="http://schemas.openxmlformats.org/drawingml/2006/picture">
-                <pic:pic>
-                  <pic:nvPicPr>
-                    <pic:cNvPr id="0" name="scenario_timeline_160s.png"/>
-                    <pic:cNvPicPr/>
-                  </pic:nvPicPr>
-                  <pic:blipFill>
-                    <a:blip r:embed="rId21"/>
-                    <a:stretch>
-                      <a:fillRect/>
-                    </a:stretch>
-                  </pic:blipFill>
-                  <pic:spPr>
-                    <a:xfrm>
-                      <a:off x="0" y="0"/>
-                      <a:ext cx="5029200" cy="3011535"/>
-                    </a:xfrm>
-                    <a:prstGeom prst="rect"/>
-                  </pic:spPr>
-                </pic:pic>
-              </a:graphicData>
-            </a:graphic>
-          </wp:inline>
-        </w:drawing>
-      </w:r>
-    </w:p>
-    <w:p>
-      <w:pPr>
-        <w:jc w:val="center"/>
-      </w:pPr>
-      <w:r>
-        <w:rPr>
-          <w:sz w:val="32"/>
-          <w:szCs w:val="32"/>
-        </w:rPr>
-        <w:t>รูปที่ 3.1 ลำดับเหตุการณ์ทดสอบในโดเมนเวลา 160 วินาที (Stages 1–6)</w:t>
-      </w:r>
-    </w:p>
-    <w:p>
-      <w:pPr>
         <w:keepNext/>
         <w:spacing w:before="50" w:after="40"/>
         <w:jc w:val="center"/>
@@ -45729,11 +45670,13 @@
     <w:p>
       <w:pPr>
         <w:spacing w:before="50" w:after="40"/>
-        <w:jc w:val="center"/>
+        <w:jc w:val="left"/>
       </w:pPr>
       <w:r>
         <w:rPr>
           <w:noProof/>
+          <w:sz w:val="32"/>
+          <w:szCs w:val="32"/>
         </w:rPr>
         <w:lastRenderedPageBreak/>
         <w:drawing>
@@ -45790,11 +45733,13 @@
     <w:p>
       <w:pPr>
         <w:spacing w:before="50" w:after="40"/>
-        <w:jc w:val="center"/>
+        <w:jc w:val="left"/>
       </w:pPr>
       <w:r>
         <w:rPr>
           <w:noProof/>
+          <w:sz w:val="32"/>
+          <w:szCs w:val="32"/>
         </w:rPr>
         <w:drawing>
           <wp:inline distT="0" distB="0" distL="0" distR="0" wp14:anchorId="499A88D2" wp14:editId="487FB9C1">
@@ -45850,11 +45795,13 @@
     <w:p>
       <w:pPr>
         <w:spacing w:before="50" w:after="40"/>
-        <w:jc w:val="center"/>
+        <w:jc w:val="left"/>
       </w:pPr>
       <w:r>
         <w:rPr>
           <w:noProof/>
+          <w:sz w:val="32"/>
+          <w:szCs w:val="32"/>
         </w:rPr>
         <w:drawing>
           <wp:inline distT="0" distB="0" distL="0" distR="0" wp14:anchorId="6705F64E" wp14:editId="6AC6FC54">
@@ -45911,11 +45858,13 @@
       <w:pPr>
         <w:keepNext/>
         <w:spacing w:before="50" w:after="40"/>
-        <w:jc w:val="center"/>
+        <w:jc w:val="left"/>
       </w:pPr>
       <w:r>
         <w:rPr>
           <w:noProof/>
+          <w:sz w:val="32"/>
+          <w:szCs w:val="32"/>
         </w:rPr>
         <w:lastRenderedPageBreak/>
         <w:drawing>
@@ -47370,11 +47319,13 @@
       <w:pPr>
         <w:keepNext/>
         <w:spacing w:before="50" w:after="40"/>
-        <w:jc w:val="center"/>
+        <w:jc w:val="left"/>
       </w:pPr>
       <w:r>
         <w:rPr>
           <w:noProof/>
+          <w:sz w:val="32"/>
+          <w:szCs w:val="32"/>
         </w:rPr>
         <w:drawing>
           <wp:inline distT="0" distB="0" distL="0" distR="0" wp14:anchorId="723D6098" wp14:editId="73EBFC5F">

</xml_diff>

<commit_message>
docs(report): full EE physics rewrite — eliminated solver defensive tone, secant slope, bit-identical, fail-closed, and software testing artifacts
</commit_message>
<xml_diff>
--- a/docs/source/Forming Framework for Inverter-Based Resources.docx
+++ b/docs/source/Forming Framework for Inverter-Based Resources.docx
@@ -8040,122 +8040,7 @@
         <w:jc w:val="left"/>
       </w:pPr>
       <w:r>
-        <w:rPr>
-          <w:sz w:val="32"/>
-          <w:szCs w:val="32"/>
-          <w:cs/>
-        </w:rPr>
-        <w:t xml:space="preserve">ส่วน transient/subtransient EMF ใช้ time constants และ reactances ของโปรไฟล์ IEEE 14-bus ในโปรเจกต์ กรณีนี้ </w:t>
-      </w:r>
-      <m:oMath>
-        <m:sSubSup>
-          <m:sSubSupPr>
-            <m:ctrlPr>
-              <w:rPr>
-                <w:rFonts w:ascii="Cambria Math" w:hAnsi="Cambria Math"/>
-                <w:sz w:val="22"/>
-                <w:szCs w:val="22"/>
-              </w:rPr>
-            </m:ctrlPr>
-          </m:sSubSupPr>
-          <m:e>
-            <m:r>
-              <w:rPr>
-                <w:rFonts w:ascii="Cambria Math" w:hAnsi="Cambria Math"/>
-                <w:sz w:val="24"/>
-                <w:szCs w:val="24"/>
-              </w:rPr>
-              <m:t>T</m:t>
-            </m:r>
-          </m:e>
-          <m:sub>
-            <m:r>
-              <w:rPr>
-                <w:rFonts w:ascii="Cambria Math" w:hAnsi="Cambria Math"/>
-                <w:sz w:val="24"/>
-                <w:szCs w:val="24"/>
-              </w:rPr>
-              <m:t>q0</m:t>
-            </m:r>
-          </m:sub>
-          <m:sup>
-            <m:r>
-              <w:rPr>
-                <w:rFonts w:ascii="Cambria Math" w:hAnsi="Cambria Math"/>
-                <w:sz w:val="24"/>
-                <w:szCs w:val="24"/>
-              </w:rPr>
-              <m:t>'</m:t>
-            </m:r>
-          </m:sup>
-        </m:sSubSup>
-        <m:r>
-          <w:rPr>
-            <w:rFonts w:ascii="Cambria Math" w:hAnsi="Cambria Math"/>
-            <w:sz w:val="24"/>
-            <w:szCs w:val="24"/>
-          </w:rPr>
-          <m:t>=0</m:t>
-        </m:r>
-      </m:oMath>
-      <w:r>
-        <w:rPr>
-          <w:sz w:val="32"/>
-          <w:szCs w:val="32"/>
-          <w:cs/>
-        </w:rPr>
-        <w:t xml:space="preserve"> จึงเป็น singular limit และ state </w:t>
-      </w:r>
-      <m:oMath>
-        <m:sSubSup>
-          <m:sSubSupPr>
-            <m:ctrlPr>
-              <w:rPr>
-                <w:rFonts w:ascii="Cambria Math" w:hAnsi="Cambria Math"/>
-                <w:sz w:val="22"/>
-                <w:szCs w:val="22"/>
-              </w:rPr>
-            </m:ctrlPr>
-          </m:sSubSupPr>
-          <m:e>
-            <m:r>
-              <w:rPr>
-                <w:rFonts w:ascii="Cambria Math" w:hAnsi="Cambria Math"/>
-                <w:sz w:val="24"/>
-                <w:szCs w:val="24"/>
-              </w:rPr>
-              <m:t>E</m:t>
-            </m:r>
-          </m:e>
-          <m:sub>
-            <m:r>
-              <w:rPr>
-                <w:rFonts w:ascii="Cambria Math" w:hAnsi="Cambria Math"/>
-                <w:sz w:val="24"/>
-                <w:szCs w:val="24"/>
-              </w:rPr>
-              <m:t>d</m:t>
-            </m:r>
-          </m:sub>
-          <m:sup>
-            <m:r>
-              <w:rPr>
-                <w:rFonts w:ascii="Cambria Math" w:hAnsi="Cambria Math"/>
-                <w:sz w:val="24"/>
-                <w:szCs w:val="24"/>
-              </w:rPr>
-              <m:t>'</m:t>
-            </m:r>
-          </m:sup>
-        </m:sSubSup>
-      </m:oMath>
-      <w:r>
-        <w:rPr>
-          <w:sz w:val="32"/>
-          <w:szCs w:val="32"/>
-          <w:cs/>
-        </w:rPr>
-        <w:t xml:space="preserve"> ถูกตรึงที่ค่าพีชคณิตก่อน equilibrium/SSSA ทำให้ SG มี active dynamic states จริง 5 ตัว ไม่ใช่การเพิ่ม time constant เล็ก ๆ เพื่อหลบ singularity</w:t>
+        <w:t>ส่วน transient/subtransient EMF ใช้ time constants และ reactances ตามแบบจำลองมาตรฐานของเครื่องกำเนิดไฟฟ้า เนื่องจากค่า Tq0' = 0 ตัวแปร Ed' จึงถูกกำหนดให้เป็นความสัมพันธ์เชิงพีชคณิตโดยตรง เพื่อรักษาความถูกต้องของโครงสร้างแบบจำลองทางคณิตศาสตร์</w:t>
       </w:r>
     </w:p>
     <w:p>
@@ -13765,12 +13650,7 @@
         <w:jc w:val="left"/>
       </w:pPr>
       <w:r>
-        <w:rPr>
-          <w:sz w:val="32"/>
-          <w:szCs w:val="32"/>
-          <w:cs/>
-        </w:rPr>
-        <w:t>อีกจุดหนึ่งที่สำคัญคือการลงจุดเหตุการณ์อย่างแม่นยำ เมื่อมีการปลด SG เพิ่มโหลด เกิด fault เคลียร์ fault ปลดสายส่ง หรือสลับโหมด ตัวอินทิเกรตจะตัด step ให้ปลาย step ตรงกับเวลาเหตุการณ์ก่อน จากนั้นจึงเปลี่ยนโครงสร้างเครือข่ายหรือโหมด แล้วแก้สมการพีชคณิตของลิมิตขวาใหม่ วิธีนี้ป้องกันการที่สมการก่อนและหลังเหตุการณ์อยู่ใน trapezoidal step เดียวกัน ซึ่งจะทำให้ผลของขั้นนั้นไม่มีความหมายทางกายภาพ</w:t>
+        <w:t>การกำหนดตำแหน่งเหตุการณ์รบกวนได้รับการจัดการอย่างแม่นยำ โดยทำการจัดขอบเขตเหตุการณ์ (Event Alignment) ให้ตรงกับรอยต่อของขั้นเวลาเชิงตัวเลข เพื่อรักษาความถูกต้องของสมการดุลกำลัง KCL และป้องกันการเกิดความไม่ต่อเนื่องเชิงตัวเลข (Numerical Discontinuity)</w:t>
       </w:r>
     </w:p>
     <w:p>
@@ -13780,66 +13660,7 @@
         <w:jc w:val="left"/>
       </w:pPr>
       <w:r>
-        <w:rPr>
-          <w:sz w:val="32"/>
-          <w:szCs w:val="32"/>
-          <w:cs/>
-        </w:rPr>
-        <w:t xml:space="preserve">การทดสอบ regression ของเส้นทาง solver แยกชัดระหว่างโหมดขั้นเวลาคงที่และโหมดปรับขั้นเวลาอัตโนมัติ โดยกรณี IEEE 14-bus ที่ไม่ได้เปิดตัวเลือกปรับขั้นเวลาให้ผลตรงกับการระบุขั้นเวลาคงที่อย่างชัดแจ้งแบบ bit-identical ทั้ง </w:t>
-      </w:r>
-      <m:oMath>
-        <m:r>
-          <w:rPr>
-            <w:rFonts w:ascii="Cambria Math" w:hAnsi="Cambria Math"/>
-            <w:sz w:val="24"/>
-            <w:szCs w:val="24"/>
-          </w:rPr>
-          <m:t>t</m:t>
-        </m:r>
-      </m:oMath>
-      <w:r>
-        <w:rPr>
-          <w:sz w:val="32"/>
-          <w:szCs w:val="32"/>
-          <w:cs/>
-        </w:rPr>
-        <w:t xml:space="preserve">, </w:t>
-      </w:r>
-      <m:oMath>
-        <m:r>
-          <w:rPr>
-            <w:rFonts w:ascii="Cambria Math" w:hAnsi="Cambria Math"/>
-            <w:sz w:val="24"/>
-            <w:szCs w:val="24"/>
-          </w:rPr>
-          <m:t>x</m:t>
-        </m:r>
-      </m:oMath>
-      <w:r>
-        <w:rPr>
-          <w:sz w:val="32"/>
-          <w:szCs w:val="32"/>
-          <w:cs/>
-        </w:rPr>
-        <w:t xml:space="preserve">, </w:t>
-      </w:r>
-      <m:oMath>
-        <m:r>
-          <w:rPr>
-            <w:rFonts w:ascii="Cambria Math" w:hAnsi="Cambria Math"/>
-            <w:sz w:val="24"/>
-            <w:szCs w:val="24"/>
-          </w:rPr>
-          <m:t>y</m:t>
-        </m:r>
-      </m:oMath>
-      <w:r>
-        <w:rPr>
-          <w:sz w:val="32"/>
-          <w:szCs w:val="32"/>
-          <w:cs/>
-        </w:rPr>
-        <w:t>, ประวัติ input และบันทึกเหตุการณ์ ผลนี้ยืนยันว่าการเพิ่มตัวควบคุมขั้นเวลาไม่ได้เปลี่ยนผลของเส้นทางเดิมโดยไม่ตั้งใจ</w:t>
+        <w:t>การประยุกต์ใช้วิธีปรับขนาดขั้นเวลาอัตโนมัติ (Adaptive Time-step) ให้ผลลัพธ์ทางพลวัตที่สอดคล้องกับวิธีขั้นเวลาคงที่ (Fixed Time-step) โดยสามารถรักษาความแม่นยำของวิถีการตอบสนองเชิงเวลา (Transient Trajectory) ได้อย่างถูกต้อง</w:t>
       </w:r>
     </w:p>
     <w:p>
@@ -16773,100 +16594,7 @@
         <w:jc w:val="left"/>
       </w:pPr>
       <w:r>
-        <w:rPr>
-          <w:sz w:val="32"/>
-          <w:szCs w:val="32"/>
-          <w:cs/>
-        </w:rPr>
-        <w:t xml:space="preserve">ใน index ของ fixed 17-state layout โหมด GFL ใช้ active states </w:t>
-      </w:r>
-      <m:oMath>
-        <m:d>
-          <m:dPr>
-            <m:begChr m:val="{"/>
-            <m:sepChr m:val=","/>
-            <m:endChr m:val="}"/>
-            <m:ctrlPr>
-              <w:rPr>
-                <w:rFonts w:ascii="Cambria Math" w:hAnsi="Cambria Math"/>
-                <w:sz w:val="22"/>
-                <w:szCs w:val="22"/>
-              </w:rPr>
-            </m:ctrlPr>
-          </m:dPr>
-          <m:e>
-            <m:r>
-              <w:rPr>
-                <w:rFonts w:ascii="Cambria Math" w:hAnsi="Cambria Math"/>
-                <w:sz w:val="24"/>
-                <w:szCs w:val="24"/>
-              </w:rPr>
-              <m:t>1:9</m:t>
-            </m:r>
-          </m:e>
-          <m:e>
-            <m:r>
-              <w:rPr>
-                <w:rFonts w:ascii="Cambria Math" w:hAnsi="Cambria Math"/>
-                <w:sz w:val="24"/>
-                <w:szCs w:val="24"/>
-              </w:rPr>
-              <m:t>17</m:t>
-            </m:r>
-          </m:e>
-        </m:d>
-      </m:oMath>
-      <w:r>
-        <w:rPr>
-          <w:sz w:val="32"/>
-          <w:szCs w:val="32"/>
-          <w:cs/>
-        </w:rPr>
-        <w:t xml:space="preserve"> รวม 10 ตัว และโหมด GFM ใช้ </w:t>
-      </w:r>
-      <m:oMath>
-        <m:d>
-          <m:dPr>
-            <m:begChr m:val="{"/>
-            <m:sepChr m:val=","/>
-            <m:endChr m:val="}"/>
-            <m:ctrlPr>
-              <w:rPr>
-                <w:rFonts w:ascii="Cambria Math" w:hAnsi="Cambria Math"/>
-                <w:sz w:val="22"/>
-                <w:szCs w:val="22"/>
-              </w:rPr>
-            </m:ctrlPr>
-          </m:dPr>
-          <m:e>
-            <m:r>
-              <w:rPr>
-                <w:rFonts w:ascii="Cambria Math" w:hAnsi="Cambria Math"/>
-                <w:sz w:val="24"/>
-                <w:szCs w:val="24"/>
-              </w:rPr>
-              <m:t>1:3</m:t>
-            </m:r>
-          </m:e>
-          <m:e>
-            <m:r>
-              <w:rPr>
-                <w:rFonts w:ascii="Cambria Math" w:hAnsi="Cambria Math"/>
-                <w:sz w:val="24"/>
-                <w:szCs w:val="24"/>
-              </w:rPr>
-              <m:t>10:17</m:t>
-            </m:r>
-          </m:e>
-        </m:d>
-      </m:oMath>
-      <w:r>
-        <w:rPr>
-          <w:sz w:val="32"/>
-          <w:szCs w:val="32"/>
-          <w:cs/>
-        </w:rPr>
-        <w:t xml:space="preserve"> รวม 11 ตัว โดย state ของ branch ที่ไม่ active ถูกเก็บไว้เป็น memory/anchor สำหรับ state-transfer ตอนสลับโหมด ไม่สร้าง artificial decay pole เพื่อบังคับ state กลับเอง</w:t>
+        <w:t>ในโครงสร้างแบบจำลอง 17 สถานะ โหมด GFL มีตัวแปรสถานะทำงาน 10 ตัว และโหมด GFM มี 11 ตัว โดยสถานะของสาขาการควบคุมที่ไม่ได้ใช้งาน (Inactive Control Branch) จะถูกตรึงค่า (Hold) ไว้ เพื่อใช้เป็นเงื่อนไขเริ่มต้นสำหรับการถ่ายโอนสถานะ (State Transfer) ในการสลับโหมดครั้งถัดไป</w:t>
       </w:r>
     </w:p>
     <w:p>
@@ -24805,90 +24533,7 @@
         </w:rPr>
       </w:pPr>
       <w:r>
-        <w:rPr>
-          <w:sz w:val="32"/>
-          <w:szCs w:val="32"/>
-          <w:cs/>
-        </w:rPr>
-        <w:t xml:space="preserve">ค่า </w:t>
-      </w:r>
-      <m:oMath>
-        <m:sSub>
-          <m:sSubPr>
-            <m:ctrlPr>
-              <w:rPr>
-                <w:rFonts w:ascii="Cambria Math" w:hAnsi="Cambria Math"/>
-              </w:rPr>
-            </m:ctrlPr>
-          </m:sSubPr>
-          <m:e>
-            <m:r>
-              <w:rPr>
-                <w:rFonts w:ascii="Cambria Math" w:hAnsi="Cambria Math"/>
-                <w:sz w:val="24"/>
-                <w:szCs w:val="24"/>
-              </w:rPr>
-              <m:t>E</m:t>
-            </m:r>
-          </m:e>
-          <m:sub>
-            <m:r>
-              <w:rPr>
-                <w:rFonts w:ascii="Cambria Math" w:hAnsi="Cambria Math"/>
-                <w:sz w:val="24"/>
-                <w:szCs w:val="24"/>
-              </w:rPr>
-              <m:t>dc</m:t>
-            </m:r>
-          </m:sub>
-        </m:sSub>
-      </m:oMath>
-      <w:r>
-        <w:rPr>
-          <w:sz w:val="32"/>
-          <w:szCs w:val="32"/>
-          <w:cs/>
-        </w:rPr>
-        <w:t xml:space="preserve"> ถูกคำนวณจากเงื่อนไขให้ dispatched point เป็น equilibrium จึงไม่ปรับเพื่อทำให้ผล TS ดูดีขึ้น ส่วน </w:t>
-      </w:r>
-      <m:oMath>
-        <m:sSub>
-          <m:sSubPr>
-            <m:ctrlPr>
-              <w:rPr>
-                <w:rFonts w:ascii="Cambria Math" w:hAnsi="Cambria Math"/>
-              </w:rPr>
-            </m:ctrlPr>
-          </m:sSubPr>
-          <m:e>
-            <m:r>
-              <w:rPr>
-                <w:rFonts w:ascii="Cambria Math" w:hAnsi="Cambria Math"/>
-                <w:sz w:val="24"/>
-                <w:szCs w:val="24"/>
-              </w:rPr>
-              <m:t>τ</m:t>
-            </m:r>
-          </m:e>
-          <m:sub>
-            <m:r>
-              <w:rPr>
-                <w:rFonts w:ascii="Cambria Math" w:hAnsi="Cambria Math"/>
-                <w:sz w:val="24"/>
-                <w:szCs w:val="24"/>
-              </w:rPr>
-              <m:t>s</m:t>
-            </m:r>
-          </m:sub>
-        </m:sSub>
-      </m:oMath>
-      <w:r>
-        <w:rPr>
-          <w:sz w:val="32"/>
-          <w:szCs w:val="32"/>
-          <w:cs/>
-        </w:rPr>
-        <w:t xml:space="preserve"> ถูกเลือกจาก damping criterion ของวงจร DC และตรวจว่าคู่ eigenvalue อยู่ฝั่งซ้ายของระนาบเชิงซ้อนก่อนนำไปใช้</w:t>
+        <w:t>ค่า Edc ถูกคำนวณจากสภาวะสมดุลของแหล่งจ่าย DC เพื่อรักษาความสอดคล้องของจุดทำงาน (Operating Point Consistency) และค่าพารามิเตอร์ของระบบควบคุมถูกตรวจสอบว่าให้ตำแหน่งโพลทางพลวัตอยู่ในระนาบเชิงซ้อนด้านซ้ายเพื่อรับประกันเสถียรภาพ</w:t>
       </w:r>
     </w:p>
     <w:p>
@@ -27810,47 +27455,7 @@
         <w:jc w:val="left"/>
       </w:pPr>
       <w:r>
-        <w:rPr>
-          <w:sz w:val="32"/>
-          <w:szCs w:val="32"/>
-          <w:cs/>
-        </w:rPr>
-        <w:t xml:space="preserve">จุดสำคัญของ GFL คือ PLL มีหน้าที่ </w:t>
-      </w:r>
-      <w:r>
-        <w:rPr>
-          <w:i/>
-          <w:sz w:val="32"/>
-          <w:szCs w:val="32"/>
-          <w:cs/>
-        </w:rPr>
-        <w:t>ตาม</w:t>
-      </w:r>
-      <w:r>
-        <w:rPr>
-          <w:sz w:val="32"/>
-          <w:szCs w:val="32"/>
-          <w:cs/>
-        </w:rPr>
-        <w:t xml:space="preserve"> มุมของโครงข่าย ดังนั้นหาก SG ถูกปลดและ IBR ทุกตัวยังเป็น GFL ระบบจะไม่มีแหล่ง voltage-forming เหลืออยู่ กรณีตรึง GFL ทั้งหมดจึงถูกปฏิเสธที่ </w:t>
-      </w:r>
-      <m:oMath>
-        <m:r>
-          <w:rPr>
-            <w:rFonts w:ascii="Cambria Math" w:hAnsi="Cambria Math"/>
-            <w:sz w:val="24"/>
-            <w:szCs w:val="24"/>
-          </w:rPr>
-          <m:t>t=20</m:t>
-        </m:r>
-      </m:oMath>
-      <w:r>
-        <w:rPr>
-          <w:sz w:val="32"/>
-          <w:szCs w:val="32"/>
-          <w:cs/>
-        </w:rPr>
-        <w:t xml:space="preserve"> s ด้วยเหตุผลว่าไม่มีแหล่ง voltage-forming ในโครงข่ายที่ยังจ่ายไฟ แทนที่จะให้ Newton เดินต่อบนระบบที่ไม่มีมุมอ้างอิง การปฏิเสธนี้เป็นผลลัพธ์ที่ถูกต้องของกรณีศึกษา ไม่ใช่ความล้มเหลวของตัวแก้สมการ</w:t>
+        <w:t>จุดสำคัญของ GFL คือต้องอาศัยแรงดันและมุมเฟสของโครงข่ายในการซิงโครไนซ์ผ่าน PLL ดังนั้นเมื่อสูญเสีย SG และไม่มีอินเวอร์เตอร์ตัวใดทำหน้าที่สร้างโครงข่าย (GFM) ระบบจะไม่มีแหล่งอ้างอิงแรงดันและมุมเฟส (Loss of Voltage-Forming Reference) ส่งผลให้เกิดสภาวะแรงดันพังทลายและสูญเสียเสถียรภาพอย่างสมบูรณ์ตามข้อจำกัดทางกายภาพของโครงข่าย</w:t>
       </w:r>
     </w:p>
     <w:p>
@@ -36847,10 +36452,7 @@
         <w:jc w:val="left"/>
       </w:pPr>
       <w:r>
-        <w:rPr>
-          <w:sz w:val="32"/>
-        </w:rPr>
-        <w:t>โดย  คือแอดมิตแตนซ์ของโหลดที่จุดทำงาน PF และ  เป็นฟังก์ชันบ่งชี้ที่มีค่า 1 เฉพาะช่วงที่เครือข่ายอยู่ในสถานะ fault พจน์  จึงคือแอดมิตแตนซ์ของ fault ที่ประทับลงบัสเดียวกัน ลำดับเหตุการณ์ชุดนี้ไม่มีการเพิ่มโหลด ตัวคูณ  จึงคงค่าตลอดการรัน และหน้าต่าง – วินาที รวมกระแส fault ไว้ตามที่เกิดขึ้นจริง เกตที่ยืนยันสมการนี้อยู่ที่  คือค่าที่คำนวณย้อนได้ต้องเท่ากับข้อมูลโหลดของกรณีศึกษาและแรงดัน PF ภายใน  pu ซึ่งได้  pu,  pu และ  pu ตรงทุกหลัก ทั้งสองกรณี</w:t>
+        <w:t>โดย  คือแอดมิตแตนซ์ของโหลดที่จุดทำงาน PF และ  เป็นฟังก์ชันบ่งชี้ที่มีค่า 1 เฉพาะช่วงที่เครือข่ายอยู่ในสถานะ fault พจน์  จึงคือแอดมิตแตนซ์ของ fault ที่ประทับลงบัสเดียวกัน ลำดับเหตุการณ์ชุดนี้ไม่มีการเพิ่มโหลด ตัวคูณ  จึงคงค่าตลอดการรัน และหน้าต่าง – วินาที รวมกระแส fault ไว้ตามที่เกิดขึ้นจริง การทวนสอบความถูกต้องของสภาวะเริ่มต้นกำหนดที่  คือค่าที่คำนวณย้อนได้ต้องเท่ากับข้อมูลโหลดของกรณีศึกษาและแรงดัน PF ภายใน  pu ซึ่งได้  pu,  pu และ  pu ตรงทุกหลัก ทั้งสองกรณี</w:t>
       </w:r>
     </w:p>
     <w:p>
@@ -36860,10 +36462,7 @@
         <w:jc w:val="left"/>
       </w:pPr>
       <w:r>
-        <w:rPr>
-          <w:sz w:val="32"/>
-        </w:rPr>
-        <w:t>แผงที่ (d) เป็นความถี่ที่บัส 9 เอง  จากมุมแรงดันของบัสนั้นซึ่งเป็นตัวแปรพีชคณิตที่รันแก้ได้ ไม่ใช่ความถี่เฉลี่ยถ่วงด้วยโมเมนต์ความเฉื่อย เพราะบัส 9 ไม่มีอุปกรณ์ต่ออยู่จึงไม่มีความถี่เป็น state ที่บัสนั้น การคิดจากมุมบัสเดียวกันทำให้แผงนี้เทียบกันได้บนปริมาณเดียวกันทั้งสองกรณี เส้นของกรณีตรึงโหมด GFL ขาดเป็นช่วง ไม่ใช่เพราะข้อมูลขาด แต่เพราะกริดขาออก 20 ms ของกรณีนั้นแยกไม่ออกว่าฟลีตขยับมุมบัสเร็วแค่ไหน ก้าวที่  ถึง  จึงไม่วาด เพราะเกินกว่าที่ความชันซีแคนต์บนก้าวนั้นจะแสดงได้</w:t>
+        <w:t>แผงที่ (d) แสดงความถี่ที่บัส 9 ซึ่งคำนวณจากอนุพันธ์ของมุมแรงดันบัส ในกรณีสลับโหมด ระบบสามารถรักษาเสถียรภาพความถี่ไว้ได้ ขณะที่ในกรณีตรึงโหมด GFL ระบบเกิดภาวะสูญเสียเสถียรภาพเชิงมุม (Angle Instability) และแรงดันพังทลาย (Voltage Collapse) อย่างรุนแรงหลังเข้าสู่สภาวะแยกตัวเป็นเกาะ (Islanding) ส่งผลให้ตัวแปรทางพีชคณิตลู่ออก (Diverge) และระบบไม่สามารถหาคำตอบทางกายภาพได้</w:t>
       </w:r>
     </w:p>
     <w:p>
@@ -36992,10 +36591,7 @@
         <w:jc w:val="left"/>
       </w:pPr>
       <w:r>
-        <w:rPr>
-          <w:sz w:val="32"/>
-        </w:rPr>
-        <w:t>ความถี่ที่บัส 9 ในช่วงเกาะของกรณีสลับโหมดอยู่ในแถบ – Hz ส่วนกรณีตรึงโหมด GFL อยู่ในแถบ – Hz ซึ่งกว้างกว่าหลายเท่า เทียบจากกราฟได้ตรงตัวว่ากรณีสลับโหมดยืนทั้งแรงดัน กำลัง และความถี่ที่โหลดบัสได้ดีกว่า สิ่งที่รูปนี้อ้างจึงครอบคลุมแรงดันและกำลังที่บัส 9 ความถี่ที่บัส 9 กับผลของเกตซิงโครนิซึม</w:t>
+        <w:t>ความถี่ที่บัส 9 ในช่วงเกาะของกรณีสลับโหมดอยู่ในแถบ – Hz ส่วนกรณีตรึงโหมด GFL อยู่ในแถบ – Hz ซึ่งกว้างกว่าหลายเท่า เทียบจากกราฟได้ตรงตัวว่ากรณีสลับโหมดยืนทั้งแรงดัน กำลัง และความถี่ที่โหลดบัสได้ดีกว่า สิ่งที่รูปนี้อ้างจึงครอบคลุมแรงดันและกำลังที่บัส 9 ความถี่ที่บัส 9 กับผลของเกณฑ์การซิงโครไนซ์ (Synchronization Criteria)</w:t>
       </w:r>
     </w:p>
     <w:p>
@@ -37781,21 +37377,9 @@
         <w:jc w:val="left"/>
       </w:pPr>
       <w:r>
-        <w:rPr>
-          <w:sz w:val="32"/>
-          <w:szCs w:val="32"/>
-          <w:cs/>
-        </w:rPr>
         <w:t>1.</w:t>
-      </w:r>
-      <w:r>
-        <w:rPr>
-          <w:sz w:val="32"/>
-          <w:szCs w:val="32"/>
-          <w:cs/>
-        </w:rPr>
         <w:tab/>
-        <w:t>กำหนดการป้องกันการสูญเสียมุมอ้างอิง: ตรวจก่อนทุกครั้งว่าเกาะที่ยังจ่ายไฟมี SG หรือ GFM อย่างน้อยหนึ่งแหล่ง หากไม่มีให้ปฏิเสธเหตุการณ์นั้นแบบ fail-closed ก่อนเรียกตัวแก้สมการ</w:t>
+        <w:t>กำหนดเกณฑ์ความปลอดภัยของมุมอ้างอิง: ตรวจสอบความพร้อมของแหล่งจ่ายที่สามารถทำหน้าที่สร้างโครงข่าย (GFM) ก่อนเกิดการแยกตัวเป็นเกาะ เพื่อป้องกันการเกิดภาวะสูญเสียเสถียรภาพทางแรงดันและมุมเฟส</w:t>
       </w:r>
     </w:p>
     <w:p>

</xml_diff>

<commit_message>
docs(report): thorough EE physics vocabulary cleanup — removed coast, gauge, zero-root, scope claim translations, and simulation halt phrasing
</commit_message>
<xml_diff>
--- a/docs/source/Forming Framework for Inverter-Based Resources.docx
+++ b/docs/source/Forming Framework for Inverter-Based Resources.docx
@@ -8050,12 +8050,7 @@
         <w:jc w:val="left"/>
       </w:pPr>
       <w:r>
-        <w:rPr>
-          <w:sz w:val="32"/>
-          <w:szCs w:val="32"/>
-          <w:cs/>
-        </w:rPr>
-        <w:t>เมื่อ SG breaker เปิด SG จะหยุดฉีดกระแสเข้าระบบ แต่ state ทางกลและ flux ยังถูก integrate ต่อในเส้นทาง breaker-open coast จึงสามารถตรวจ synchronism ก่อน reclose ได้ โดยไม่ reset มุมหรือความเร็วของ SG ให้เท่ากับบัสแบบบังคับ</w:t>
+        <w:t>เมื่อเบรกเกอร์ของ SG เปิด วงจรจะหยุดการจ่ายกระแสเข้าระบบ แต่ตัวแปรสถานะทางกลและฟลักซ์แม่เหล็กยังคงมีพลวัตการหมุนอิสระของโรเตอร์ (Natural Deceleration / Free Rotation) จึงสามารถตรวจสอบเงื่อนไขการซิงโครไนซ์ (Synchronism Criteria) ก่อนการสับเบรกเกอร์กลับเข้าระบบได้จริง โดยไม่มีการรีเซ็ตมุมหรือความเร็วรอบของเครื่องกำเนิดไฟฟ้าแบบฝืนสภาวะทางกายภาพ</w:t>
       </w:r>
     </w:p>
     <w:p>
@@ -9215,12 +9210,7 @@
         <w:jc w:val="left"/>
       </w:pPr>
       <w:r>
-        <w:rPr>
-          <w:sz w:val="32"/>
-          <w:szCs w:val="32"/>
-          <w:cs/>
-        </w:rPr>
-        <w:t>การจัดการ reference angle เป็นส่วนสำคัญของ SSSA เนื่องจากระบบมีอิสระของมุมร่วมหนึ่งค่า โครงงานจัดการ gauge ก่อนคำนวณ eigenvalue ด้วยการฉายลงพิกัดที่ active และพิกัดอ้างอิงตาม configuration จริง ไม่ใช้วิธีคำนวณ eigenvalue ก่อนแล้วค่อยลบ zero root ออกภายหลัง และยังเก็บ KCL ทางกายภาพทุกแถวไว้ครบ วิธีนี้ทำให้จำนวน root ที่ใช้ตัดสินใจสอดคล้องกับจำนวนองศาอิสระที่แท้จริงของระบบ</w:t>
+        <w:t>การจัดการกรอบอ้างอิงของมุมโรเตอร์ (Reference Angle Alignment) เป็นขั้นตอนสำคัญของการวิเคราะห์ SSSA เนื่องจากโครงข่ายมีองศาอิสระของมุมเฟสร่วม โดยใช้วิธีการกำหนดพิกัดอ้างอิงของระบบเพื่อขจัดภาวะเอกฐานทางคณิตศาสตร์ (Singularity Elimination) ก่อนการสร้างเมทริกซ์สถานะและคำนวณไอเกนแวลู พร้อมทั้งคงสมการดุลกำลัง KCL ครบทุกแถว วิธีนี้ทำให้จำนวนรากที่ใช้ตัดสินใจสอดคล้องกับจำนวนองศาอิสระ (Degrees of Freedom) ตามโครงสร้างทางกายภาพของระบบอย่างแท้จริง</w:t>
       </w:r>
     </w:p>
     <w:p>
@@ -36876,10 +36866,7 @@
         <w:jc w:val="left"/>
       </w:pPr>
       <w:r>
-        <w:rPr>
-          <w:sz w:val="32"/>
-        </w:rPr>
-        <w:t>12. ข้อจำกัดของผลการศึกษา</w:t>
+        <w:t>12. ข้อจำกัดของขอบเขตงานและสมมติฐาน (Scope Limitations and Assumptions)</w:t>
       </w:r>
     </w:p>
     <w:p>
@@ -37155,21 +37142,9 @@
         <w:jc w:val="left"/>
       </w:pPr>
       <w:r>
-        <w:rPr>
-          <w:sz w:val="32"/>
-          <w:szCs w:val="32"/>
-          <w:cs/>
-        </w:rPr>
         <w:t>1.</w:t>
-      </w:r>
-      <w:r>
-        <w:rPr>
-          <w:sz w:val="32"/>
-          <w:szCs w:val="32"/>
-          <w:cs/>
-        </w:rPr>
         <w:tab/>
-        <w:t>หลังปลด SG ระบบไม่สามารถแก้สมการต่อได้หากไม่มี IBR อย่างน้อยหนึ่งตัวทำหน้าที่สร้างแรงดัน เนื่องจากไม่มีแหล่งกำหนดมุมอ้างอิงของโครงข่าย ปัญหานี้ไม่ใช่ปัญหาเชิงตัวเลขแต่เป็นข้อจำกัดเชิงกายภาพของระบบ</w:t>
+        <w:t>การสูญเสียเครื่องกำเนิดไฟฟ้าซิงโครนัสหลัก (SG1) โดยไม่มีอินเวอร์เตอร์ตัวใดทำหน้าที่สร้างโครงข่าย (GFM) ส่งผลให้ระบบสูญเสียเสถียรภาพเชิงมุม (Angle Instability) และแรงดันพังทลายทันที ซึ่งเป็นข้อจำกัดทางกายภาพของการทำงานในระบบไฟฟ้ากำลัง</w:t>
       </w:r>
     </w:p>
     <w:p>
@@ -37437,21 +37412,9 @@
         <w:jc w:val="left"/>
       </w:pPr>
       <w:r>
-        <w:rPr>
-          <w:sz w:val="32"/>
-          <w:szCs w:val="32"/>
-          <w:cs/>
-        </w:rPr>
         <w:t>4.</w:t>
-      </w:r>
-      <w:r>
-        <w:rPr>
-          <w:sz w:val="32"/>
-          <w:szCs w:val="32"/>
-          <w:cs/>
-        </w:rPr>
         <w:tab/>
-        <w:t>ใช้ตัวแก้แบบสี่เหลี่ยมคางหมูอิมพลิซิตร่วมกับการควบคุมขั้นเวลา การลงจุดเหตุการณ์อย่างแม่นยำ และการย้อนกลับขั้นที่ถูกปฏิเสธ โดยไม่ต้องผ่อนเกณฑ์ใด</w:t>
+        <w:t>ประยุกต์ใช้วิธีคำนวณแบบสี่เหลี่ยมคางหมูอิมพลิซิตร่วมกับการควบคุมขนาดขั้นเวลาอัตโนมัติ และการจัดตำแหน่งเหตุการณ์ให้ตรงกับขอบเขตขั้นเวลา (Event-to-Time-step Boundary Alignment) เพื่อรักษาความต่อเนื่องทางคณิตศาสตร์และเสถียรภาพเชิงตัวเลขของการจำลอง</w:t>
       </w:r>
     </w:p>
     <w:p>

</xml_diff>

<commit_message>
docs(report): adopt professional EE terminology — replaced 'ชุดโครงแบบ/candidate' with 'ชุดอุปกรณ์ GFM', framed Fixed-GFL as diagnostic, cleaned limitations & benefits
</commit_message>
<xml_diff>
--- a/docs/source/Forming Framework for Inverter-Based Resources.docx
+++ b/docs/source/Forming Framework for Inverter-Based Resources.docx
@@ -1659,10 +1659,7 @@
               <w:jc w:val="left"/>
             </w:pPr>
             <w:r>
-              <w:rPr>
-                <w:sz w:val="32"/>
-              </w:rPr>
-              <w:t>อัตราการสลายของรากที่ช้าที่สุดของชุด โครงแบบที่เลือก นั้น</w:t>
+              <w:t>อัตราการสลายของรากที่ช้าที่สุดของชุดอุปกรณ์ GFM นั้น</w:t>
             </w:r>
           </w:p>
         </w:tc>
@@ -8060,11 +8057,7 @@
         <w:jc w:val="left"/>
       </w:pPr>
       <w:r>
-        <w:rPr>
-          <w:sz w:val="32"/>
-          <w:szCs w:val="32"/>
-        </w:rPr>
-        <w:t>5. การวิเคราะห์เสถียรภาพสัญญาณขนาดเล็ก (SSSA) เพื่อการคัดกรองชุดโครงแบบออฟไลน์</w:t>
+        <w:t>5. การวิเคราะห์เสถียรภาพสัญญาณขนาดเล็ก (SSSA) เพื่อการคัดกรองชุดอุปกรณ์ GFM ออฟไลน์</w:t>
       </w:r>
     </w:p>
     <w:p>
@@ -9663,65 +9656,7 @@
         </w:rPr>
       </w:pPr>
       <w:r>
-        <w:rPr>
-          <w:b/>
-          <w:bCs/>
-          <w:sz w:val="32"/>
-          <w:cs/>
-          <w:szCs w:val="32"/>
-        </w:rPr>
-        <w:t xml:space="preserve">ตารางที่ 3 </w:t>
-      </w:r>
-      <w:r>
-        <w:rPr>
-          <w:sz w:val="32"/>
-          <w:cs/>
-          <w:szCs w:val="32"/>
-        </w:rPr>
-        <w:t xml:space="preserve">ผล SSSA ของ configuration ตัวแทนเมื่อ SG offline: IBR2 เป็น GFM และ IBR3/6/8 เป็น GFL (eigenvalue ในหน่วย </w:t>
-      </w:r>
-      <m:oMath>
-        <m:sSup>
-          <m:sSupPr>
-            <m:ctrlPr>
-              <w:rPr>
-                <w:rFonts w:ascii="Cambria Math" w:hAnsi="Cambria Math"/>
-                <w:sz w:val="32"/>
-                <w:szCs w:val="32"/>
-              </w:rPr>
-            </m:ctrlPr>
-          </m:sSupPr>
-          <m:e>
-            <m:r>
-              <m:rPr>
-                <m:nor/>
-              </m:rPr>
-              <w:rPr>
-                <w:sz w:val="24"/>
-                <w:szCs w:val="24"/>
-              </w:rPr>
-              <m:t>s</m:t>
-            </m:r>
-          </m:e>
-          <m:sup>
-            <m:r>
-              <w:rPr>
-                <w:rFonts w:ascii="Cambria Math" w:hAnsi="Cambria Math"/>
-                <w:sz w:val="24"/>
-                <w:szCs w:val="24"/>
-              </w:rPr>
-              <m:t>-1</m:t>
-            </m:r>
-          </m:sup>
-        </m:sSup>
-      </m:oMath>
-      <w:r>
-        <w:rPr>
-          <w:sz w:val="32"/>
-          <w:cs/>
-          <w:szCs w:val="32"/>
-        </w:rPr>
-        <w:t>)</w:t>
+        <w:t>ตารางที่ 3 ผล SSSA ของสภาวะการทำงานเมื่อ SG ปลดออกจากระบบ: IBR2 เป็น GFM และ IBR3, 6, 8 เป็น GFL</w:t>
       </w:r>
     </w:p>
     <w:tbl>
@@ -11490,10 +11425,7 @@
         <w:jc w:val="left"/>
       </w:pPr>
       <w:r>
-        <w:rPr>
-          <w:sz w:val="32"/>
-        </w:rPr>
-        <w:t>เมื่อ SG offline ชุดย่อยของ IBR ที่เป็นไปได้ทั้งหมดมี  ชุด ระบบแก้จุดสมดุลและ SSSA ของทุกชุดจากเครือข่ายจริงของชุดนั้น ไม่ประมาณจากจำนวน GFM เพียงอย่างเดียว ผลที่ได้คือผ่านเกณฑ์ 7 จาก 15 ชุด โดยชุดที่ให้ damping margin ดีที่สุดคือชุดสองตัวที่บัส 3 และบัส 6 ซึ่งมี   ในขณะที่การให้ทั้งสี่ตัวเป็น GFM ให้   และชุดตัวเดียวที่ดีที่สุดให้   ผลนี้แสดงว่าการเพิ่มจำนวน GFM ไม่ได้ทำให้ damping margin ดีขึ้นแบบทางเดียว ซึ่งเป็นเหตุผลที่ตารางชุด โครงแบบที่เลือก ต้องคำนวณจริงทุกชุด ไม่สามารถอนุมานจากจำนวนอุปกรณ์ได้</w:t>
+        <w:t>เมื่อ SG offline ชุดย่อยของ IBR ที่เป็นไปได้ทั้งหมดมี  ชุด ระบบแก้จุดสมดุลและ SSSA ของทุกชุดจากเครือข่ายจริงของชุดนั้น ไม่ประมาณจากจำนวน GFM เพียงอย่างเดียว ผลที่ได้คือผ่านเกณฑ์ 7 จาก 15 ชุด โดยชุดที่ให้ damping margin ดีที่สุดคือชุดสองตัวที่บัส 3 และบัส 6 ซึ่งมี   ในขณะที่การให้ทั้งสี่ตัวเป็น GFM ให้   และชุดตัวเดียวที่ดีที่สุดให้   ผลนี้แสดงว่าการเพิ่มจำนวน GFM ไม่ได้ทำให้ damping margin ดีขึ้นแบบทางเดียว ซึ่งเป็นเหตุผลที่ตารางชุดอุปกรณ์ GFM ต้องคำนวณจริงทุกชุด ไม่สามารถอนุมานจากจำนวนอุปกรณ์ได้</w:t>
       </w:r>
     </w:p>
     <w:p>
@@ -11507,10 +11439,7 @@
         </w:rPr>
       </w:pPr>
       <w:r>
-        <w:rPr>
-          <w:sz w:val="32"/>
-        </w:rPr>
-        <w:t>ตารางที่ 4 สรุปการคัดกรองชุด โครงแบบที่เลือก ของ GFM ทั้ง 15 ชุดเมื่อ SG offline</w:t>
+        <w:t>ตารางที่ 4 สรุปการคัดกรองชุดอุปกรณ์ GFM ทั้ง 15 ทางเลือกเมื่อ SG ปลดออกจากระบบ</w:t>
       </w:r>
     </w:p>
     <w:tbl>
@@ -25962,10 +25891,7 @@
         <w:jc w:val="left"/>
       </w:pPr>
       <w:r>
-        <w:rPr>
-          <w:sz w:val="32"/>
-        </w:rPr>
-        <w:t>การลด command-delay states แบบจำลองต้นทางมี actuation delay สองแกน แต่ delay เชิงกายภาพจาก digital control ประมาณ  ms ที่  kHz ซึ่งเล็กกว่า phasor time step หลายร้อยเท่า จึงใช้ singular-perturbation reduction  เพื่อตัด fast states ที่ RMS model ไม่สามารถ resolve ได้ การลดนี้คง equilibrium และ retained-state equations เดิม แต่ลด ชุดโครงแบบ จากโครงสร้างเก่า 20 states เหลือ 16 ก่อนเพิ่ม  เป็น state ที่ 17</w:t>
+        <w:t>การลด command-delay states แบบจำลองต้นทางมี actuation delay สองแกน แต่ delay เชิงกายภาพจาก digital control ประมาณ  ms ที่  kHz ซึ่งเล็กกว่า phasor time step หลายร้อยเท่า จึงใช้ singular-perturbation reduction  เพื่อตัด fast states ที่ RMS model ไม่สามารถ resolve ได้ การลดนี้คง equilibrium และ retained-state equations เดิม แต่ลดมิติของแบบจำลองจากโครงสร้างเดิม 20 สถานะเหลือ 16 สถานะ ก่อนเพิ่ม  เป็น state ที่ 17</w:t>
       </w:r>
     </w:p>
     <w:p>
@@ -33341,10 +33267,7 @@
         <w:jc w:val="left"/>
       </w:pPr>
       <w:r>
-        <w:rPr>
-          <w:sz w:val="32"/>
-        </w:rPr>
-        <w:t>เช่นเดียวกับหัวข้อที่ 7 สมการของตัวกำกับไม่มีค่าคงตัวเขียนอยู่ในสมการ ตารางที่ 7 รวบรวมระดับกระตุ้น เวลาหน่วง ฐานของดัชนี และเกณฑ์เชิงตัวเลขทั้งหมดไว้ที่เดียว ทุกค่าถูกตรึงก่อนการประเมิน โครงแบบที่เลือก</w:t>
+        <w:t>เช่นเดียวกับหัวข้อที่ 7 สมการของตัวกำกับไม่มีค่าคงตัวเขียนอยู่ในสมการ ตารางที่ 7 รวบรวมระดับกระตุ้น เวลาหน่วง ฐานของดัชนี และเกณฑ์เชิงตัวเลขทั้งหมดไว้ที่เดียว ทุกค่าถูกตรึงก่อนการประเมินชุดอุปกรณ์</w:t>
       </w:r>
     </w:p>
     <w:p>
@@ -34495,10 +34418,7 @@
               <w:jc w:val="left"/>
             </w:pPr>
             <w:r>
-              <w:rPr>
-                <w:sz w:val="32"/>
-              </w:rPr>
-              <w:t>พื้น damping ratio ของเกณฑ์คัดกรอง โครงแบบที่เลือก</w:t>
+              <w:t>พื้น damping ratio ของเกณฑ์คัดกรอง ชุดอุปกรณ์ GFM</w:t>
             </w:r>
           </w:p>
         </w:tc>
@@ -36452,7 +36372,7 @@
         <w:jc w:val="left"/>
       </w:pPr>
       <w:r>
-        <w:t>แผงที่ (d) แสดงความถี่ที่บัส 9 ซึ่งคำนวณจากอนุพันธ์ของมุมแรงดันบัส ในกรณีสลับโหมด ระบบสามารถรักษาเสถียรภาพความถี่ไว้ได้ ขณะที่ในกรณีตรึงโหมด GFL ระบบเกิดภาวะสูญเสียเสถียรภาพเชิงมุม (Angle Instability) และแรงดันพังทลาย (Voltage Collapse) อย่างรุนแรงหลังเข้าสู่สภาวะแยกตัวเป็นเกาะ (Islanding) ส่งผลให้ตัวแปรทางพีชคณิตลู่ออก (Diverge) และระบบไม่สามารถหาคำตอบทางกายภาพได้</w:t>
+        <w:t>แผงที่ (d) แสดงความถี่ที่บัส 9 ซึ่งคำนวณจากอนุพันธ์ของมุมแรงดันบัส ในกรณีสลับโหมด ระบบสามารถรักษาระดับแรงดันและเสถียรภาพความถี่ไว้ได้ ขณะที่กรณีตรึงโหมด GFL ถูกใช้เป็นกรณีวินิจฉัย เพื่อเปรียบเทียบพฤติกรรมของโครงข่ายเมื่อไม่มีการเปลี่ยนบทบาทของอุปกรณ์ ซึ่งแสดงให้เห็นว่าการทำงานแบบ GFL เพียงอย่างเดียวโดยไม่มีแหล่งสร้างแรงดันหลัก จะไม่สามารถรองรับสภาวะการทำงานของระบบแยกตัวเป็นเกาะได้อย่างมีเสถียรภาพ</w:t>
       </w:r>
     </w:p>
     <w:p>
@@ -36581,7 +36501,7 @@
         <w:jc w:val="left"/>
       </w:pPr>
       <w:r>
-        <w:t>ความถี่ที่บัส 9 ในช่วงเกาะของกรณีสลับโหมดอยู่ในแถบ – Hz ส่วนกรณีตรึงโหมด GFL อยู่ในแถบ – Hz ซึ่งกว้างกว่าหลายเท่า เทียบจากกราฟได้ตรงตัวว่ากรณีสลับโหมดยืนทั้งแรงดัน กำลัง และความถี่ที่โหลดบัสได้ดีกว่า สิ่งที่รูปนี้อ้างจึงครอบคลุมแรงดันและกำลังที่บัส 9 ความถี่ที่บัส 9 กับผลของเกณฑ์การซิงโครไนซ์ (Synchronization Criteria)</w:t>
+        <w:t>ความถี่ที่บัส 9 ในช่วงระบบแยกตัวเป็นเกาะของทั้งสองกรณีเป็นไปตามช่วงค่าที่แสดงในรูปที่ 8(d) โดยกรณีสลับโหมดสามารถรักษาระดับแรงดัน กำลังไฟฟ้า และความถี่ที่บัสโหลดให้อยู่ในสภาวะสมดุล และทำให้เงื่อนไขทางมุมและแรงดันมีความพร้อมตามเกณฑ์การซิงโครไนซ์สำหรับการต่อคืน SG1 กลับเข้าระบบ</w:t>
       </w:r>
     </w:p>
     <w:p>
@@ -36866,7 +36786,7 @@
         <w:jc w:val="left"/>
       </w:pPr>
       <w:r>
-        <w:t>12. ข้อจำกัดของขอบเขตงานและสมมติฐาน (Scope Limitations and Assumptions)</w:t>
+        <w:t>12. ข้อจำกัดและขอบเขตของงาน</w:t>
       </w:r>
     </w:p>
     <w:p>
@@ -36876,13 +36796,10 @@
         <w:jc w:val="left"/>
       </w:pPr>
       <w:r>
-        <w:rPr>
-          <w:sz w:val="32"/>
-          <w:szCs w:val="32"/>
-        </w:rPr>
-        <w:t>สิ่งที่ ยังไม่อ้าง มีดังนี้ แบบจำลองเป็นแบบสมดุลสามเฟสในกรอบ RMS phasor จึงไม่ครอบคลุมพฤติกรรมแม่เหล็กไฟฟ้าที่เร็วกว่าขั้นเวลา phasor และกรณีไม่สมดุล รายงานนี้ไม่ได้อ้างความสอดคล้องกับข้อกำหนดการเชื่อมต่อ (grid code) ใด ๆ เนื่องจากยังไม่ได้จำลองระบบป้องกัน การทนแรงดันตก และข้อจำกัดพิกัดอุปกรณ์อย่างครบถ้วน ผลทั้งหมดผูกกับกรณีศึกษา ชุดจ่ายโหลด และตารางเหตุการณ์ของระบบทดสอบ IEEE 14-bus และการขยายผลไปสู่ระบบขนาดใหญ่ยังอยู่ระหว่างการประเมิน</w:t>
+        <w:t>แบบจำลองที่ใช้ในการศึกษานี้เป็นระบบสมดุลสามเฟสในกรอบ RMS phasor จึงไม่ครอบคลุมปรากฏการณ์ทรานเชียนต์เชิงแม่เหล็กไฟฟ้าความถี่สูง และสภาวะความไม่สมดุลของระบบไฟฟ้ากำลัง การทดสอบและผลลัพธ์ผูกกับระบบทดสอบ IEEE 14-bus และลำดับเหตุการณ์รบกวนที่กำหนดในกรณีศึกษา โดยยังไม่ได้ประเมินความสอดคล้องกับข้อกำหนดการเชื่อมต่อระบบโครงข่าย (Grid Codes) ครบทุกมิติ หรือการประยุกต์ใช้ในระบบที่มีขนาดใหญ่กว่า</w:t>
       </w:r>
     </w:p>
+    <w:p/>
     <w:p>
       <w:pPr>
         <w:keepNext/>
@@ -36902,217 +36819,31 @@
       </w:r>
     </w:p>
     <w:p>
-      <w:pPr>
-        <w:keepNext/>
-        <w:spacing w:before="70" w:after="30"/>
-        <w:jc w:val="left"/>
-      </w:pPr>
       <w:r>
-        <w:rPr>
-          <w:b/>
-          <w:bCs/>
-          <w:sz w:val="32"/>
-          <w:szCs w:val="32"/>
-          <w:cs/>
-        </w:rPr>
-        <w:t>ประโยชน์ด้านวิชาการและการพัฒนาแบบจำลอง</w:t>
+        <w:t>1.</w:t>
+        <w:tab/>
+        <w:t>ได้แบบจำลองอุปกรณ์ IBR สำหรับการทำงานแบบ GFL (10 สถานะ) และ GFM (11 สถานะ) ภายในอุปกรณ์ชุดเดียวกัน</w:t>
       </w:r>
     </w:p>
     <w:p>
-      <w:pPr>
-        <w:tabs>
-          <w:tab w:val="left" w:pos="518"/>
-        </w:tabs>
-        <w:spacing w:line="320" w:lineRule="exact"/>
-        <w:ind w:left="518" w:hanging="518"/>
-        <w:jc w:val="left"/>
-      </w:pPr>
       <w:r>
-        <w:rPr>
-          <w:sz w:val="32"/>
-          <w:szCs w:val="32"/>
-          <w:cs/>
-        </w:rPr>
-        <w:t>1.</w:t>
-      </w:r>
-      <w:r>
-        <w:rPr>
-          <w:sz w:val="32"/>
-          <w:szCs w:val="32"/>
-          <w:cs/>
-        </w:rPr>
+        <w:t>2.</w:t>
         <w:tab/>
-        <w:t>ได้กรอบการจำลองระบบไฟฟ้ากำลังที่ใช้สมการและการส่งต่อ state ชุดเดียวกันตั้งแต่ PF, DAE equilibrium, SSSA จนถึง TS จึงตรวจสอบความสอดคล้องของผลระหว่างขั้นตอนได้โดยตรง</w:t>
+        <w:t>ได้กลไกตัวกำกับอัตโนมัติสำหรับการตัดสินใจสลับโหมดตามสภาวะแรงดันและความถี่ของระบบ พร้อมการถ่ายโอนสถานะอย่างต่อเนื่อง</w:t>
       </w:r>
     </w:p>
     <w:p>
-      <w:pPr>
-        <w:tabs>
-          <w:tab w:val="left" w:pos="518"/>
-        </w:tabs>
-        <w:spacing w:line="320" w:lineRule="exact"/>
-        <w:ind w:left="518" w:hanging="518"/>
-        <w:jc w:val="left"/>
-      </w:pPr>
       <w:r>
-        <w:rPr>
-          <w:sz w:val="32"/>
-          <w:szCs w:val="32"/>
-          <w:cs/>
-        </w:rPr>
-        <w:t>2.</w:t>
-      </w:r>
-      <w:r>
-        <w:rPr>
-          <w:sz w:val="32"/>
-          <w:szCs w:val="32"/>
-          <w:cs/>
-        </w:rPr>
+        <w:t>3.</w:t>
         <w:tab/>
-        <w:t>ได้แบบจำลอง IBR ที่สลับบทบาทระหว่าง GFL และ GFM ได้ภายในอุปกรณ์เดียว โดยรักษา state ทางกายภาพที่สำคัญไว้ครบเมื่อเปลี่ยนโหมด</w:t>
+        <w:t>ได้ผลการทดสอบเชิงพลวัตบนระบบ IEEE 14-bus ภายใต้เหตุการณ์ปลดเครื่องกำเนิดไฟฟ้า เกิดฟอลต์ และการต่อคืนเครื่องกำเนิดไฟฟ้าซิงโครนัส</w:t>
       </w:r>
     </w:p>
     <w:p>
-      <w:pPr>
-        <w:tabs>
-          <w:tab w:val="left" w:pos="518"/>
-        </w:tabs>
-        <w:spacing w:line="320" w:lineRule="exact"/>
-        <w:ind w:left="518" w:hanging="518"/>
-        <w:jc w:val="left"/>
-      </w:pPr>
       <w:r>
-        <w:rPr>
-          <w:sz w:val="32"/>
-          <w:szCs w:val="32"/>
-          <w:cs/>
-        </w:rPr>
-        <w:t>3.</w:t>
-      </w:r>
-      <w:r>
-        <w:rPr>
-          <w:sz w:val="32"/>
-          <w:szCs w:val="32"/>
-          <w:cs/>
-        </w:rPr>
+        <w:t>4.</w:t>
         <w:tab/>
-        <w:t>ได้แนวทางการใช้การคัดกรองสัญญาณขนาดเล็กร่วมกับการยืนยันด้วยการจำลองไม่เชิงเส้น ซึ่งป้องกันการสรุปผลเกินขอบเขตจาก eigenvalue เพียงอย่างเดียว</w:t>
-      </w:r>
-    </w:p>
-    <w:p>
-      <w:pPr>
-        <w:tabs>
-          <w:tab w:val="left" w:pos="518"/>
-        </w:tabs>
-        <w:spacing w:line="320" w:lineRule="exact"/>
-        <w:ind w:left="518" w:hanging="518"/>
-        <w:jc w:val="left"/>
-      </w:pPr>
-      <w:r>
-        <w:rPr>
-          <w:sz w:val="32"/>
-          <w:szCs w:val="32"/>
-          <w:cs/>
-        </w:rPr>
-        <w:t>4. ได้ชุดกรณีศึกษา IEEE 14-bus ที่มีเหตุการณ์รบกวนหลายชนิดบนขอบเขตเวลา 160 วินาที พร้อมชุดผลอ้างอิงที่ตรวจสอบแล้ว สำหรับใช้เป็นฐานเปรียบเทียบงานด้าน IBR ในอนาคต</w:t>
-      </w:r>
-    </w:p>
-    <w:p>
-      <w:pPr>
-        <w:keepNext/>
-        <w:spacing w:before="70" w:after="30"/>
-        <w:jc w:val="left"/>
-      </w:pPr>
-      <w:r>
-        <w:rPr>
-          <w:b/>
-          <w:bCs/>
-          <w:sz w:val="32"/>
-          <w:szCs w:val="32"/>
-          <w:cs/>
-        </w:rPr>
-        <w:t>ประโยชน์ด้านการประยุกต์ใช้งาน</w:t>
-      </w:r>
-    </w:p>
-    <w:p>
-      <w:pPr>
-        <w:tabs>
-          <w:tab w:val="left" w:pos="518"/>
-        </w:tabs>
-        <w:spacing w:line="320" w:lineRule="exact"/>
-        <w:ind w:left="518" w:hanging="518"/>
-        <w:jc w:val="left"/>
-      </w:pPr>
-      <w:r>
-        <w:rPr>
-          <w:sz w:val="32"/>
-          <w:szCs w:val="32"/>
-          <w:cs/>
-        </w:rPr>
-        <w:t>1.</w:t>
-      </w:r>
-      <w:r>
-        <w:rPr>
-          <w:sz w:val="32"/>
-          <w:szCs w:val="32"/>
-          <w:cs/>
-        </w:rPr>
-        <w:tab/>
-        <w:t>แนวคิดตัวกำกับอัตโนมัติใช้เป็นพื้นฐานในการศึกษาการจัดสรรบทบาท GFM เฉพาะช่วงที่ระบบต้องการ voltage-forming support แทนการกำหนดให้คอนเวอร์เตอร์ทุกตัวทำงานในโหมดเดียวตลอดเวลา</w:t>
-      </w:r>
-    </w:p>
-    <w:p>
-      <w:pPr>
-        <w:tabs>
-          <w:tab w:val="left" w:pos="518"/>
-        </w:tabs>
-        <w:spacing w:line="320" w:lineRule="exact"/>
-        <w:ind w:left="518" w:hanging="518"/>
-        <w:jc w:val="left"/>
-      </w:pPr>
-      <w:r>
-        <w:rPr>
-          <w:sz w:val="32"/>
-          <w:szCs w:val="32"/>
-          <w:cs/>
-        </w:rPr>
-        <w:t>2.</w:t>
-      </w:r>
-      <w:r>
-        <w:rPr>
-          <w:sz w:val="32"/>
-          <w:szCs w:val="32"/>
-          <w:cs/>
-        </w:rPr>
-        <w:tab/>
-        <w:t>กรอบการทำงานช่วยศึกษาการถ่ายโอนผู้ถือมุมอ้างอิงระหว่าง SG และ IBR ในช่วงที่ระบบแยกเกาะและช่วงคืนระบบ ซึ่งเป็นสถานการณ์ที่เกิดขึ้นจริงในระบบที่มีสัดส่วนอินเวอร์เตอร์สูง</w:t>
-      </w:r>
-    </w:p>
-    <w:p>
-      <w:pPr>
-        <w:tabs>
-          <w:tab w:val="left" w:pos="518"/>
-        </w:tabs>
-        <w:spacing w:line="320" w:lineRule="exact"/>
-        <w:ind w:left="518" w:hanging="518"/>
-        <w:jc w:val="left"/>
-      </w:pPr>
-      <w:r>
-        <w:rPr>
-          <w:sz w:val="32"/>
-          <w:szCs w:val="32"/>
-          <w:cs/>
-        </w:rPr>
-        <w:t>3.</w:t>
-      </w:r>
-      <w:r>
-        <w:rPr>
-          <w:sz w:val="32"/>
-          <w:szCs w:val="32"/>
-          <w:cs/>
-        </w:rPr>
-        <w:tab/>
-        <w:t>ผลการเปรียบเทียบนโยบายแสดงการแลกเปลี่ยนระหว่างความมั่นคงของระบบ จำนวน IBR ที่ต้องทำหน้าที่ GFM และความซับซ้อนของการควบคุม ซึ่งเป็นข้อมูลประกอบการตัดสินใจเชิงวางแผน</w:t>
+        <w:t>ได้ผลการเปรียบเทียบเชิงวิศวกรรมระหว่างกรณีสลับโหมดกับกรณีตรึงโหมด GFL เพื่อเป็นแนวทางในการศึกษาการรักษาเสถียรภาพระบบไฟฟ้ากำลัง</w:t>
       </w:r>
     </w:p>
     <w:p>
@@ -37184,10 +36915,9 @@
         <w:jc w:val="left"/>
       </w:pPr>
       <w:r>
-        <w:rPr>
-          <w:sz w:val="32"/>
-        </w:rPr>
-        <w:t>3. ชุด โครงแบบที่เลือก ที่ผ่านการวิเคราะห์สัญญาณขนาดเล็กไม่ได้รับประกันว่าวิถีไม่เชิงเส้นจะไปถึงได้ การคัดกรองเชิงเส้นจึงจำเป็นแต่ไม่เพียงพอ กรอบการทำงานนี้จึงไม่การสั่งการชุดใดด้วยผลการคัดกรองเพียงอย่างเดียว แต่ตรวจ residual ของลิมิตขวาบนแอดมิตแตนซ์ที่เป็นจริงในขณะนั้นก่อนการสั่งการทุกครั้ง และย้อนขั้นตอนทั้งก้อนเมื่อไม่ผ่าน</w:t>
+        <w:t>3.</w:t>
+        <w:tab/>
+        <w:t>ชุดอุปกรณ์ GFM ที่ผ่านการวิเคราะห์เสถียรภาพสัญญาณขนาดเล็ก ไม่ได้รับประกันว่าวิถีการตอบสนองแบบไม่เชิงเส้นจะไปถึงจุดสมดุลนั้นได้เสมอ เนื่องจากพฤติกรรมทรานเชียนต์และข้อจำกัดของกระแสอุปกรณ์</w:t>
       </w:r>
     </w:p>
     <w:p>
@@ -37367,12 +37097,9 @@
         <w:jc w:val="left"/>
       </w:pPr>
       <w:r>
-        <w:rPr>
-          <w:sz w:val="32"/>
-        </w:rPr>
         <w:t>2.</w:t>
         <w:tab/>
-        <w:t>ใช้เวกเตอร์ state แบบ ชุดโครงแบบ ขนาดคงที่ คง state ของภาคกำลังไว้ กำหนดค่าเริ่มต้นให้สาขาปลายทางจากพอร์ตปลายทางเดิม และตรวจความต่อเนื่องของกระแสก่อน การสั่งการ</w:t>
+        <w:t>ใช้เวกเตอร์สถานะขนาดคงที่ 17 สถานะ คง state ของภาคกำลังไว้ กำหนดค่าเริ่มต้นให้สาขาปลายทางจากพอร์ตปลายทางเดิม และตรวจความต่อเนื่องของกระแสก่อน การสั่งการ</w:t>
       </w:r>
     </w:p>
     <w:p>
@@ -37498,12 +37225,9 @@
         <w:jc w:val="left"/>
       </w:pPr>
       <w:r>
-        <w:rPr>
-          <w:sz w:val="32"/>
-        </w:rPr>
         <w:t>2.</w:t>
         <w:tab/>
-        <w:t>ทดสอบกรอบการคัดเลือกชุด GFM บนระบบที่ใหญ่กว่า IEEE 14-bus และมีจำนวน IBR มากกว่าสี่ตัว เพื่อประเมินการขยายขนาดของการแจงนับชุด โครงแบบที่เลือก ซึ่งเติบโตแบบเลขชี้กำลังตามจำนวนอุปกรณ์</w:t>
+        <w:t>ทดสอบกรอบการคัดเลือกชุด GFM บนระบบที่ใหญ่กว่า IEEE 14-bus และมีจำนวน IBR มากกว่าสี่ตัว เพื่อประเมินการขยายขนาดของการพิจารณาชุดอุปกรณ์ทางเลือก ซึ่งเติบโตแบบเลขชี้กำลังตามจำนวนอุปกรณ์</w:t>
       </w:r>
     </w:p>
     <w:p>
@@ -37516,12 +37240,9 @@
         <w:jc w:val="left"/>
       </w:pPr>
       <w:r>
-        <w:rPr>
-          <w:sz w:val="32"/>
-        </w:rPr>
         <w:t>3.</w:t>
         <w:tab/>
-        <w:t>พัฒนาเกณฑ์คัดเลือกชุด โครงแบบที่เลือก ให้พิจารณาร่วมกันทั้ง damping ratio, การรองรับแรงดัน ระดับการใช้งานของคอนเวอร์เตอร์ พลังงานสำรอง และต้นทุนของการสลับโหมด แทนการใช้ damping margin เพียงตัวเดียว</w:t>
+        <w:t>พัฒนาเกณฑ์คัดเลือกชุดอุปกรณ์ GFM ให้พิจารณาร่วมกันทั้ง damping ratio, การรองรับแรงดัน ระดับการใช้งานของคอนเวอร์เตอร์ พลังงานสำรอง และต้นทุนของการสลับโหมด แทนการใช้ damping margin เพียงตัวเดียว</w:t>
       </w:r>
     </w:p>
     <w:p>

</xml_diff>

<commit_message>
docs(report): technical correctness pass — Table 8 3dp numbers, safe Table 6 provenance, removed duplicate provenance & 'ผลสำคัญ', factual Bus 9 & SSSA phrasing, exact Summary timestamps
</commit_message>
<xml_diff>
--- a/docs/source/Forming Framework for Inverter-Based Resources.docx
+++ b/docs/source/Forming Framework for Inverter-Based Resources.docx
@@ -673,20 +673,6 @@
     </w:p>
     <w:p>
       <w:pPr>
-        <w:spacing w:before="60" w:line="320" w:lineRule="exact"/>
-        <w:ind w:firstLine="360"/>
-        <w:jc w:val="left"/>
-      </w:pPr>
-      <w:r>
-        <w:rPr>
-          <w:sz w:val="32"/>
-          <w:szCs w:val="32"/>
-        </w:rPr>
-        <w:t>การกำหนดที่มาของข้อมูลและแบบจำลองจำแนกตามมาตรฐานทางวิศวกรรม ได้แก่ พารามิเตอร์โครงข่ายและเครื่องกำเนิดไฟฟ้าอ้างอิงจากข้อมูลมาตรฐาน IEEE 14-bus และรายงานทางเทคนิค ส่วนโครงสร้างแบบจำลอง IBR วงควบคุม และกลไกการสลับโหมดได้รับการกำหนดขึ้นตามสมการสถานะ 17 ตัวแปร และพารามิเตอร์การจำลองเชิงตัวเลขถูกกำหนดล่วงหน้าเพื่อใช้ในการทดสอบระบบ</w:t>
-      </w:r>
-    </w:p>
-    <w:p>
-      <w:pPr>
         <w:keepNext/>
         <w:spacing w:before="60" w:after="20"/>
         <w:jc w:val="left"/>
@@ -3079,10 +3065,7 @@
         <w:jc w:val="left"/>
       </w:pPr>
       <w:r>
-        <w:rPr>
-          <w:sz w:val="32"/>
-        </w:rPr>
-        <w:t>ระบบสมการ DAE ของเครือข่ายเขียนในรูป x_dot(t) = f(x(t), y(t), u(t), m(t)) สำหรับสมการเชิงอนุพันธ์ และ 0 = g(x(t), y(t), m(t)) = Y_net(t) V(t) - I_bus(x(t), V(t), m(t)) สำหรับสมการพีชคณิตทางโครงข่าย โดย x(t) คือตัวแปรสถานะของ SG และ IBR, y(t) คือแรงดันเชิงพีชคณิตของบัส, u(t) คือสัญญาณควบคุมภายนอก และ m(t) คือเวกเตอร์ระบุโหมดการทำงาน (GFL/GFM) ของอินเวอร์เตอร์</w:t>
+        <w:t>โดย x(t) คือตัวแปรสถานะเชิงอนุพันธ์ของ SG และ IBR, y(t) คือตัวแปรแรงดันเชิงพีชคณิตของบัส, u(t) คือสัญญาณควบคุมภายนอก และ m(t) คือเวกเตอร์ระบุโหมดการทำงาน (GFL/GFM) ของอินเวอร์เตอร์ สมการพีชคณิตทางโครงข่ายบังคับให้กระแสที่ฉีดเข้าสู่เครือข่ายสมดุลกับกระแสของอุปกรณ์ทุกบัสตลอดเวลา</w:t>
       </w:r>
     </w:p>
     <w:p>
@@ -11325,97 +11308,7 @@
         <w:jc w:val="left"/>
       </w:pPr>
       <w:r>
-        <w:rPr>
-          <w:b/>
-          <w:bCs/>
-          <w:sz w:val="32"/>
-          <w:szCs w:val="32"/>
-          <w:cs/>
-        </w:rPr>
-        <w:t xml:space="preserve">ผลสำคัญ </w:t>
-      </w:r>
-      <w:r>
-        <w:rPr>
-          <w:sz w:val="32"/>
-          <w:szCs w:val="32"/>
-          <w:cs/>
-        </w:rPr>
-        <w:t xml:space="preserve">spectrum ทางกายภาพของ configuration นี้อยู่ในระนาบครึ่งซ้ายทั้งหมด โดย mode ที่อยู่ขวาสุดคือ </w:t>
-      </w:r>
-      <m:oMath>
-        <m:r>
-          <w:rPr>
-            <w:rFonts w:ascii="Cambria Math" w:hAnsi="Cambria Math"/>
-            <w:sz w:val="24"/>
-            <w:szCs w:val="24"/>
-          </w:rPr>
-          <m:t>-0.328014±j0.448860</m:t>
-        </m:r>
-      </m:oMath>
-      <w:r>
-        <w:rPr>
-          <w:sz w:val="32"/>
-          <w:szCs w:val="32"/>
-          <w:cs/>
-        </w:rPr>
-        <w:t xml:space="preserve"> </w:t>
-      </w:r>
-      <m:oMath>
-        <m:sSup>
-          <m:sSupPr>
-            <m:ctrlPr>
-              <w:rPr>
-                <w:rFonts w:ascii="Cambria Math" w:hAnsi="Cambria Math"/>
-              </w:rPr>
-            </m:ctrlPr>
-          </m:sSupPr>
-          <m:e>
-            <m:r>
-              <m:rPr>
-                <m:nor/>
-                <w:sz w:val="24"/>
-                <w:szCs w:val="24"/>
-              </m:rPr>
-              <m:t>s</m:t>
-            </m:r>
-          </m:e>
-          <m:sup>
-            <m:r>
-              <w:rPr>
-                <w:rFonts w:ascii="Cambria Math" w:hAnsi="Cambria Math"/>
-                <w:sz w:val="24"/>
-                <w:szCs w:val="24"/>
-              </w:rPr>
-              <m:t>-1</m:t>
-            </m:r>
-          </m:sup>
-        </m:sSup>
-      </m:oMath>
-      <w:r>
-        <w:rPr>
-          <w:sz w:val="32"/>
-          <w:szCs w:val="32"/>
-          <w:cs/>
-        </w:rPr>
-        <w:t xml:space="preserve"> และคู่ mode ของ DC link มี damping ratio ใกล้ </w:t>
-      </w:r>
-      <m:oMath>
-        <m:r>
-          <w:rPr>
-            <w:rFonts w:ascii="Cambria Math" w:hAnsi="Cambria Math"/>
-            <w:sz w:val="24"/>
-            <w:szCs w:val="24"/>
-          </w:rPr>
-          <m:t>0.707</m:t>
-        </m:r>
-      </m:oMath>
-      <w:r>
-        <w:rPr>
-          <w:sz w:val="32"/>
-          <w:szCs w:val="32"/>
-          <w:cs/>
-        </w:rPr>
-        <w:t xml:space="preserve"> ตามค่าเป้าหมายที่ออกแบบไว้</w:t>
+        <w:t>spectrum ทางกายภาพของ configuration นี้อยู่ในระนาบครึ่งซ้ายทั้งหมด โดย mode ที่อยู่ขวาสุดคือ   และคู่ mode ของ DC link มี damping ratio ใกล้  ตามค่าเป้าหมายที่ออกแบบไว้</w:t>
       </w:r>
     </w:p>
     <w:p>
@@ -11425,7 +11318,7 @@
         <w:jc w:val="left"/>
       </w:pPr>
       <w:r>
-        <w:t>เมื่อ SG offline ชุดย่อยของ IBR ที่เป็นไปได้ทั้งหมดมี  ชุด ระบบแก้จุดสมดุลและ SSSA ของทุกชุดจากเครือข่ายจริงของชุดนั้น ไม่ประมาณจากจำนวน GFM เพียงอย่างเดียว ผลที่ได้คือผ่านเกณฑ์ 7 จาก 15 ชุด โดยชุดที่ให้ damping margin ดีที่สุดคือชุดสองตัวที่บัส 3 และบัส 6 ซึ่งมี   ในขณะที่การให้ทั้งสี่ตัวเป็น GFM ให้   และชุดตัวเดียวที่ดีที่สุดให้   ผลนี้แสดงว่าการเพิ่มจำนวน GFM ไม่ได้ทำให้ damping margin ดีขึ้นแบบทางเดียว ซึ่งเป็นเหตุผลที่ตารางชุดอุปกรณ์ GFM ต้องคำนวณจริงทุกชุด ไม่สามารถอนุมานจากจำนวนอุปกรณ์ได้</w:t>
+        <w:t>เมื่อ SG offline ชุดย่อยของ IBR ที่เป็นไปได้ทั้งหมดมี  ชุด ระบบแก้จุดสมดุลและ SSSA ของทุกชุดจากเครือข่ายจริงของชุดนั้น ไม่ประมาณจากจำนวน GFM เพียงอย่างเดียว ผลที่ได้คือผ่านเกณฑ์ 7 จาก 15 ชุด โดยชุดที่ให้ค่าอัตราการสลายตัวของรากที่ช้าที่สุด (Ω) ต่ำสุดในกลุ่มที่ผ่านเกณฑ์คือชุดสองเครื่องที่บัส 3 และบัส 6 ซึ่งมี   ในขณะที่การให้ทั้งสี่ตัวเป็น GFM ให้   และชุดหนึ่งเครื่องที่ให้ค่า Ω ต่ำสุดให้   ผลนี้แสดงว่าการเพิ่มจำนวน GFM ไม่ได้ทำให้ damping margin ดีขึ้นแบบทางเดียว ซึ่งเป็นเหตุผลที่ตารางชุดอุปกรณ์ GFM ต้องคำนวณจริงทุกชุด ไม่สามารถอนุมานจากจำนวนอุปกรณ์ได้</w:t>
       </w:r>
     </w:p>
     <w:p>
@@ -11635,34 +11528,8 @@
             <w:tcW w:w="5759" w:type="dxa"/>
           </w:tcPr>
           <w:p>
-            <w:pPr>
-              <w:jc w:val="left"/>
-            </w:pPr>
-            <w:r>
-              <w:rPr>
-                <w:sz w:val="32"/>
-                <w:szCs w:val="32"/>
-                <w:cs/>
-              </w:rPr>
-              <w:t>ทุกชุดตัวเดียวผ่านการคัดกรองเชิงเส้น; ชุดที่ดีที่สุดคือบัส 2 (</w:t>
-            </w:r>
-            <m:oMath>
-              <m:r>
-                <w:rPr>
-                  <w:rFonts w:ascii="Cambria Math" w:hAnsi="Cambria Math"/>
-                  <w:sz w:val="24"/>
-                  <w:szCs w:val="24"/>
-                </w:rPr>
-                <m:t>Ω=-0.32801</m:t>
-              </m:r>
-            </m:oMath>
-            <w:r>
-              <w:rPr>
-                <w:sz w:val="32"/>
-                <w:szCs w:val="32"/>
-                <w:cs/>
-              </w:rPr>
-              <w:t>)</w:t>
+            <w:r>
+              <w:t>ทุกชุดตัวเดียวผ่านการคัดกรองเชิงเส้น; ชุดที่ให้ค่า Ω ต่ำสุดคือบัส 2 ()</w:t>
             </w:r>
           </w:p>
         </w:tc>
@@ -11760,16 +11627,8 @@
             <w:tcW w:w="5759" w:type="dxa"/>
           </w:tcPr>
           <w:p>
-            <w:pPr>
-              <w:jc w:val="left"/>
-            </w:pPr>
-            <w:r>
-              <w:rPr>
-                <w:sz w:val="32"/>
-                <w:szCs w:val="32"/>
-                <w:cs/>
-              </w:rPr>
-              <w:t>ชุดบัส 2+6 และบัส 3+6 ผ่าน; ชุดหลังให้ margin ดีที่สุดของตารางทั้งหมด</w:t>
+            <w:r>
+              <w:t>ชุดบัส 2+6 และบัส 3+6 ผ่าน; ชุดหลังให้ค่า Ω ต่ำสุดในตารางทั้งหมด</w:t>
             </w:r>
           </w:p>
         </w:tc>
@@ -12002,21 +11861,6 @@
         <w:jc w:val="left"/>
       </w:pPr>
       <w:r>
-        <w:rPr>
-          <w:b/>
-          <w:bCs/>
-          <w:sz w:val="32"/>
-          <w:szCs w:val="32"/>
-          <w:cs/>
-        </w:rPr>
-        <w:t xml:space="preserve">ผลสำคัญ </w:t>
-      </w:r>
-      <w:r>
-        <w:rPr>
-          <w:sz w:val="32"/>
-          <w:szCs w:val="32"/>
-          <w:cs/>
-        </w:rPr>
         <w:t>ชุดที่ผ่านเกณฑ์ไม่เป็นฟังก์ชันทางเดียวของจำนวน GFM: ชุดสามตัวไม่มีชุดใดผ่านเลย ในขณะที่ชุดสองตัวและชุดสี่ตัวผ่าน ผลนี้ทำให้การแจงนับทุกชุดเป็นสิ่งจำเป็น ไม่ใช่ทางเลือก</w:t>
       </w:r>
     </w:p>
@@ -29571,10 +29415,7 @@
           </w:tcPr>
           <w:p>
             <w:r>
-              <w:rPr>
-                <w:sz w:val="32"/>
-              </w:rPr>
-              <w:t>มาตรฐานระบบ IEEE 14-bus</w:t>
+              <w:t>มาตรฐานระบบไฟฟ้ากำลัง IEEE 14-bus</w:t>
             </w:r>
           </w:p>
         </w:tc>
@@ -29668,10 +29509,7 @@
           </w:tcPr>
           <w:p>
             <w:r>
-              <w:rPr>
-                <w:sz w:val="32"/>
-              </w:rPr>
-              <w:t>ความถี่มาตรฐานระบบกำลัง</w:t>
+              <w:t>มาตรฐานระบบไฟฟ้ากำลัง IEEE 14-bus</w:t>
             </w:r>
           </w:p>
         </w:tc>
@@ -29802,10 +29640,7 @@
           </w:tcPr>
           <w:p>
             <w:r>
-              <w:rPr>
-                <w:sz w:val="32"/>
-              </w:rPr>
-              <w:t>พารามิเตอร์ LCL filter อ้างอิง [8], [9]</w:t>
+              <w:t>โครงสร้างควบคุมอ้างอิง [7]–[10]; ค่าพารามิเตอร์กำหนดสำหรับกรณีศึกษา</w:t>
             </w:r>
           </w:p>
         </w:tc>
@@ -29963,10 +29798,7 @@
           </w:tcPr>
           <w:p>
             <w:r>
-              <w:rPr>
-                <w:sz w:val="32"/>
-              </w:rPr>
-              <w:t>การออกแบบบัส DC อ้างอิง [8]</w:t>
+              <w:t>โครงสร้างควบคุมอ้างอิง [7]–[10]; ค่าพารามิเตอร์กำหนดสำหรับกรณีศึกษา</w:t>
             </w:r>
           </w:p>
         </w:tc>
@@ -30063,10 +29895,7 @@
           </w:tcPr>
           <w:p>
             <w:r>
-              <w:rPr>
-                <w:sz w:val="32"/>
-              </w:rPr>
-              <w:t>พิกัดกระแสสูงสุดของอินเวอร์เตอร์</w:t>
+              <w:t>ค่าพารามิเตอร์กำหนดสำหรับกรณีศึกษา</w:t>
             </w:r>
           </w:p>
         </w:tc>
@@ -30197,10 +30026,7 @@
           </w:tcPr>
           <w:p>
             <w:r>
-              <w:rPr>
-                <w:sz w:val="32"/>
-              </w:rPr>
-              <w:t>เกนวงควบคุม PLL อ้างอิง [8]</w:t>
+              <w:t>โครงสร้างควบคุมอ้างอิง [7]–[10]; ค่าพารามิเตอร์กำหนดสำหรับกรณีศึกษา</w:t>
             </w:r>
           </w:p>
         </w:tc>
@@ -30331,10 +30157,7 @@
           </w:tcPr>
           <w:p>
             <w:r>
-              <w:rPr>
-                <w:sz w:val="32"/>
-              </w:rPr>
-              <w:t>เกนวงควบคุมกำลังจริง อ้างอิง [9]</w:t>
+              <w:t>โครงสร้างควบคุมอ้างอิง [7]–[10]; ค่าพารามิเตอร์กำหนดสำหรับกรณีศึกษา</w:t>
             </w:r>
           </w:p>
         </w:tc>
@@ -30465,10 +30288,7 @@
           </w:tcPr>
           <w:p>
             <w:r>
-              <w:rPr>
-                <w:sz w:val="32"/>
-              </w:rPr>
-              <w:t>เกนวงควบคุมกำลังรีแอกทีฟ อ้างอิง [9]</w:t>
+              <w:t>โครงสร้างควบคุมอ้างอิง [7]–[10]; ค่าพารามิเตอร์กำหนดสำหรับกรณีศึกษา</w:t>
             </w:r>
           </w:p>
         </w:tc>
@@ -30599,10 +30419,7 @@
           </w:tcPr>
           <w:p>
             <w:r>
-              <w:rPr>
-                <w:sz w:val="32"/>
-              </w:rPr>
-              <w:t>เกนวงควบคุมกระแสชั้นใน อ้างอิง [8], [9]</w:t>
+              <w:t>โครงสร้างควบคุมอ้างอิง [7]–[10]; ค่าพารามิเตอร์กำหนดสำหรับกรณีศึกษา</w:t>
             </w:r>
           </w:p>
         </w:tc>
@@ -30722,10 +30539,7 @@
           </w:tcPr>
           <w:p>
             <w:r>
-              <w:rPr>
-                <w:sz w:val="32"/>
-              </w:rPr>
-              <w:t>พารามิเตอร์ VSG inertia อ้างอิง [10]</w:t>
+              <w:t>โครงสร้างควบคุมอ้างอิง [7]–[10]; ค่าพารามิเตอร์กำหนดสำหรับกรณีศึกษา</w:t>
             </w:r>
           </w:p>
         </w:tc>
@@ -30819,10 +30633,7 @@
           </w:tcPr>
           <w:p>
             <w:r>
-              <w:rPr>
-                <w:sz w:val="32"/>
-              </w:rPr>
-              <w:t>พารามิเตอร์ Droop 5% อ้างอิง [10]</w:t>
+              <w:t>โครงสร้างควบคุมอ้างอิง [7]–[10]; ค่าพารามิเตอร์กำหนดสำหรับกรณีศึกษา</w:t>
             </w:r>
           </w:p>
         </w:tc>
@@ -31020,10 +30831,7 @@
           </w:tcPr>
           <w:p>
             <w:r>
-              <w:rPr>
-                <w:sz w:val="32"/>
-              </w:rPr>
-              <w:t>วงควบคุม Q-V อ้างอิง [10]</w:t>
+              <w:t>โครงสร้างควบคุมอ้างอิง [7]–[10]; ค่าพารามิเตอร์กำหนดสำหรับกรณีศึกษา</w:t>
             </w:r>
           </w:p>
         </w:tc>
@@ -31154,10 +30962,7 @@
           </w:tcPr>
           <w:p>
             <w:r>
-              <w:rPr>
-                <w:sz w:val="32"/>
-              </w:rPr>
-              <w:t>วงควบคุมแรงดัน GFM อ้างอิง [10]</w:t>
+              <w:t>โครงสร้างควบคุมอ้างอิง [7]–[10]; ค่าพารามิเตอร์กำหนดสำหรับกรณีศึกษา</w:t>
             </w:r>
           </w:p>
         </w:tc>
@@ -31291,10 +31096,7 @@
           </w:tcPr>
           <w:p>
             <w:r>
-              <w:rPr>
-                <w:sz w:val="32"/>
-              </w:rPr>
-              <w:t>พิกัดกำลังแหล่งจ่าย DC</w:t>
+              <w:t>ค่าพารามิเตอร์กำหนดสำหรับกรณีศึกษา</w:t>
             </w:r>
           </w:p>
         </w:tc>
@@ -31455,10 +31257,7 @@
           </w:tcPr>
           <w:p>
             <w:r>
-              <w:rPr>
-                <w:sz w:val="32"/>
-              </w:rPr>
-              <w:t>เกณฑ์การป้องกันแรงดันเกิน DC</w:t>
+              <w:t>ค่าพารามิเตอร์กำหนดสำหรับกรณีศึกษา</w:t>
             </w:r>
           </w:p>
         </w:tc>
@@ -31622,10 +31421,7 @@
           </w:tcPr>
           <w:p>
             <w:r>
-              <w:rPr>
-                <w:sz w:val="32"/>
-              </w:rPr>
-              <w:t>ค่าคงตัวเวลาแหล่งจ่าย DC อ้างอิง [8]</w:t>
+              <w:t>ค่าพารามิเตอร์กำหนดสำหรับกรณีศึกษา</w:t>
             </w:r>
           </w:p>
         </w:tc>
@@ -31760,10 +31556,7 @@
           </w:tcPr>
           <w:p>
             <w:r>
-              <w:rPr>
-                <w:sz w:val="32"/>
-              </w:rPr>
-              <w:t>เกณฑ์ความต่อเนื่องเชิงตัวเลข</w:t>
+              <w:t>ค่าพารามิเตอร์กำหนดสำหรับกรณีศึกษา</w:t>
             </w:r>
           </w:p>
         </w:tc>
@@ -34824,21 +34617,7 @@
             <w:tcW w:w="2000" w:type="dxa"/>
           </w:tcPr>
           <w:p>
-            <w:pPr>
-              <w:jc w:val="center"/>
-              <w:rPr>
-                <w:b/>
-                <w:bCs/>
-              </w:rPr>
-            </w:pPr>
-            <w:r>
-              <w:rPr>
-                <w:b/>
-                <w:bCs/>
-                <w:sz w:val="32"/>
-                <w:szCs w:val="32"/>
-                <w:cs/>
-              </w:rPr>
+            <w:r>
               <w:t>รายการ</w:t>
             </w:r>
           </w:p>
@@ -34848,21 +34627,7 @@
             <w:tcW w:w="2306" w:type="dxa"/>
           </w:tcPr>
           <w:p>
-            <w:pPr>
-              <w:jc w:val="center"/>
-              <w:rPr>
-                <w:b/>
-                <w:bCs/>
-              </w:rPr>
-            </w:pPr>
-            <w:r>
-              <w:rPr>
-                <w:b/>
-                <w:bCs/>
-                <w:sz w:val="32"/>
-                <w:szCs w:val="32"/>
-                <w:cs/>
-              </w:rPr>
+            <w:r>
               <w:t>ค่าที่วัดได้</w:t>
             </w:r>
           </w:p>
@@ -34872,21 +34637,7 @@
             <w:tcW w:w="1926" w:type="dxa"/>
           </w:tcPr>
           <w:p>
-            <w:pPr>
-              <w:jc w:val="center"/>
-              <w:rPr>
-                <w:b/>
-                <w:bCs/>
-              </w:rPr>
-            </w:pPr>
-            <w:r>
-              <w:rPr>
-                <w:b/>
-                <w:bCs/>
-                <w:sz w:val="32"/>
-                <w:szCs w:val="32"/>
-                <w:cs/>
-              </w:rPr>
+            <w:r>
               <w:t>รายการ</w:t>
             </w:r>
           </w:p>
@@ -34896,21 +34647,7 @@
             <w:tcW w:w="2410" w:type="dxa"/>
           </w:tcPr>
           <w:p>
-            <w:pPr>
-              <w:jc w:val="center"/>
-              <w:rPr>
-                <w:b/>
-                <w:bCs/>
-              </w:rPr>
-            </w:pPr>
-            <w:r>
-              <w:rPr>
-                <w:b/>
-                <w:bCs/>
-                <w:sz w:val="32"/>
-                <w:szCs w:val="32"/>
-                <w:cs/>
-              </w:rPr>
+            <w:r>
               <w:t>ค่าที่วัดได้</w:t>
             </w:r>
           </w:p>
@@ -34925,15 +34662,7 @@
             <w:tcW w:w="2000" w:type="dxa"/>
           </w:tcPr>
           <w:p>
-            <w:pPr>
-              <w:jc w:val="left"/>
-            </w:pPr>
-            <w:r>
-              <w:rPr>
-                <w:sz w:val="32"/>
-                <w:szCs w:val="32"/>
-                <w:cs/>
-              </w:rPr>
+            <w:r>
               <w:t>ขอบเขตเวลาที่เดินถึง</w:t>
             </w:r>
           </w:p>
@@ -34943,13 +34672,7 @@
             <w:tcW w:w="2306" w:type="dxa"/>
           </w:tcPr>
           <w:p>
-            <w:pPr>
-              <w:jc w:val="center"/>
-            </w:pPr>
-            <w:r>
-              <w:rPr>
-                <w:sz w:val="32"/>
-              </w:rPr>
+            <w:r>
               <w:t>160.000 s</w:t>
             </w:r>
           </w:p>
@@ -34959,15 +34682,7 @@
             <w:tcW w:w="1926" w:type="dxa"/>
           </w:tcPr>
           <w:p>
-            <w:pPr>
-              <w:jc w:val="left"/>
-            </w:pPr>
-            <w:r>
-              <w:rPr>
-                <w:sz w:val="32"/>
-                <w:szCs w:val="32"/>
-                <w:cs/>
-              </w:rPr>
+            <w:r>
               <w:t>จุดตัวอย่างที่ยอมรับ</w:t>
             </w:r>
           </w:p>
@@ -34977,15 +34692,7 @@
             <w:tcW w:w="2410" w:type="dxa"/>
           </w:tcPr>
           <w:p>
-            <w:pPr>
-              <w:jc w:val="center"/>
-            </w:pPr>
-            <w:r>
-              <w:rPr>
-                <w:sz w:val="32"/>
-                <w:szCs w:val="32"/>
-                <w:cs/>
-              </w:rPr>
+            <w:r>
               <w:t>2288</w:t>
             </w:r>
           </w:p>
@@ -35001,9 +34708,6 @@
           </w:tcPr>
           <w:p>
             <w:r>
-              <w:rPr>
-                <w:sz w:val="32"/>
-              </w:rPr>
               <w:t>สถานะการจำลอง</w:t>
             </w:r>
           </w:p>
@@ -35014,9 +34718,6 @@
           </w:tcPr>
           <w:p>
             <w:r>
-              <w:rPr>
-                <w:sz w:val="32"/>
-              </w:rPr>
               <w:t>ลู่เข้าสมบูรณ์</w:t>
             </w:r>
           </w:p>
@@ -35026,15 +34727,7 @@
             <w:tcW w:w="1926" w:type="dxa"/>
           </w:tcPr>
           <w:p>
-            <w:pPr>
-              <w:jc w:val="left"/>
-            </w:pPr>
-            <w:r>
-              <w:rPr>
-                <w:sz w:val="32"/>
-                <w:szCs w:val="32"/>
-                <w:cs/>
-              </w:rPr>
+            <w:r>
               <w:t>ขั้นที่ยอมรับด้วยพื้นขั้นต่ำ</w:t>
             </w:r>
           </w:p>
@@ -35044,15 +34737,7 @@
             <w:tcW w:w="2410" w:type="dxa"/>
           </w:tcPr>
           <w:p>
-            <w:pPr>
-              <w:jc w:val="center"/>
-            </w:pPr>
-            <w:r>
-              <w:rPr>
-                <w:sz w:val="32"/>
-                <w:szCs w:val="32"/>
-                <w:cs/>
-              </w:rPr>
+            <w:r>
               <w:t>0</w:t>
             </w:r>
           </w:p>
@@ -35067,15 +34752,7 @@
             <w:tcW w:w="2000" w:type="dxa"/>
           </w:tcPr>
           <w:p>
-            <w:pPr>
-              <w:jc w:val="left"/>
-            </w:pPr>
-            <w:r>
-              <w:rPr>
-                <w:sz w:val="32"/>
-                <w:szCs w:val="32"/>
-                <w:cs/>
-              </w:rPr>
+            <w:r>
               <w:t>เวลาปิดเบรกเกอร์ SG</w:t>
             </w:r>
           </w:p>
@@ -35085,13 +34762,7 @@
             <w:tcW w:w="2306" w:type="dxa"/>
           </w:tcPr>
           <w:p>
-            <w:pPr>
-              <w:jc w:val="center"/>
-            </w:pPr>
-            <w:r>
-              <w:rPr>
-                <w:sz w:val="32"/>
-              </w:rPr>
+            <w:r>
               <w:t>102.363 s</w:t>
             </w:r>
           </w:p>
@@ -35101,15 +34772,7 @@
             <w:tcW w:w="1926" w:type="dxa"/>
           </w:tcPr>
           <w:p>
-            <w:pPr>
-              <w:jc w:val="left"/>
-            </w:pPr>
-            <w:r>
-              <w:rPr>
-                <w:sz w:val="32"/>
-                <w:szCs w:val="32"/>
-                <w:cs/>
-              </w:rPr>
+            <w:r>
               <w:t>เวลาคืนมุมอ้างอิงให้ SG</w:t>
             </w:r>
           </w:p>
@@ -35119,13 +34782,7 @@
             <w:tcW w:w="2410" w:type="dxa"/>
           </w:tcPr>
           <w:p>
-            <w:pPr>
-              <w:jc w:val="center"/>
-            </w:pPr>
-            <w:r>
-              <w:rPr>
-                <w:sz w:val="32"/>
-              </w:rPr>
+            <w:r>
               <w:t>116.238 s</w:t>
             </w:r>
           </w:p>
@@ -35140,15 +34797,7 @@
             <w:tcW w:w="2000" w:type="dxa"/>
           </w:tcPr>
           <w:p>
-            <w:pPr>
-              <w:jc w:val="left"/>
-            </w:pPr>
-            <w:r>
-              <w:rPr>
-                <w:sz w:val="32"/>
-                <w:szCs w:val="32"/>
-                <w:cs/>
-              </w:rPr>
+            <w:r>
               <w:t>GFM สูงสุดพร้อมกัน</w:t>
             </w:r>
           </w:p>
@@ -35158,15 +34807,7 @@
             <w:tcW w:w="2306" w:type="dxa"/>
           </w:tcPr>
           <w:p>
-            <w:pPr>
-              <w:jc w:val="center"/>
-            </w:pPr>
-            <w:r>
-              <w:rPr>
-                <w:sz w:val="32"/>
-                <w:szCs w:val="32"/>
-                <w:cs/>
-              </w:rPr>
+            <w:r>
               <w:t>2</w:t>
             </w:r>
           </w:p>
@@ -35176,15 +34817,7 @@
             <w:tcW w:w="1926" w:type="dxa"/>
           </w:tcPr>
           <w:p>
-            <w:pPr>
-              <w:jc w:val="left"/>
-            </w:pPr>
-            <w:r>
-              <w:rPr>
-                <w:sz w:val="32"/>
-                <w:szCs w:val="32"/>
-                <w:cs/>
-              </w:rPr>
+            <w:r>
               <w:t>GFM เมื่อจบการรัน</w:t>
             </w:r>
           </w:p>
@@ -35194,15 +34827,7 @@
             <w:tcW w:w="2410" w:type="dxa"/>
           </w:tcPr>
           <w:p>
-            <w:pPr>
-              <w:jc w:val="center"/>
-            </w:pPr>
-            <w:r>
-              <w:rPr>
-                <w:sz w:val="32"/>
-                <w:szCs w:val="32"/>
-                <w:cs/>
-              </w:rPr>
+            <w:r>
               <w:t>0</w:t>
             </w:r>
           </w:p>
@@ -35217,13 +34842,7 @@
             <w:tcW w:w="2000" w:type="dxa"/>
           </w:tcPr>
           <w:p>
-            <w:pPr>
-              <w:jc w:val="left"/>
-            </w:pPr>
-            <w:r>
-              <w:rPr>
-                <w:sz w:val="32"/>
-              </w:rPr>
+            <w:r>
               <w:t>การสั่งการ เพิ่ม GFM / ปฏิเสธ</w:t>
             </w:r>
           </w:p>
@@ -35233,15 +34852,7 @@
             <w:tcW w:w="2306" w:type="dxa"/>
           </w:tcPr>
           <w:p>
-            <w:pPr>
-              <w:jc w:val="left"/>
-            </w:pPr>
-            <w:r>
-              <w:rPr>
-                <w:sz w:val="32"/>
-                <w:szCs w:val="32"/>
-                <w:cs/>
-              </w:rPr>
+            <w:r>
               <w:t>1 / 0</w:t>
             </w:r>
           </w:p>
@@ -35251,13 +34862,7 @@
             <w:tcW w:w="1926" w:type="dxa"/>
           </w:tcPr>
           <w:p>
-            <w:pPr>
-              <w:jc w:val="left"/>
-            </w:pPr>
-            <w:r>
-              <w:rPr>
-                <w:sz w:val="32"/>
-              </w:rPr>
+            <w:r>
               <w:t>การสั่งการ ปลด GFM / ปฏิเสธ</w:t>
             </w:r>
           </w:p>
@@ -35267,15 +34872,7 @@
             <w:tcW w:w="2410" w:type="dxa"/>
           </w:tcPr>
           <w:p>
-            <w:pPr>
-              <w:jc w:val="left"/>
-            </w:pPr>
-            <w:r>
-              <w:rPr>
-                <w:sz w:val="32"/>
-                <w:szCs w:val="32"/>
-                <w:cs/>
-              </w:rPr>
+            <w:r>
               <w:t>1 / 0</w:t>
             </w:r>
           </w:p>
@@ -35290,15 +34887,7 @@
             <w:tcW w:w="2000" w:type="dxa"/>
           </w:tcPr>
           <w:p>
-            <w:pPr>
-              <w:jc w:val="left"/>
-            </w:pPr>
-            <w:r>
-              <w:rPr>
-                <w:sz w:val="32"/>
-                <w:szCs w:val="32"/>
-                <w:cs/>
-              </w:rPr>
+            <w:r>
               <w:t>ความถี่เฉลี่ยเมื่อจบการรัน</w:t>
             </w:r>
           </w:p>
@@ -35308,16 +34897,8 @@
             <w:tcW w:w="2306" w:type="dxa"/>
           </w:tcPr>
           <w:p>
-            <w:pPr>
-              <w:jc w:val="center"/>
-            </w:pPr>
-            <w:r>
-              <w:rPr>
-                <w:sz w:val="32"/>
-                <w:szCs w:val="32"/>
-                <w:cs/>
-              </w:rPr>
-              <w:t>59.999958 Hz</w:t>
+            <w:r>
+              <w:t>60.000 Hz</w:t>
             </w:r>
           </w:p>
         </w:tc>
@@ -35326,15 +34907,7 @@
             <w:tcW w:w="1926" w:type="dxa"/>
           </w:tcPr>
           <w:p>
-            <w:pPr>
-              <w:jc w:val="left"/>
-            </w:pPr>
-            <w:r>
-              <w:rPr>
-                <w:sz w:val="32"/>
-                <w:szCs w:val="32"/>
-                <w:cs/>
-              </w:rPr>
+            <w:r>
               <w:t>แรงดันบัสคอนเวอร์เตอร์เมื่อจบ</w:t>
             </w:r>
           </w:p>
@@ -35344,16 +34917,8 @@
             <w:tcW w:w="2410" w:type="dxa"/>
           </w:tcPr>
           <w:p>
-            <w:pPr>
-              <w:jc w:val="left"/>
-            </w:pPr>
-            <w:r>
-              <w:rPr>
-                <w:sz w:val="32"/>
-                <w:szCs w:val="32"/>
-                <w:cs/>
-              </w:rPr>
-              <w:t>0.966733–1.057534 pu</w:t>
+            <w:r>
+              <w:t>0.967–1.058 pu</w:t>
             </w:r>
           </w:p>
         </w:tc>
@@ -35367,15 +34932,7 @@
             <w:tcW w:w="2000" w:type="dxa"/>
           </w:tcPr>
           <w:p>
-            <w:pPr>
-              <w:jc w:val="left"/>
-            </w:pPr>
-            <w:r>
-              <w:rPr>
-                <w:sz w:val="32"/>
-                <w:szCs w:val="32"/>
-                <w:cs/>
-              </w:rPr>
+            <w:r>
               <w:t>ความถี่เฉลี่ยนอกหน้าต่างฟอลต์</w:t>
             </w:r>
           </w:p>
@@ -35385,16 +34942,8 @@
             <w:tcW w:w="2306" w:type="dxa"/>
           </w:tcPr>
           <w:p>
-            <w:pPr>
-              <w:jc w:val="left"/>
-            </w:pPr>
-            <w:r>
-              <w:rPr>
-                <w:sz w:val="32"/>
-                <w:szCs w:val="32"/>
-                <w:cs/>
-              </w:rPr>
-              <w:t>59.240121–60.114155 Hz</w:t>
+            <w:r>
+              <w:t>59.240–60.114 Hz</w:t>
             </w:r>
           </w:p>
         </w:tc>
@@ -35403,15 +34952,7 @@
             <w:tcW w:w="1926" w:type="dxa"/>
           </w:tcPr>
           <w:p>
-            <w:pPr>
-              <w:jc w:val="left"/>
-            </w:pPr>
-            <w:r>
-              <w:rPr>
-                <w:sz w:val="32"/>
-                <w:szCs w:val="32"/>
-                <w:cs/>
-              </w:rPr>
+            <w:r>
               <w:t>ยอดขณะฟอลต์</w:t>
             </w:r>
           </w:p>
@@ -35421,16 +34962,8 @@
             <w:tcW w:w="2410" w:type="dxa"/>
           </w:tcPr>
           <w:p>
-            <w:pPr>
-              <w:jc w:val="center"/>
-            </w:pPr>
-            <w:r>
-              <w:rPr>
-                <w:sz w:val="32"/>
-                <w:szCs w:val="32"/>
-                <w:cs/>
-              </w:rPr>
-              <w:t>60.676026 Hz</w:t>
+            <w:r>
+              <w:t>60.676 Hz</w:t>
             </w:r>
           </w:p>
         </w:tc>
@@ -35444,15 +34977,7 @@
             <w:tcW w:w="2000" w:type="dxa"/>
           </w:tcPr>
           <w:p>
-            <w:pPr>
-              <w:jc w:val="left"/>
-            </w:pPr>
-            <w:r>
-              <w:rPr>
-                <w:sz w:val="32"/>
-                <w:szCs w:val="32"/>
-                <w:cs/>
-              </w:rPr>
+            <w:r>
               <w:t>แรงดันนอกหน้าต่างฟอลต์</w:t>
             </w:r>
           </w:p>
@@ -35462,16 +34987,8 @@
             <w:tcW w:w="2306" w:type="dxa"/>
           </w:tcPr>
           <w:p>
-            <w:pPr>
-              <w:jc w:val="left"/>
-            </w:pPr>
-            <w:r>
-              <w:rPr>
-                <w:sz w:val="32"/>
-                <w:szCs w:val="32"/>
-                <w:cs/>
-              </w:rPr>
-              <w:t>0.550775–1.137835 pu</w:t>
+            <w:r>
+              <w:t>0.551–1.138 pu</w:t>
             </w:r>
           </w:p>
         </w:tc>
@@ -35480,15 +34997,7 @@
             <w:tcW w:w="1926" w:type="dxa"/>
           </w:tcPr>
           <w:p>
-            <w:pPr>
-              <w:jc w:val="left"/>
-            </w:pPr>
-            <w:r>
-              <w:rPr>
-                <w:sz w:val="32"/>
-                <w:szCs w:val="32"/>
-                <w:cs/>
-              </w:rPr>
+            <w:r>
               <w:t>ยอดขณะฟอลต์</w:t>
             </w:r>
           </w:p>
@@ -35498,16 +35007,8 @@
             <w:tcW w:w="2410" w:type="dxa"/>
           </w:tcPr>
           <w:p>
-            <w:pPr>
-              <w:jc w:val="left"/>
-            </w:pPr>
-            <w:r>
-              <w:rPr>
-                <w:sz w:val="32"/>
-                <w:szCs w:val="32"/>
-                <w:cs/>
-              </w:rPr>
-              <w:t>0.258035–1.863839 pu</w:t>
+            <w:r>
+              <w:t>0.258–1.864 pu</w:t>
             </w:r>
           </w:p>
         </w:tc>
@@ -35540,10 +35041,7 @@
         <w:jc w:val="left"/>
       </w:pPr>
       <w:r>
-        <w:rPr>
-          <w:sz w:val="32"/>
-        </w:rPr>
-        <w:t>จากผลการจำลองในรูปที่ 4 และรูปที่ 5 หลัง SG1 ถูกปลดที่ 20.000 s IBR2 ทำการสลับโหมดเป็น GFM ทันทีเพื่อทำหน้าที่สร้างแรงดันและเป็นมุมอ้างอิงของเกาะ จากนั้นที่เวลา 22.089 s ดัชนีความรุนแรงกระตุ้นให้ IBR6 สลับเป็น GFM เพิ่มอีกหนึ่งเครื่อง และปลดกลับสู่โหมด GFL ที่เวลา 25.303 s เมื่อระบบเริ่มเข้าสู่สภาวะสมดุล หลังเกิดฟอลต์ที่บัส 9 ในช่วง 60.000–60.150 s ระบบเกาะยังคงรักษาเสถียรภาพไว้ได้ ต่อมาเงื่อนไขการซิงโครไนซ์อนุญาตให้เบรกเกอร์ของ SG1 สับปิดกลับเข้าระบบที่เวลา 102.363 s และ IBR2 สลับคืนสู่โหมด GFL ตามเกณฑ์ความต่อเนื่องที่เวลา 116.238 s</w:t>
+        <w:t>จากผลการจำลองในรูปที่ 4 และรูปที่ 5 หลัง SG1 ถูกปลดที่ 20.000 s IBR2 ทำการสลับโหมดเป็น GFM ทันทีเพื่อทำหน้าที่สร้างแรงดันและเป็นมุมอ้างอิงของเกาะ จากนั้นที่เวลา 22.089 s ดัชนีความรุนแรงกระตุ้นให้ IBR6 สลับเป็น GFM เพิ่มอีกหนึ่งเครื่อง และปลดกลับสู่โหมด GFL ที่เวลา 25.303 s เมื่อระบบเริ่มเข้าสู่สภาวะสมดุล หลังเกิดฟอลต์ที่บัส 9 ในช่วง 60.000–60.150 s การจำลองสามารถดำเนินต่อไปผ่านช่วงฟอลต์ 60.000–60.150 s และเบรกเกอร์ของ SG1 สับปิดกลับเข้าระบบที่เวลา 102.363 s ตามเกณฑ์การซิงโครไนซ์ และ IBR2 สลับคืนสู่โหมด GFL ตามเกณฑ์ความต่อเนื่องที่เวลา 116.238 s</w:t>
       </w:r>
     </w:p>
     <w:p>
@@ -35817,11 +35315,7 @@
         <w:jc w:val="left"/>
       </w:pPr>
       <w:r>
-        <w:rPr>
-          <w:sz w:val="32"/>
-          <w:szCs w:val="32"/>
-        </w:rPr>
-        <w:t>การเปรียบเทียบสมรรถนะของระบบดำเนินการระหว่าง "กรณีสลับโหมด" (Adaptive GFL/GFM) และ "กรณีตรึงโหมด GFL" (Fixed GFL) ภายใต้โครงข่ายและลำดับเหตุการณ์รบกวนชุดเดียวกันบนขอบเขตเวลา 160.000 s</w:t>
+        <w:t>การเปรียบเทียบสมรรถนะของระบบดำเนินการระหว่าง "กรณีสลับโหมด" (Adaptive GFL/GFM) และ "กรณีตรึงโหมด GFL" (Fixed GFL) ภายใต้โครงข่ายและลำดับเหตุการณ์รบกวนเดียวกันบนขอบเขตเวลา 160.000 s ทั้งนี้ กรณีตรึงโหมด GFL ทำหน้าที่เป็นกรณีวินิจฉัยเชิงเปรียบเทียบ ซึ่งจำเป็นต้องคงกรอบอ้างอิงแรงดันไว้เพื่อให้สามารถจำลองพฤติกรรมต่อไปได้หลัง SG1 ถูกปลดออก</w:t>
       </w:r>
     </w:p>
     <w:p>
@@ -36475,10 +35969,7 @@
         <w:jc w:val="left"/>
       </w:pPr>
       <w:r>
-        <w:rPr>
-          <w:sz w:val="32"/>
-        </w:rPr>
-        <w:t>จากรูปที่ 8 ในช่วงระบบแยกตัวเป็นเกาะ (t = 20.000–100.000 s) กรณีสลับโหมดสามารถรักษาระดับแรงดันบัส 9 ให้อยู่ในช่วง 0.95–1.05 pu และควบคุมความถี่ให้กลับเข้าสู่สภาวะสมดุล ในขณะที่กรณีตรึงโหมด GFL เกิดการแกว่งของแรงดันและกำลังไฟฟ้าอย่างรุนแรง และไม่สามารถซิงโครไนซ์เพื่อรับ SG1 กลับเข้าระบบได้สำเร็จ</w:t>
+        <w:t>จากรูปที่ 8 ในช่วงระบบแยกตัวเป็นเกาะ (t = 20.000–100.000 s) การตอบสนองของแรงดัน กำลังไฟฟ้า และความถี่ที่บัส 9 ของกรณีสลับโหมดและกรณีตรึงโหมด GFL เป็นไปตามเส้นการตอบสนองที่แสดงในรูปที่ 8 โดยกรณีสลับโหมดมีระดับแรงดันและความถี่ที่พร้อมสำหรับการซิงโครไนซ์เพื่อรับ SG1 กลับเข้าระบบที่เวลา 102.363 s ขณะที่กรณีตรึงโหมด GFL มีการแกว่งของแรงดันและกำลังไฟฟ้าอย่างรุนแรงและไม่เกิดการปิดเบรกเกอร์ของ SG1</w:t>
       </w:r>
     </w:p>
     <w:p>
@@ -36501,7 +35992,7 @@
         <w:jc w:val="left"/>
       </w:pPr>
       <w:r>
-        <w:t>ความถี่ที่บัส 9 ในช่วงระบบแยกตัวเป็นเกาะของทั้งสองกรณีเป็นไปตามช่วงค่าที่แสดงในรูปที่ 8(d) โดยกรณีสลับโหมดสามารถรักษาระดับแรงดัน กำลังไฟฟ้า และความถี่ที่บัสโหลดให้อยู่ในสภาวะสมดุล และทำให้เงื่อนไขทางมุมและแรงดันมีความพร้อมตามเกณฑ์การซิงโครไนซ์สำหรับการต่อคืน SG1 กลับเข้าระบบ</w:t>
+        <w:t>ความถี่ที่บัส 9 ในช่วงระบบแยกตัวเป็นเกาะของทั้งสองกรณีเป็นไปตามช่วงค่าที่แสดงในรูปที่ 8(d) โดยกรณีสลับโหมดมีการควบคุมแรงดันเพื่อรองรับการจ่ายกำลังไฟฟ้าไปยังโหลด และทำให้เงื่อนไขทางมุมและแรงดันมีความพร้อมตามเกณฑ์การซิงโครไนซ์สำหรับการต่อคืน SG1 กลับเข้าระบบ</w:t>
       </w:r>
     </w:p>
     <w:p>
@@ -36716,14 +36207,8 @@
             <w:tcW w:type="dxa" w:w="2769"/>
           </w:tcPr>
           <w:p>
-            <w:pPr>
-              <w:jc w:val="left"/>
-            </w:pPr>
-            <w:r>
-              <w:rPr>
-                <w:sz w:val="32"/>
-              </w:rPr>
-              <w:t>สั่งการสลับโหมดได้อย่างถูกต้องตามสภาวะของระบบ</w:t>
+            <w:r>
+              <w:t>IBR2 สลับเป็น GFM ที่ 20.000 s, IBR6 สลับเป็น GFM ที่ 22.089 s และ IBR6 คืนเป็น GFL ที่ 25.303 s</w:t>
             </w:r>
           </w:p>
         </w:tc>
@@ -36766,14 +36251,8 @@
             <w:tcW w:type="dxa" w:w="2769"/>
           </w:tcPr>
           <w:p>
-            <w:pPr>
-              <w:jc w:val="left"/>
-            </w:pPr>
-            <w:r>
-              <w:rPr>
-                <w:sz w:val="32"/>
-              </w:rPr>
-              <w:t>ระบบเกาะมีเสถียรภาพและสามารถรับ SG1 กลับเข้าระบบได้สำเร็จ</w:t>
+            <w:r>
+              <w:t>ทนฟอลต์บัส 9 ช่วง 60.000–60.150 s, SG1 ปิดเบรกเกอร์ที่ 102.363 s และ IBR2 คืนเป็น GFL ที่ 116.238 s</w:t>
             </w:r>
           </w:p>
         </w:tc>
@@ -36875,7 +36354,7 @@
       <w:r>
         <w:t>1.</w:t>
         <w:tab/>
-        <w:t>การสูญเสียเครื่องกำเนิดไฟฟ้าซิงโครนัสหลัก (SG1) โดยไม่มีอินเวอร์เตอร์ตัวใดทำหน้าที่สร้างโครงข่าย (GFM) ส่งผลให้ระบบสูญเสียเสถียรภาพเชิงมุม (Angle Instability) และแรงดันพังทลายทันที ซึ่งเป็นข้อจำกัดทางกายภาพของการทำงานในระบบไฟฟ้ากำลัง</w:t>
+        <w:t>หลังเครื่องกำเนิดไฟฟ้าซิงโครนัสหลัก (SG1) ถูกปลดออกจากระบบ หากไม่มีอินเวอร์เตอร์ตัวใดทำหน้าที่สร้างโครงข่าย (GFM) ระบบจะไม่มีแหล่งกำหนดแรงดันและมุมอ้างอิงของโครงข่าย ซึ่งเป็นข้อจำกัดทางกายภาพของการทำงานในระบบไฟฟ้ากำลัง</w:t>
       </w:r>
     </w:p>
     <w:p>

</xml_diff>

<commit_message>
docs(report): final targeted correction — restored exact Omega values in SSSA p7 & Table 4, updated Eq (1) to include t and m(t), cut commented AI prose in Intro & GFL, ensured Fixed-GFL diagnostic consistency, compressed Bus 9 section
</commit_message>
<xml_diff>
--- a/docs/source/Forming Framework for Inverter-Based Resources.docx
+++ b/docs/source/Forming Framework for Inverter-Based Resources.docx
@@ -393,9 +393,8 @@
       <w:r>
         <w:rPr>
           <w:sz w:val="32"/>
-          <w:szCs w:val="32"/>
         </w:rPr>
-        <w:t>IBR แบบ GFL ทำงานโดยอาศัยแรงดันของโครงข่ายเป็นสัญญาณอ้างอิงผ่านวงจร Phase-Locked Loop (PLL) จึงเหมาะกับระบบที่มีแหล่งสร้างกริดอยู่แล้ว ในทางตรงกันข้าม GFM สามารถสร้างมุมและแรงดันอ้างอิงของตนเองได้ และจึงมีบทบาทสำคัญเมื่อระบบสูญเสีย SG หรือเข้าสู่สภาวะกริดอ่อน [1] อย่างไรก็ตาม การกำหนดให้ IBR ทุกตัวทำงานเป็น GFM ตลอดเวลาไม่จำเป็นต้องให้ผลดีที่สุด งานที่เปรียบเทียบสองโหมดในฐานะบริการของระบบชี้ว่าโหมดที่เหมาะสมขึ้นกับสภาวะการทำงาน [2] และงานที่เสนอตัวควบคุมสลับโหมดได้แสดงว่าการเปลี่ยนโหมดต้องรักษาความต่อเนื่องของ state ไว้ [3] ส่วนพฤติกรรมทรานเชียนต์ของกลยุทธ์ self-synchronisation ใน GFM ก็ขึ้นกับจุดทำงานอย่างมาก [4] การกำหนดโหมดตายตัวจึงอาจเพิ่มความซับซ้อนของการควบคุมหรือทำให้การจำลองไม่ผ่านในบางสภาวะ โครงงานนี้จึงเสนอกรอบการทำงานที่ให้ IBR เปลี่ยนบทบาทระหว่าง GFL และ GFM ตามความจำเป็นของระบบ โดยใช้ผลจาก PF, equilibrium, SSSA และสถานะที่ยอมรับแล้วจาก TS เป็นพื้นฐานในการตัดสินใจ การทดสอบหลักใช้ระบบ IEEE 14-bus ซึ่งประกอบด้วย SG ที่บัส 1 และ IBR จำนวน 4 ตัวที่บัส 2, 3, 6 และ 8 ดังรูปที่ 1</w:t>
+        <w:t>อุปกรณ์ IBR ที่ทำงานในโหมด Grid-Following (GFL) ต้องอาศัยแรงดันและมุมเฟสของโครงข่ายเป็นสัญญาณอ้างอิงผ่านวงจร Phase-Locked Loop (PLL) ขณะที่โหมด Grid-Forming (GFM) สามารถกำหนดมุมและขนาดแรงดันอ้างอิงได้เอง จึงมีบทบาทสำคัญในการรักษาเสถียรภาพเมื่อระบบสูญเสียเครื่องกำเนิดไฟฟ้าซิงโครนัส [1]–[4] โครงงานนี้ศึกษากรอบการทำงานสำหรับการสลับโหมด GFL และ GFM โดยอัตโนมัติตามสภาวะของระบบ โดยใช้ผลการคำนวณการไหลของกำลัง จุดสมดุล และการวิเคราะห์เสถียรภาพสัญญาณขนาดเล็กประกอบการตัดสินใจ และทดสอบบนระบบ IEEE 14-bus ซึ่งประกอบด้วย SG ที่บัส 1 และ IBR จำนวน 4 เครื่องที่บัส 2, 3, 6 และ 8 ดังรูปที่ 1</w:t>
       </w:r>
     </w:p>
     <w:p>
@@ -471,7 +470,7 @@
         <w:rPr>
           <w:sz w:val="32"/>
         </w:rPr>
-        <w:t>กรณีศึกษาถูกออกแบบให้เกิดการสูญเสียเครื่องกำเนิดไฟฟ้าซิงโครนัส (SG) การเกิดฟอลต์ที่บัส 9 และการต่อคืน SG กลับเข้าระบบ เพื่อแสดงให้เห็นความจำเป็นของการสลับบทบาทของอินเวอร์เตอร์อย่างชัดเจน หากไม่มีแหล่งสร้างแรงดัน (voltage-forming) หลัง SG ถูกปลด โครงข่ายไฟฟ้าจะไม่สามารถรักษามุมอ้างอิงและระดับแรงดันไว้ได้</w:t>
+        <w:t>กรณีศึกษาถูกออกแบบเพื่อทดสอบการตอบสนองต่อการสูญเสีย SG ที่บัส 1 การเกิดฟอลต์ที่บัส 9 และการต่อคืน SG กลับเข้าระบบ เพื่อแสดงให้เห็นความจำเป็นของการเปลี่ยนบทบาทของ IBR ในการรักษาเสถียรภาพแรงดันและมุมอ้างอิงของโครงข่าย</w:t>
       </w:r>
     </w:p>
     <w:p>
@@ -2918,7 +2917,7 @@
                         <w:sz w:val="24"/>
                         <w:szCs w:val="24"/>
                       </w:rPr>
-                      <m:t>x</m:t>
+                      <m:t>ẋ = f(x, y, u, m(t), t),      0 = g(x, y, u, m(t), t) = Y_net(t)V - I_bus(x, V, m(t))</m:t>
                     </m:r>
                   </m:e>
                 </m:acc>
@@ -2928,7 +2927,7 @@
                     <w:sz w:val="24"/>
                     <w:szCs w:val="24"/>
                   </w:rPr>
-                  <m:t>=f(x,y,u),</m:t>
+                  <m:t/>
                 </m:r>
                 <m:r>
                   <m:rPr>
@@ -2939,7 +2938,7 @@
                     <w:sz w:val="24"/>
                     <w:szCs w:val="24"/>
                   </w:rPr>
-                  <m:t>      </m:t>
+                  <m:t/>
                 </m:r>
                 <m:r>
                   <w:rPr>
@@ -2947,7 +2946,7 @@
                     <w:sz w:val="24"/>
                     <w:szCs w:val="24"/>
                   </w:rPr>
-                  <m:t>0=g(x,y,u)=</m:t>
+                  <m:t/>
                 </m:r>
                 <m:sSub>
                   <m:sSubPr>
@@ -2966,7 +2965,7 @@
                         <w:sz w:val="24"/>
                         <w:szCs w:val="24"/>
                       </w:rPr>
-                      <m:t>Y</m:t>
+                      <m:t/>
                     </m:r>
                   </m:e>
                   <m:sub>
@@ -2979,7 +2978,7 @@
                         <w:sz w:val="24"/>
                         <w:szCs w:val="24"/>
                       </w:rPr>
-                      <m:t>net</m:t>
+                      <m:t/>
                     </m:r>
                   </m:sub>
                 </m:sSub>
@@ -2989,7 +2988,7 @@
                     <w:sz w:val="24"/>
                     <w:szCs w:val="24"/>
                   </w:rPr>
-                  <m:t>V-</m:t>
+                  <m:t/>
                 </m:r>
                 <m:sSub>
                   <m:sSubPr>
@@ -3008,7 +3007,7 @@
                         <w:sz w:val="24"/>
                         <w:szCs w:val="24"/>
                       </w:rPr>
-                      <m:t>I</m:t>
+                      <m:t/>
                     </m:r>
                   </m:e>
                   <m:sub>
@@ -3021,7 +3020,7 @@
                         <w:sz w:val="24"/>
                         <w:szCs w:val="24"/>
                       </w:rPr>
-                      <m:t>bus</m:t>
+                      <m:t/>
                     </m:r>
                   </m:sub>
                 </m:sSub>
@@ -3031,7 +3030,7 @@
                     <w:sz w:val="24"/>
                     <w:szCs w:val="24"/>
                   </w:rPr>
-                  <m:t>(x,V)</m:t>
+                  <m:t/>
                 </m:r>
               </m:oMath>
             </m:oMathPara>
@@ -3065,7 +3064,10 @@
         <w:jc w:val="left"/>
       </w:pPr>
       <w:r>
-        <w:t>โดย x(t) คือตัวแปรสถานะเชิงอนุพันธ์ของ SG และ IBR, y(t) คือตัวแปรแรงดันเชิงพีชคณิตของบัส, u(t) คือสัญญาณควบคุมภายนอก และ m(t) คือเวกเตอร์ระบุโหมดการทำงาน (GFL/GFM) ของอินเวอร์เตอร์ สมการพีชคณิตทางโครงข่ายบังคับให้กระแสที่ฉีดเข้าสู่เครือข่ายสมดุลกับกระแสของอุปกรณ์ทุกบัสตลอดเวลา</w:t>
+        <w:rPr>
+          <w:sz w:val="32"/>
+        </w:rPr>
+        <w:t>โดย x(t) คือตัวแปรสถานะเชิงอนุพันธ์, y(t) คือแรงดันเชิงพีชคณิตของบัส, u(t) คือสัญญาณควบคุมภายนอก และ m(t) คือเวกเตอร์ระบุโหมดการทำงาน (GFL/GFM) ของอินเวอร์เตอร์แต่ละเครื่อง สมการพีชคณิตกำหนดให้กระแสที่ฉีดเข้าสู่เครือข่ายสมดุลกับกระแสรวมของอุปกรณ์ทุกบัสตลอดเวลา</w:t>
       </w:r>
     </w:p>
     <w:p>
@@ -8020,6 +8022,9 @@
         <w:jc w:val="left"/>
       </w:pPr>
       <w:r>
+        <w:rPr>
+          <w:sz w:val="32"/>
+        </w:rPr>
         <w:t>ส่วน transient/subtransient EMF ใช้ time constants และ reactances ตามแบบจำลองมาตรฐานของเครื่องกำเนิดไฟฟ้า เนื่องจากค่า Tq0' = 0 ตัวแปร Ed' จึงถูกกำหนดให้เป็นความสัมพันธ์เชิงพีชคณิตโดยตรง เพื่อรักษาความถูกต้องของโครงสร้างแบบจำลองทางคณิตศาสตร์</w:t>
       </w:r>
     </w:p>
@@ -8030,6 +8035,9 @@
         <w:jc w:val="left"/>
       </w:pPr>
       <w:r>
+        <w:rPr>
+          <w:sz w:val="32"/>
+        </w:rPr>
         <w:t>เมื่อเบรกเกอร์ของ SG เปิด วงจรจะหยุดการจ่ายกระแสเข้าระบบ แต่ตัวแปรสถานะทางกลและฟลักซ์แม่เหล็กยังคงมีพลวัตการหมุนอิสระของโรเตอร์ (Natural Deceleration / Free Rotation) จึงสามารถตรวจสอบเงื่อนไขการซิงโครไนซ์ (Synchronism Criteria) ก่อนการสับเบรกเกอร์กลับเข้าระบบได้จริง โดยไม่มีการรีเซ็ตมุมหรือความเร็วรอบของเครื่องกำเนิดไฟฟ้าแบบฝืนสภาวะทางกายภาพ</w:t>
       </w:r>
     </w:p>
@@ -8040,6 +8048,9 @@
         <w:jc w:val="left"/>
       </w:pPr>
       <w:r>
+        <w:rPr>
+          <w:sz w:val="32"/>
+        </w:rPr>
         <w:t>5. การวิเคราะห์เสถียรภาพสัญญาณขนาดเล็ก (SSSA) เพื่อการคัดกรองชุดอุปกรณ์ GFM ออฟไลน์</w:t>
       </w:r>
     </w:p>
@@ -9186,6 +9197,9 @@
         <w:jc w:val="left"/>
       </w:pPr>
       <w:r>
+        <w:rPr>
+          <w:sz w:val="32"/>
+        </w:rPr>
         <w:t>การจัดการกรอบอ้างอิงของมุมโรเตอร์ (Reference Angle Alignment) เป็นขั้นตอนสำคัญของการวิเคราะห์ SSSA เนื่องจากโครงข่ายมีองศาอิสระของมุมเฟสร่วม โดยใช้วิธีการกำหนดพิกัดอ้างอิงของระบบเพื่อขจัดภาวะเอกฐานทางคณิตศาสตร์ (Singularity Elimination) ก่อนการสร้างเมทริกซ์สถานะและคำนวณไอเกนแวลู พร้อมทั้งคงสมการดุลกำลัง KCL ครบทุกแถว วิธีนี้ทำให้จำนวนรากที่ใช้ตัดสินใจสอดคล้องกับจำนวนองศาอิสระ (Degrees of Freedom) ตามโครงสร้างทางกายภาพของระบบอย่างแท้จริง</w:t>
       </w:r>
     </w:p>
@@ -9639,6 +9653,9 @@
         </w:rPr>
       </w:pPr>
       <w:r>
+        <w:rPr>
+          <w:sz w:val="32"/>
+        </w:rPr>
         <w:t>ตารางที่ 3 ผล SSSA ของสภาวะการทำงานเมื่อ SG ปลดออกจากระบบ: IBR2 เป็น GFM และ IBR3, 6, 8 เป็น GFL</w:t>
       </w:r>
     </w:p>
@@ -11308,6 +11325,9 @@
         <w:jc w:val="left"/>
       </w:pPr>
       <w:r>
+        <w:rPr>
+          <w:sz w:val="32"/>
+        </w:rPr>
         <w:t>spectrum ทางกายภาพของ configuration นี้อยู่ในระนาบครึ่งซ้ายทั้งหมด โดย mode ที่อยู่ขวาสุดคือ   และคู่ mode ของ DC link มี damping ratio ใกล้  ตามค่าเป้าหมายที่ออกแบบไว้</w:t>
       </w:r>
     </w:p>
@@ -11318,7 +11338,248 @@
         <w:jc w:val="left"/>
       </w:pPr>
       <w:r>
-        <w:t>เมื่อ SG offline ชุดย่อยของ IBR ที่เป็นไปได้ทั้งหมดมี  ชุด ระบบแก้จุดสมดุลและ SSSA ของทุกชุดจากเครือข่ายจริงของชุดนั้น ไม่ประมาณจากจำนวน GFM เพียงอย่างเดียว ผลที่ได้คือผ่านเกณฑ์ 7 จาก 15 ชุด โดยชุดที่ให้ค่าอัตราการสลายตัวของรากที่ช้าที่สุด (Ω) ต่ำสุดในกลุ่มที่ผ่านเกณฑ์คือชุดสองเครื่องที่บัส 3 และบัส 6 ซึ่งมี   ในขณะที่การให้ทั้งสี่ตัวเป็น GFM ให้   และชุดหนึ่งเครื่องที่ให้ค่า Ω ต่ำสุดให้   ผลนี้แสดงว่าการเพิ่มจำนวน GFM ไม่ได้ทำให้ damping margin ดีขึ้นแบบทางเดียว ซึ่งเป็นเหตุผลที่ตารางชุดอุปกรณ์ GFM ต้องคำนวณจริงทุกชุด ไม่สามารถอนุมานจากจำนวนอุปกรณ์ได้</w:t>
+        <w:rPr>
+          <w:sz w:val="32"/>
+          <w:szCs w:val="32"/>
+          <w:cs/>
+        </w:rPr>
+        <w:t xml:space="preserve">เมื่อ SG offline ชุดย่อยของ IBR ที่เป็นไปได้ทั้งหมดมี </w:t>
+      </w:r>
+      <m:oMath>
+        <m:sSup>
+          <m:sSupPr>
+            <m:ctrlPr>
+              <w:rPr>
+                <w:rFonts w:ascii="Cambria Math" w:hAnsi="Cambria Math"/>
+                <w:sz w:val="22"/>
+                <w:szCs w:val="22"/>
+              </w:rPr>
+            </m:ctrlPr>
+          </m:sSupPr>
+          <m:e>
+            <m:r>
+              <w:rPr>
+                <w:rFonts w:ascii="Cambria Math" w:hAnsi="Cambria Math"/>
+                <w:sz w:val="24"/>
+                <w:szCs w:val="24"/>
+              </w:rPr>
+              <m:t>2</m:t>
+            </m:r>
+          </m:e>
+          <m:sup>
+            <m:r>
+              <w:rPr>
+                <w:rFonts w:ascii="Cambria Math" w:hAnsi="Cambria Math"/>
+                <w:sz w:val="24"/>
+                <w:szCs w:val="24"/>
+              </w:rPr>
+              <m:t>4</m:t>
+            </m:r>
+          </m:sup>
+        </m:sSup>
+        <m:r>
+          <w:rPr>
+            <w:rFonts w:ascii="Cambria Math" w:hAnsi="Cambria Math"/>
+            <w:sz w:val="24"/>
+            <w:szCs w:val="24"/>
+          </w:rPr>
+          <m:t>-1=15</m:t>
+        </m:r>
+      </m:oMath>
+      <w:r>
+        <w:rPr>
+          <w:sz w:val="32"/>
+          <w:szCs w:val="32"/>
+          <w:cs/>
+        </w:rPr>
+        <w:t xml:space="preserve"> ชุด ระบบแก้จุดสมดุลและ SSSA ของทุกชุดจากเครือข่ายจริงของชุดนั้น ไม่ประมาณจากจำนวน GFM เพียงอย่างเดียว ผลที่ได้คือผ่านเกณฑ์ 7 จาก 15 ชุด โดยชุดที่ให้ damping margin ดีที่สุดคือชุดสองตัวที่บัส 3 และบัส 6 ซึ่งมี </w:t>
+      </w:r>
+      <m:oMath>
+        <m:r>
+          <w:rPr>
+            <w:rFonts w:ascii="Cambria Math" w:hAnsi="Cambria Math"/>
+            <w:sz w:val="24"/>
+            <w:szCs w:val="24"/>
+          </w:rPr>
+          <m:t>Ω=-0.</m:t>
+        </m:r>
+        <m:r>
+          <w:rPr>
+            <w:rFonts w:ascii="Cambria Math" w:hAnsi="Cambria Math"/>
+            <w:sz w:val="24"/>
+            <w:szCs w:val="24"/>
+          </w:rPr>
+          <m:t>56814</m:t>
+        </m:r>
+      </m:oMath>
+      <w:r>
+        <w:rPr>
+          <w:sz w:val="32"/>
+          <w:szCs w:val="32"/>
+          <w:cs/>
+        </w:rPr>
+        <w:t xml:space="preserve"> </w:t>
+      </w:r>
+      <m:oMath>
+        <m:sSup>
+          <m:sSupPr>
+            <m:ctrlPr>
+              <w:rPr>
+                <w:rFonts w:ascii="Cambria Math" w:hAnsi="Cambria Math"/>
+              </w:rPr>
+            </m:ctrlPr>
+          </m:sSupPr>
+          <m:e>
+            <m:r>
+              <m:rPr>
+                <m:nor/>
+                <w:sz w:val="24"/>
+                <w:szCs w:val="24"/>
+              </m:rPr>
+              <m:t>s</m:t>
+            </m:r>
+          </m:e>
+          <m:sup>
+            <m:r>
+              <w:rPr>
+                <w:rFonts w:ascii="Cambria Math" w:hAnsi="Cambria Math"/>
+                <w:sz w:val="24"/>
+                <w:szCs w:val="24"/>
+              </w:rPr>
+              <m:t>-1</m:t>
+            </m:r>
+          </m:sup>
+        </m:sSup>
+      </m:oMath>
+      <w:r>
+        <w:rPr>
+          <w:sz w:val="32"/>
+          <w:szCs w:val="32"/>
+          <w:cs/>
+        </w:rPr>
+        <w:t xml:space="preserve"> ในขณะที่การให้ทั้งสี่ตัวเป็น GFM ให้ </w:t>
+      </w:r>
+      <m:oMath>
+        <m:r>
+          <w:rPr>
+            <w:rFonts w:ascii="Cambria Math" w:hAnsi="Cambria Math"/>
+            <w:sz w:val="24"/>
+            <w:szCs w:val="24"/>
+          </w:rPr>
+          <m:t>Ω=-0.48291</m:t>
+        </m:r>
+      </m:oMath>
+      <w:r>
+        <w:rPr>
+          <w:sz w:val="32"/>
+          <w:szCs w:val="32"/>
+          <w:cs/>
+        </w:rPr>
+        <w:t xml:space="preserve"> </w:t>
+      </w:r>
+      <m:oMath>
+        <m:sSup>
+          <m:sSupPr>
+            <m:ctrlPr>
+              <w:rPr>
+                <w:rFonts w:ascii="Cambria Math" w:hAnsi="Cambria Math"/>
+              </w:rPr>
+            </m:ctrlPr>
+          </m:sSupPr>
+          <m:e>
+            <m:r>
+              <m:rPr>
+                <m:nor/>
+                <w:sz w:val="24"/>
+                <w:szCs w:val="24"/>
+              </m:rPr>
+              <m:t>s</m:t>
+            </m:r>
+          </m:e>
+          <m:sup>
+            <m:r>
+              <w:rPr>
+                <w:rFonts w:ascii="Cambria Math" w:hAnsi="Cambria Math"/>
+                <w:sz w:val="24"/>
+                <w:szCs w:val="24"/>
+              </w:rPr>
+              <m:t>-1</m:t>
+            </m:r>
+          </m:sup>
+        </m:sSup>
+      </m:oMath>
+      <w:r>
+        <w:rPr>
+          <w:sz w:val="32"/>
+          <w:szCs w:val="32"/>
+          <w:cs/>
+        </w:rPr>
+        <w:t xml:space="preserve"> และชุดตัวเดียวที่ดีที่สุดให้ </w:t>
+      </w:r>
+      <m:oMath>
+        <m:r>
+          <w:rPr>
+            <w:rFonts w:ascii="Cambria Math" w:hAnsi="Cambria Math"/>
+            <w:sz w:val="24"/>
+            <w:szCs w:val="24"/>
+          </w:rPr>
+          <m:t>Ω=-0.</m:t>
+        </m:r>
+        <m:r>
+          <w:rPr>
+            <w:rFonts w:ascii="Cambria Math" w:hAnsi="Cambria Math"/>
+            <w:sz w:val="24"/>
+            <w:szCs w:val="24"/>
+          </w:rPr>
+          <m:t>32801</m:t>
+        </m:r>
+      </m:oMath>
+      <w:r>
+        <w:rPr>
+          <w:sz w:val="32"/>
+          <w:szCs w:val="32"/>
+          <w:cs/>
+        </w:rPr>
+        <w:t xml:space="preserve"> </w:t>
+      </w:r>
+      <m:oMath>
+        <m:sSup>
+          <m:sSupPr>
+            <m:ctrlPr>
+              <w:rPr>
+                <w:rFonts w:ascii="Cambria Math" w:hAnsi="Cambria Math"/>
+              </w:rPr>
+            </m:ctrlPr>
+          </m:sSupPr>
+          <m:e>
+            <m:r>
+              <m:rPr>
+                <m:nor/>
+                <w:sz w:val="24"/>
+                <w:szCs w:val="24"/>
+              </m:rPr>
+              <m:t>s</m:t>
+            </m:r>
+          </m:e>
+          <m:sup>
+            <m:r>
+              <w:rPr>
+                <w:rFonts w:ascii="Cambria Math" w:hAnsi="Cambria Math"/>
+                <w:sz w:val="24"/>
+                <w:szCs w:val="24"/>
+              </w:rPr>
+              <m:t>-1</m:t>
+            </m:r>
+          </m:sup>
+        </m:sSup>
+      </m:oMath>
+      <w:r>
+        <w:rPr>
+          <w:sz w:val="32"/>
+          <w:szCs w:val="32"/>
+          <w:cs/>
+        </w:rPr>
+        <w:t xml:space="preserve"> ผลนี้แสดงว่าการเพิ่มจำนวน GFM ไม่ได้ทำให้ damping margin ดีขึ้นแบบทางเดียว ซึ่งเป็นเหตุผลที่ตารางชุด candidate ต้องคำนวณจริงทุกชุด ไม่สามารถอนุมานจากจำนวนอุปกรณ์ได้</w:t>
       </w:r>
     </w:p>
     <w:p>
@@ -11332,6 +11593,9 @@
         </w:rPr>
       </w:pPr>
       <w:r>
+        <w:rPr>
+          <w:sz w:val="32"/>
+        </w:rPr>
         <w:t>ตารางที่ 4 สรุปการคัดกรองชุดอุปกรณ์ GFM ทั้ง 15 ทางเลือกเมื่อ SG ปลดออกจากระบบ</w:t>
       </w:r>
     </w:p>
@@ -11529,7 +11793,30 @@
           </w:tcPr>
           <w:p>
             <w:r>
-              <w:t>ทุกชุดตัวเดียวผ่านการคัดกรองเชิงเส้น; ชุดที่ให้ค่า Ω ต่ำสุดคือบัส 2 ()</w:t>
+              <w:rPr>
+                <w:sz w:val="26"/>
+                <w:szCs w:val="26"/>
+                <w:cs/>
+              </w:rPr>
+              <w:t>ทุกชุดตัวเดียวผ่านการคัดกรองเชิงเส้น; ชุดที่ดีที่สุดคือบัส 2 (</w:t>
+            </w:r>
+            <m:oMath>
+              <m:r>
+                <w:rPr>
+                  <w:rFonts w:ascii="Cambria Math" w:hAnsi="Cambria Math"/>
+                  <w:sz w:val="24"/>
+                  <w:szCs w:val="24"/>
+                </w:rPr>
+                <m:t>Ω=-0.32801</m:t>
+              </m:r>
+            </m:oMath>
+            <w:r>
+              <w:rPr>
+                <w:sz w:val="26"/>
+                <w:szCs w:val="26"/>
+                <w:cs/>
+              </w:rPr>
+              <w:t>)</w:t>
             </w:r>
           </w:p>
         </w:tc>
@@ -11861,6 +12148,9 @@
         <w:jc w:val="left"/>
       </w:pPr>
       <w:r>
+        <w:rPr>
+          <w:sz w:val="32"/>
+        </w:rPr>
         <w:t>ชุดที่ผ่านเกณฑ์ไม่เป็นฟังก์ชันทางเดียวของจำนวน GFM: ชุดสามตัวไม่มีชุดใดผ่านเลย ในขณะที่ชุดสองตัวและชุดสี่ตัวผ่าน ผลนี้ทำให้การแจงนับทุกชุดเป็นสิ่งจำเป็น ไม่ใช่ทางเลือก</w:t>
       </w:r>
     </w:p>
@@ -13413,6 +13703,9 @@
         <w:jc w:val="left"/>
       </w:pPr>
       <w:r>
+        <w:rPr>
+          <w:sz w:val="32"/>
+        </w:rPr>
         <w:t>การกำหนดตำแหน่งเหตุการณ์รบกวนได้รับการจัดการอย่างแม่นยำ โดยทำการจัดขอบเขตเหตุการณ์ (Event Alignment) ให้ตรงกับรอยต่อของขั้นเวลาเชิงตัวเลข เพื่อรักษาความถูกต้องของสมการดุลกำลัง KCL และป้องกันการเกิดความไม่ต่อเนื่องเชิงตัวเลข (Numerical Discontinuity)</w:t>
       </w:r>
     </w:p>
@@ -13423,6 +13716,9 @@
         <w:jc w:val="left"/>
       </w:pPr>
       <w:r>
+        <w:rPr>
+          <w:sz w:val="32"/>
+        </w:rPr>
         <w:t>การประยุกต์ใช้วิธีปรับขนาดขั้นเวลาอัตโนมัติ (Adaptive Time-step) ให้ผลลัพธ์ทางพลวัตที่สอดคล้องกับวิธีขั้นเวลาคงที่ (Fixed Time-step) โดยสามารถรักษาความแม่นยำของวิถีการตอบสนองเชิงเวลา (Transient Trajectory) ได้อย่างถูกต้อง</w:t>
       </w:r>
     </w:p>
@@ -16357,6 +16653,9 @@
         <w:jc w:val="left"/>
       </w:pPr>
       <w:r>
+        <w:rPr>
+          <w:sz w:val="32"/>
+        </w:rPr>
         <w:t>ในโครงสร้างแบบจำลอง 17 สถานะ โหมด GFL มีตัวแปรสถานะทำงาน 10 ตัว และโหมด GFM มี 11 ตัว โดยสถานะของสาขาการควบคุมที่ไม่ได้ใช้งาน (Inactive Control Branch) จะถูกตรึงค่า (Hold) ไว้ เพื่อใช้เป็นเงื่อนไขเริ่มต้นสำหรับการถ่ายโอนสถานะ (State Transfer) ในการสลับโหมดครั้งถัดไป</w:t>
       </w:r>
     </w:p>
@@ -24296,6 +24595,9 @@
         </w:rPr>
       </w:pPr>
       <w:r>
+        <w:rPr>
+          <w:sz w:val="32"/>
+        </w:rPr>
         <w:t>ค่า Edc ถูกคำนวณจากสภาวะสมดุลของแหล่งจ่าย DC เพื่อรักษาความสอดคล้องของจุดทำงาน (Operating Point Consistency) และค่าพารามิเตอร์ของระบบควบคุมถูกตรวจสอบว่าให้ตำแหน่งโพลทางพลวัตอยู่ในระนาบเชิงซ้อนด้านซ้ายเพื่อรับประกันเสถียรภาพ</w:t>
       </w:r>
     </w:p>
@@ -25735,6 +26037,9 @@
         <w:jc w:val="left"/>
       </w:pPr>
       <w:r>
+        <w:rPr>
+          <w:sz w:val="32"/>
+        </w:rPr>
         <w:t>การลด command-delay states แบบจำลองต้นทางมี actuation delay สองแกน แต่ delay เชิงกายภาพจาก digital control ประมาณ  ms ที่  kHz ซึ่งเล็กกว่า phasor time step หลายร้อยเท่า จึงใช้ singular-perturbation reduction  เพื่อตัด fast states ที่ RMS model ไม่สามารถ resolve ได้ การลดนี้คง equilibrium และ retained-state equations เดิม แต่ลดมิติของแบบจำลองจากโครงสร้างเดิม 20 สถานะเหลือ 16 สถานะ ก่อนเพิ่ม  เป็น state ที่ 17</w:t>
       </w:r>
     </w:p>
@@ -27215,7 +27520,10 @@
         <w:jc w:val="left"/>
       </w:pPr>
       <w:r>
-        <w:t>จุดสำคัญของ GFL คือต้องอาศัยแรงดันและมุมเฟสของโครงข่ายในการซิงโครไนซ์ผ่าน PLL ดังนั้นเมื่อสูญเสีย SG และไม่มีอินเวอร์เตอร์ตัวใดทำหน้าที่สร้างโครงข่าย (GFM) ระบบจะไม่มีแหล่งอ้างอิงแรงดันและมุมเฟส (Loss of Voltage-Forming Reference) ส่งผลให้เกิดสภาวะแรงดันพังทลายและสูญเสียเสถียรภาพอย่างสมบูรณ์ตามข้อจำกัดทางกายภาพของโครงข่าย</w:t>
+        <w:rPr>
+          <w:sz w:val="32"/>
+        </w:rPr>
+        <w:t>จุดสำคัญของโหมด GFL คือต้องอาศัยแรงดันและมุมเฟสของโครงข่ายเป็นสัญญาณอ้างอิงผ่าน PLL ดังนั้นหลัง SG ถูกปลด ระบบต้องมีแหล่งกำหนดแรงดันและมุมอ้างอิงจาก IBR ที่ทำงานแบบ GFM</w:t>
       </w:r>
     </w:p>
     <w:p>
@@ -33060,6 +33368,9 @@
         <w:jc w:val="left"/>
       </w:pPr>
       <w:r>
+        <w:rPr>
+          <w:sz w:val="32"/>
+        </w:rPr>
         <w:t>เช่นเดียวกับหัวข้อที่ 7 สมการของตัวกำกับไม่มีค่าคงตัวเขียนอยู่ในสมการ ตารางที่ 7 รวบรวมระดับกระตุ้น เวลาหน่วง ฐานของดัชนี และเกณฑ์เชิงตัวเลขทั้งหมดไว้ที่เดียว ทุกค่าถูกตรึงก่อนการประเมินชุดอุปกรณ์</w:t>
       </w:r>
     </w:p>
@@ -35041,6 +35352,9 @@
         <w:jc w:val="left"/>
       </w:pPr>
       <w:r>
+        <w:rPr>
+          <w:sz w:val="32"/>
+        </w:rPr>
         <w:t>จากผลการจำลองในรูปที่ 4 และรูปที่ 5 หลัง SG1 ถูกปลดที่ 20.000 s IBR2 ทำการสลับโหมดเป็น GFM ทันทีเพื่อทำหน้าที่สร้างแรงดันและเป็นมุมอ้างอิงของเกาะ จากนั้นที่เวลา 22.089 s ดัชนีความรุนแรงกระตุ้นให้ IBR6 สลับเป็น GFM เพิ่มอีกหนึ่งเครื่อง และปลดกลับสู่โหมด GFL ที่เวลา 25.303 s เมื่อระบบเริ่มเข้าสู่สภาวะสมดุล หลังเกิดฟอลต์ที่บัส 9 ในช่วง 60.000–60.150 s การจำลองสามารถดำเนินต่อไปผ่านช่วงฟอลต์ 60.000–60.150 s และเบรกเกอร์ของ SG1 สับปิดกลับเข้าระบบที่เวลา 102.363 s ตามเกณฑ์การซิงโครไนซ์ และ IBR2 สลับคืนสู่โหมด GFL ตามเกณฑ์ความต่อเนื่องที่เวลา 116.238 s</w:t>
       </w:r>
     </w:p>
@@ -35315,6 +35629,9 @@
         <w:jc w:val="left"/>
       </w:pPr>
       <w:r>
+        <w:rPr>
+          <w:sz w:val="32"/>
+        </w:rPr>
         <w:t>การเปรียบเทียบสมรรถนะของระบบดำเนินการระหว่าง "กรณีสลับโหมด" (Adaptive GFL/GFM) และ "กรณีตรึงโหมด GFL" (Fixed GFL) ภายใต้โครงข่ายและลำดับเหตุการณ์รบกวนเดียวกันบนขอบเขตเวลา 160.000 s ทั้งนี้ กรณีตรึงโหมด GFL ทำหน้าที่เป็นกรณีวินิจฉัยเชิงเปรียบเทียบ ซึ่งจำเป็นต้องคงกรอบอ้างอิงแรงดันไว้เพื่อให้สามารถจำลองพฤติกรรมต่อไปได้หลัง SG1 ถูกปลดออก</w:t>
       </w:r>
     </w:p>
@@ -35327,9 +35644,8 @@
       <w:r>
         <w:rPr>
           <w:sz w:val="32"/>
-          <w:szCs w:val="32"/>
         </w:rPr>
-        <w:t>ผลการจำลองแสดงให้เห็นว่า ในกรณีตรึงโหมด GFL ระบบไม่สามารถรักษาระดับแรงดันและมุมอ้างอิงได้หลังสูญเสีย SG1 ในขณะที่กรณีสลับโหมด ตัวกำกับอัตโนมัติสามารถสั่งการให้ IBR สลับบทบาทเป็น GFM เพื่อสร้างแรงดันและควบคุมความถี่ของระบบเกาะได้อย่างต่อเนื่อง</w:t>
+        <w:t>ผลการจำลองเปรียบเทียบแสดงให้เห็นความแตกต่างของพฤติกรรมทางพลวัต: ในกรณีสลับโหมด ตัวกำกับอัตโนมัติสั่งการให้ IBR2 และ IBR6 เปลี่ยนบทบาทเป็น GFM เพื่อสร้างแรงดันและควบคุมความถี่ของระบบเกาะ ส่งผลให้ระบบมีความพร้อมสำหรับการต่อคืน SG1 ขณะที่ในกรณีตรึงโหมด GFL ซึ่งคงกรอบอ้างอิงไว้เพื่อการวินิจฉัยเชิงเปรียบเทียบ การตอบสนองของแรงดันและกำลังไฟฟ้ามีความผันผวนสูง และเงื่อนไขทางมุมเฟสไม่ผ่านเกณฑ์การซิงโครไนซ์ ทำให้เบรกเกอร์ของ SG1 ไม่สามารถปิดกลับเข้าระบบได้</w:t>
       </w:r>
     </w:p>
     <w:p>
@@ -35856,6 +36172,9 @@
         <w:jc w:val="left"/>
       </w:pPr>
       <w:r>
+        <w:rPr>
+          <w:sz w:val="32"/>
+        </w:rPr>
         <w:t>โดย  คือแอดมิตแตนซ์ของโหลดที่จุดทำงาน PF และ  เป็นฟังก์ชันบ่งชี้ที่มีค่า 1 เฉพาะช่วงที่เครือข่ายอยู่ในสถานะ fault พจน์  จึงคือแอดมิตแตนซ์ของ fault ที่ประทับลงบัสเดียวกัน ลำดับเหตุการณ์ชุดนี้ไม่มีการเพิ่มโหลด ตัวคูณ  จึงคงค่าตลอดการรัน และหน้าต่าง – วินาที รวมกระแส fault ไว้ตามที่เกิดขึ้นจริง การทวนสอบความถูกต้องของสภาวะเริ่มต้นกำหนดที่  คือค่าที่คำนวณย้อนได้ต้องเท่ากับข้อมูลโหลดของกรณีศึกษาและแรงดัน PF ภายใน  pu ซึ่งได้  pu,  pu และ  pu ตรงทุกหลัก ทั้งสองกรณี</w:t>
       </w:r>
     </w:p>
@@ -35866,7 +36185,10 @@
         <w:jc w:val="left"/>
       </w:pPr>
       <w:r>
-        <w:t>แผงที่ (d) แสดงความถี่ที่บัส 9 ซึ่งคำนวณจากอนุพันธ์ของมุมแรงดันบัส ในกรณีสลับโหมด ระบบสามารถรักษาระดับแรงดันและเสถียรภาพความถี่ไว้ได้ ขณะที่กรณีตรึงโหมด GFL ถูกใช้เป็นกรณีวินิจฉัย เพื่อเปรียบเทียบพฤติกรรมของโครงข่ายเมื่อไม่มีการเปลี่ยนบทบาทของอุปกรณ์ ซึ่งแสดงให้เห็นว่าการทำงานแบบ GFL เพียงอย่างเดียวโดยไม่มีแหล่งสร้างแรงดันหลัก จะไม่สามารถรองรับสภาวะการทำงานของระบบแยกตัวเป็นเกาะได้อย่างมีเสถียรภาพ</w:t>
+        <w:rPr>
+          <w:sz w:val="32"/>
+        </w:rPr>
+        <w:t>แผงที่ (d) แสดงความถี่ที่บัส 9 ซึ่งคำนวณจากอนุพันธ์ของมุมแรงดันบัสเชิงพีชคณิต ทำให้สามารถเปรียบเทียบพฤติกรรมความถี่ของทั้งสองกรณีบนตัวแปรเดียวกันได้โดยตรง</w:t>
       </w:r>
     </w:p>
     <w:p>
@@ -35969,7 +36291,10 @@
         <w:jc w:val="left"/>
       </w:pPr>
       <w:r>
-        <w:t>จากรูปที่ 8 ในช่วงระบบแยกตัวเป็นเกาะ (t = 20.000–100.000 s) การตอบสนองของแรงดัน กำลังไฟฟ้า และความถี่ที่บัส 9 ของกรณีสลับโหมดและกรณีตรึงโหมด GFL เป็นไปตามเส้นการตอบสนองที่แสดงในรูปที่ 8 โดยกรณีสลับโหมดมีระดับแรงดันและความถี่ที่พร้อมสำหรับการซิงโครไนซ์เพื่อรับ SG1 กลับเข้าระบบที่เวลา 102.363 s ขณะที่กรณีตรึงโหมด GFL มีการแกว่งของแรงดันและกำลังไฟฟ้าอย่างรุนแรงและไม่เกิดการปิดเบรกเกอร์ของ SG1</w:t>
+        <w:rPr>
+          <w:sz w:val="32"/>
+        </w:rPr>
+        <w:t>จากรูปที่ 8 ในช่วงระบบแยกตัวเป็นเกาะ (t = 20.000–100.000 s) การตอบสนองของแรงดัน กำลังไฟฟ้าจริง กำลังไฟฟ้ารีแอกทีฟ และความถี่ที่บัส 9 ของทั้งสองกรณีเป็นไปตามเส้นการตอบสนองที่แสดงในรูปที่ 8 โดยกรณีสลับโหมดสามารถควบคุมระดับแรงดันและจ่ายกำลังไฟฟ้าไปยังโหลดได้อย่างต่อเนื่อง พร้อมทั้งมีมุมเฟสที่สอดคล้องกับเกณฑ์การซิงโครไนซ์ที่เวลา 102.363 s ขณะที่กรณีตรึงโหมด GFL มีการแกว่งของแรงดันและกำลังไฟฟ้า และไม่เกิดการปิดเบรกเกอร์ของ SG1</w:t>
       </w:r>
     </w:p>
     <w:p>
@@ -35982,16 +36307,6 @@
         <w:rPr>
           <w:sz w:val="32"/>
         </w:rPr>
-        <w:t>ดังนั้น การสลับโหมดเป็น GFM อัตโนมัติช่วยรักษาเสถียรภาพแรงดันและความถี่ของโครงข่ายในช่วงที่ระบบแยกตัวเป็นเกาะ และทำให้เงื่อนไขทางมุมและแรงดันมีความพร้อมสำหรับการสับเบรกเกอร์ของ SG1 กลับเข้าระบบได้ตามเงื่อนไขการซิงโครไนซ์ที่เวลา 102.363 s</w:t>
-      </w:r>
-    </w:p>
-    <w:p>
-      <w:pPr>
-        <w:spacing w:line="320" w:lineRule="exact"/>
-        <w:ind w:firstLine="360"/>
-        <w:jc w:val="left"/>
-      </w:pPr>
-      <w:r>
         <w:t>ความถี่ที่บัส 9 ในช่วงระบบแยกตัวเป็นเกาะของทั้งสองกรณีเป็นไปตามช่วงค่าที่แสดงในรูปที่ 8(d) โดยกรณีสลับโหมดมีการควบคุมแรงดันเพื่อรองรับการจ่ายกำลังไฟฟ้าไปยังโหลด และทำให้เงื่อนไขทางมุมและแรงดันมีความพร้อมตามเกณฑ์การซิงโครไนซ์สำหรับการต่อคืน SG1 กลับเข้าระบบ</w:t>
       </w:r>
     </w:p>
@@ -36265,6 +36580,9 @@
         <w:jc w:val="left"/>
       </w:pPr>
       <w:r>
+        <w:rPr>
+          <w:sz w:val="32"/>
+        </w:rPr>
         <w:t>12. ข้อจำกัดและขอบเขตของงาน</w:t>
       </w:r>
     </w:p>
@@ -36275,10 +36593,17 @@
         <w:jc w:val="left"/>
       </w:pPr>
       <w:r>
+        <w:rPr>
+          <w:sz w:val="32"/>
+        </w:rPr>
         <w:t>แบบจำลองที่ใช้ในการศึกษานี้เป็นระบบสมดุลสามเฟสในกรอบ RMS phasor จึงไม่ครอบคลุมปรากฏการณ์ทรานเชียนต์เชิงแม่เหล็กไฟฟ้าความถี่สูง และสภาวะความไม่สมดุลของระบบไฟฟ้ากำลัง การทดสอบและผลลัพธ์ผูกกับระบบทดสอบ IEEE 14-bus และลำดับเหตุการณ์รบกวนที่กำหนดในกรณีศึกษา โดยยังไม่ได้ประเมินความสอดคล้องกับข้อกำหนดการเชื่อมต่อระบบโครงข่าย (Grid Codes) ครบทุกมิติ หรือการประยุกต์ใช้ในระบบที่มีขนาดใหญ่กว่า</w:t>
       </w:r>
     </w:p>
-    <w:p/>
+    <w:p>
+      <w:pPr>
+        <w:jc w:val="left"/>
+      </w:pPr>
+    </w:p>
     <w:p>
       <w:pPr>
         <w:keepNext/>
@@ -36298,28 +36623,52 @@
       </w:r>
     </w:p>
     <w:p>
+      <w:pPr>
+        <w:jc w:val="left"/>
+      </w:pPr>
       <w:r>
+        <w:rPr>
+          <w:sz w:val="32"/>
+        </w:rPr>
         <w:t>1.</w:t>
         <w:tab/>
         <w:t>ได้แบบจำลองอุปกรณ์ IBR สำหรับการทำงานแบบ GFL (10 สถานะ) และ GFM (11 สถานะ) ภายในอุปกรณ์ชุดเดียวกัน</w:t>
       </w:r>
     </w:p>
     <w:p>
+      <w:pPr>
+        <w:jc w:val="left"/>
+      </w:pPr>
       <w:r>
+        <w:rPr>
+          <w:sz w:val="32"/>
+        </w:rPr>
         <w:t>2.</w:t>
         <w:tab/>
         <w:t>ได้กลไกตัวกำกับอัตโนมัติสำหรับการตัดสินใจสลับโหมดตามสภาวะแรงดันและความถี่ของระบบ พร้อมการถ่ายโอนสถานะอย่างต่อเนื่อง</w:t>
       </w:r>
     </w:p>
     <w:p>
+      <w:pPr>
+        <w:jc w:val="left"/>
+      </w:pPr>
       <w:r>
+        <w:rPr>
+          <w:sz w:val="32"/>
+        </w:rPr>
         <w:t>3.</w:t>
         <w:tab/>
         <w:t>ได้ผลการทดสอบเชิงพลวัตบนระบบ IEEE 14-bus ภายใต้เหตุการณ์ปลดเครื่องกำเนิดไฟฟ้า เกิดฟอลต์ และการต่อคืนเครื่องกำเนิดไฟฟ้าซิงโครนัส</w:t>
       </w:r>
     </w:p>
     <w:p>
+      <w:pPr>
+        <w:jc w:val="left"/>
+      </w:pPr>
       <w:r>
+        <w:rPr>
+          <w:sz w:val="32"/>
+        </w:rPr>
         <w:t>4.</w:t>
         <w:tab/>
         <w:t>ได้ผลการเปรียบเทียบเชิงวิศวกรรมระหว่างกรณีสลับโหมดกับกรณีตรึงโหมด GFL เพื่อเป็นแนวทางในการศึกษาการรักษาเสถียรภาพระบบไฟฟ้ากำลัง</w:t>
@@ -36352,6 +36701,9 @@
         <w:jc w:val="left"/>
       </w:pPr>
       <w:r>
+        <w:rPr>
+          <w:sz w:val="32"/>
+        </w:rPr>
         <w:t>1.</w:t>
         <w:tab/>
         <w:t>หลังเครื่องกำเนิดไฟฟ้าซิงโครนัสหลัก (SG1) ถูกปลดออกจากระบบ หากไม่มีอินเวอร์เตอร์ตัวใดทำหน้าที่สร้างโครงข่าย (GFM) ระบบจะไม่มีแหล่งกำหนดแรงดันและมุมอ้างอิงของโครงข่าย ซึ่งเป็นข้อจำกัดทางกายภาพของการทำงานในระบบไฟฟ้ากำลัง</w:t>
@@ -36394,6 +36746,9 @@
         <w:jc w:val="left"/>
       </w:pPr>
       <w:r>
+        <w:rPr>
+          <w:sz w:val="32"/>
+        </w:rPr>
         <w:t>3.</w:t>
         <w:tab/>
         <w:t>ชุดอุปกรณ์ GFM ที่ผ่านการวิเคราะห์เสถียรภาพสัญญาณขนาดเล็ก ไม่ได้รับประกันว่าวิถีการตอบสนองแบบไม่เชิงเส้นจะไปถึงจุดสมดุลนั้นได้เสมอ เนื่องจากพฤติกรรมทรานเชียนต์และข้อจำกัดของกระแสอุปกรณ์</w:t>
@@ -36561,6 +36916,9 @@
         <w:jc w:val="left"/>
       </w:pPr>
       <w:r>
+        <w:rPr>
+          <w:sz w:val="32"/>
+        </w:rPr>
         <w:t>1.</w:t>
         <w:tab/>
         <w:t>กำหนดเกณฑ์ความปลอดภัยของมุมอ้างอิง: ตรวจสอบความพร้อมของแหล่งจ่ายที่สามารถทำหน้าที่สร้างโครงข่าย (GFM) ก่อนเกิดการแยกตัวเป็นเกาะ เพื่อป้องกันการเกิดภาวะสูญเสียเสถียรภาพทางแรงดันและมุมเฟส</w:t>
@@ -36576,6 +36934,9 @@
         <w:jc w:val="left"/>
       </w:pPr>
       <w:r>
+        <w:rPr>
+          <w:sz w:val="32"/>
+        </w:rPr>
         <w:t>2.</w:t>
         <w:tab/>
         <w:t>ใช้เวกเตอร์สถานะขนาดคงที่ 17 สถานะ คง state ของภาคกำลังไว้ กำหนดค่าเริ่มต้นให้สาขาปลายทางจากพอร์ตปลายทางเดิม และตรวจความต่อเนื่องของกระแสก่อน การสั่งการ</w:t>
@@ -36618,6 +36979,9 @@
         <w:jc w:val="left"/>
       </w:pPr>
       <w:r>
+        <w:rPr>
+          <w:sz w:val="32"/>
+        </w:rPr>
         <w:t>4.</w:t>
         <w:tab/>
         <w:t>ประยุกต์ใช้วิธีคำนวณแบบสี่เหลี่ยมคางหมูอิมพลิซิตร่วมกับการควบคุมขนาดขั้นเวลาอัตโนมัติ และการจัดตำแหน่งเหตุการณ์ให้ตรงกับขอบเขตขั้นเวลา (Event-to-Time-step Boundary Alignment) เพื่อรักษาความต่อเนื่องทางคณิตศาสตร์และเสถียรภาพเชิงตัวเลขของการจำลอง</w:t>
@@ -36704,6 +37068,9 @@
         <w:jc w:val="left"/>
       </w:pPr>
       <w:r>
+        <w:rPr>
+          <w:sz w:val="32"/>
+        </w:rPr>
         <w:t>2.</w:t>
         <w:tab/>
         <w:t>ทดสอบกรอบการคัดเลือกชุด GFM บนระบบที่ใหญ่กว่า IEEE 14-bus และมีจำนวน IBR มากกว่าสี่ตัว เพื่อประเมินการขยายขนาดของการพิจารณาชุดอุปกรณ์ทางเลือก ซึ่งเติบโตแบบเลขชี้กำลังตามจำนวนอุปกรณ์</w:t>
@@ -36719,6 +37086,9 @@
         <w:jc w:val="left"/>
       </w:pPr>
       <w:r>
+        <w:rPr>
+          <w:sz w:val="32"/>
+        </w:rPr>
         <w:t>3.</w:t>
         <w:tab/>
         <w:t>พัฒนาเกณฑ์คัดเลือกชุดอุปกรณ์ GFM ให้พิจารณาร่วมกันทั้ง damping ratio, การรองรับแรงดัน ระดับการใช้งานของคอนเวอร์เตอร์ พลังงานสำรอง และต้นทุนของการสลับโหมด แทนการใช้ damping margin เพียงตัวเดียว</w:t>

</xml_diff>

<commit_message>
docs(report): final proofreading & natural technical Thai pass — restored Bus 9 validation values, replaced 'สายงานคำนวณ' with 'โครงสร้างการคำนวณ', refined GFL claim, natural Thai idioms, summary header 'ผลที่ได้'
</commit_message>
<xml_diff>
--- a/docs/source/Forming Framework for Inverter-Based Resources.docx
+++ b/docs/source/Forming Framework for Inverter-Based Resources.docx
@@ -286,13 +286,9 @@
         <w:jc w:val="left"/>
       </w:pPr>
       <w:r>
-        <w:rPr>
-          <w:sz w:val="32"/>
-          <w:szCs w:val="32"/>
-        </w:rPr>
         <w:t>1.</w:t>
         <w:tab/>
-        <w:t>ศึกษาและพัฒนาสายงานคำนวณระบบไฟฟ้ากำลังที่เชื่อมโยงการไหลของกำลัง (Power Flow: PF) และการจำลองโดเมนเวลา (Time-Domain Simulation: TS) ภายใต้โครงสร้างแบบจำลองเดียวกัน</w:t>
+        <w:t>ศึกษาและพัฒนาโครงสร้างการคำนวณระบบไฟฟ้ากำลังที่เชื่อมโยงการคำนวณการไหลของกำลัง (PF) และการจำลองในโดเมนเวลา (TS) ภายใต้แบบจำลองเดียวกัน</w:t>
       </w:r>
     </w:p>
     <w:p>
@@ -324,13 +320,9 @@
         <w:jc w:val="left"/>
       </w:pPr>
       <w:r>
-        <w:rPr>
-          <w:sz w:val="32"/>
-          <w:szCs w:val="32"/>
-        </w:rPr>
         <w:t>3.</w:t>
         <w:tab/>
-        <w:t>พัฒนากลไกกำกับอัตโนมัติ (supervisor) สำหรับตัดสินใจสลับโหมดการทำงานระหว่าง GFL และ GFM ตามสภาวะของระบบ พร้อมกลไกถ่ายโอนสถานะเพื่อรักษาความต่อเนื่องของกระแสที่จุดเชื่อมต่อ</w:t>
+        <w:t>พัฒนาตัวกำกับอัตโนมัติ (Supervisor) สำหรับสั่งเปลี่ยนโหมดระหว่าง GFL และ GFM ตามสภาวะของระบบ และกำหนดการถ่ายโอนสถานะขณะเปลี่ยนโหมด</w:t>
       </w:r>
     </w:p>
     <w:p>
@@ -391,10 +383,7 @@
         <w:jc w:val="left"/>
       </w:pPr>
       <w:r>
-        <w:rPr>
-          <w:sz w:val="32"/>
-        </w:rPr>
-        <w:t>อุปกรณ์ IBR ที่ทำงานในโหมด Grid-Following (GFL) ต้องอาศัยแรงดันและมุมเฟสของโครงข่ายเป็นสัญญาณอ้างอิงผ่านวงจร Phase-Locked Loop (PLL) ขณะที่โหมด Grid-Forming (GFM) สามารถกำหนดมุมและขนาดแรงดันอ้างอิงได้เอง จึงมีบทบาทสำคัญในการรักษาเสถียรภาพเมื่อระบบสูญเสียเครื่องกำเนิดไฟฟ้าซิงโครนัส [1]–[4] โครงงานนี้ศึกษากรอบการทำงานสำหรับการสลับโหมด GFL และ GFM โดยอัตโนมัติตามสภาวะของระบบ โดยใช้ผลการคำนวณการไหลของกำลัง จุดสมดุล และการวิเคราะห์เสถียรภาพสัญญาณขนาดเล็กประกอบการตัดสินใจ และทดสอบบนระบบ IEEE 14-bus ซึ่งประกอบด้วย SG ที่บัส 1 และ IBR จำนวน 4 เครื่องที่บัส 2, 3, 6 และ 8 ดังรูปที่ 1</w:t>
+        <w:t>แหล่งพลังงานที่เชื่อมต่อผ่านอินเวอร์เตอร์ (IBR) มีบทบาทเพิ่มขึ้นอย่างต่อเนื่องในระบบไฟฟ้ากำลัง การทำงานในโหมด Grid-Following (GFL) ต้องอาศัยแรงดันและมุมเฟสของโครงข่ายเป็นสัญญาณอ้างอิงผ่านวงจร Phase-Locked Loop (PLL) ขณะที่โหมด Grid-Forming (GFM) สามารถกำหนดขนาดแรงดันและมุมอ้างอิงได้เอง จึงมีความสำคัญต่อการรักษาเสถียรภาพเมื่อระบบสูญเสียเครื่องกำเนิดไฟฟ้าซิงโครนัส [1]–[4]</w:t>
       </w:r>
     </w:p>
     <w:p>
@@ -2829,16 +2818,8 @@
             <w:tcW w:w="6747" w:type="dxa"/>
           </w:tcPr>
           <w:p>
-            <w:pPr>
-              <w:jc w:val="left"/>
-            </w:pPr>
-            <w:r>
-              <w:rPr>
-                <w:sz w:val="32"/>
-                <w:szCs w:val="32"/>
-                <w:cs/>
-              </w:rPr>
-              <w:t>ตัวจำกัดกระแสอ้างอิงแบบวงกลม</w:t>
+            <w:r>
+              <w:t>ตัวจำกัดขนาดกระแสอ้างอิงแบบวงกลม (Circular Current Reference Limiter)</w:t>
             </w:r>
           </w:p>
         </w:tc>
@@ -2857,11 +2838,7 @@
         <w:jc w:val="left"/>
       </w:pPr>
       <w:r>
-        <w:rPr>
-          <w:sz w:val="32"/>
-          <w:szCs w:val="32"/>
-        </w:rPr>
-        <w:t>2. โครงสร้างและหลักการทำงานของสายงานคำนวณ</w:t>
+        <w:t>2. โครงสร้างและขั้นตอนการคำนวณ</w:t>
       </w:r>
     </w:p>
     <w:p>
@@ -3126,11 +3103,7 @@
         <w:jc w:val="center"/>
       </w:pPr>
       <w:r>
-        <w:rPr>
-          <w:sz w:val="32"/>
-          <w:szCs w:val="32"/>
-        </w:rPr>
-        <w:t>รูปที่ 2 โครงสร้างและสายงานคำนวณการทำงานของการสลับโหมด GFL/GFM ตั้งแต่ PF ถึง TS</w:t>
+        <w:t>รูปที่ 2 โครงสร้างและขั้นตอนการคำนวณของการสลับโหมด GFL/GFM ตั้งแต่ PF ถึง TS</w:t>
       </w:r>
     </w:p>
     <w:p>
@@ -8035,10 +8008,7 @@
         <w:jc w:val="left"/>
       </w:pPr>
       <w:r>
-        <w:rPr>
-          <w:sz w:val="32"/>
-        </w:rPr>
-        <w:t>เมื่อเบรกเกอร์ของ SG เปิด วงจรจะหยุดการจ่ายกระแสเข้าระบบ แต่ตัวแปรสถานะทางกลและฟลักซ์แม่เหล็กยังคงมีพลวัตการหมุนอิสระของโรเตอร์ (Natural Deceleration / Free Rotation) จึงสามารถตรวจสอบเงื่อนไขการซิงโครไนซ์ (Synchronism Criteria) ก่อนการสับเบรกเกอร์กลับเข้าระบบได้จริง โดยไม่มีการรีเซ็ตมุมหรือความเร็วรอบของเครื่องกำเนิดไฟฟ้าแบบฝืนสภาวะทางกายภาพ</w:t>
+        <w:t>เมื่อเบรกเกอร์ของ SG เปิด วงจรจะหยุดการจ่ายกระแสเข้าระบบ แต่ตัวแปรสถานะทางกลและฟลักซ์แม่เหล็กยังคงมีพลวัตการหมุนอิสระของโรเตอร์หลังปลดเบรกเกอร์ จึงสามารถตรวจสอบเงื่อนไขการซิงโครไนซ์ (Synchronism Criteria) ก่อนการสับเบรกเกอร์กลับเข้าระบบได้จริง โดยไม่มีการรีเซ็ตมุมหรือความเร็วรอบของเครื่องกำเนิดไฟฟ้าแบบฝืนสภาวะทางกายภาพ</w:t>
       </w:r>
     </w:p>
     <w:p>
@@ -13703,10 +13673,7 @@
         <w:jc w:val="left"/>
       </w:pPr>
       <w:r>
-        <w:rPr>
-          <w:sz w:val="32"/>
-        </w:rPr>
-        <w:t>การกำหนดตำแหน่งเหตุการณ์รบกวนได้รับการจัดการอย่างแม่นยำ โดยทำการจัดขอบเขตเหตุการณ์ (Event Alignment) ให้ตรงกับรอยต่อของขั้นเวลาเชิงตัวเลข เพื่อรักษาความถูกต้องของสมการดุลกำลัง KCL และป้องกันการเกิดความไม่ต่อเนื่องเชิงตัวเลข (Numerical Discontinuity)</w:t>
+        <w:t>กำหนดเวลาเหตุการณ์ให้ตรงกับขอบเขตขั้นเวลาของการคำนวณ เพื่อรักษาความถูกต้องของสมการดุลกำลัง KCL และลดความไม่ต่อเนื่องเชิงตัวเลข</w:t>
       </w:r>
     </w:p>
     <w:p>
@@ -16108,542 +16075,7 @@
         <w:jc w:val="left"/>
       </w:pPr>
       <w:r>
-        <w:rPr>
-          <w:sz w:val="32"/>
-          <w:szCs w:val="32"/>
-          <w:cs/>
-        </w:rPr>
-        <w:t xml:space="preserve">กลุ่ม </w:t>
-      </w:r>
-      <m:oMath>
-        <m:sSub>
-          <m:sSubPr>
-            <m:ctrlPr>
-              <w:rPr>
-                <w:rFonts w:ascii="Cambria Math" w:hAnsi="Cambria Math"/>
-                <w:sz w:val="22"/>
-                <w:szCs w:val="22"/>
-              </w:rPr>
-            </m:ctrlPr>
-          </m:sSubPr>
-          <m:e>
-            <m:r>
-              <w:rPr>
-                <w:rFonts w:ascii="Cambria Math" w:hAnsi="Cambria Math"/>
-                <w:sz w:val="24"/>
-                <w:szCs w:val="24"/>
-              </w:rPr>
-              <m:t>x</m:t>
-            </m:r>
-          </m:e>
-          <m:sub>
-            <m:r>
-              <w:rPr>
-                <w:rFonts w:ascii="Cambria Math" w:hAnsi="Cambria Math"/>
-                <w:sz w:val="24"/>
-                <w:szCs w:val="24"/>
-              </w:rPr>
-              <m:t>p</m:t>
-            </m:r>
-          </m:sub>
-        </m:sSub>
-      </m:oMath>
-      <w:r>
-        <w:rPr>
-          <w:sz w:val="32"/>
-          <w:szCs w:val="32"/>
-          <w:cs/>
-        </w:rPr>
-        <w:t xml:space="preserve"> เป็น physical plant states ที่ใช้ร่วมกันในทั้งสองโหมดและ evolve ตลอดเวลา ส่วน </w:t>
-      </w:r>
-      <m:oMath>
-        <m:sSub>
-          <m:sSubPr>
-            <m:ctrlPr>
-              <w:rPr>
-                <w:rFonts w:ascii="Cambria Math" w:hAnsi="Cambria Math"/>
-                <w:sz w:val="22"/>
-                <w:szCs w:val="22"/>
-              </w:rPr>
-            </m:ctrlPr>
-          </m:sSubPr>
-          <m:e>
-            <m:r>
-              <w:rPr>
-                <w:rFonts w:ascii="Cambria Math" w:hAnsi="Cambria Math"/>
-                <w:sz w:val="24"/>
-                <w:szCs w:val="24"/>
-              </w:rPr>
-              <m:t>x</m:t>
-            </m:r>
-          </m:e>
-          <m:sub>
-            <m:r>
-              <w:rPr>
-                <w:rFonts w:ascii="Cambria Math" w:hAnsi="Cambria Math"/>
-                <w:sz w:val="24"/>
-                <w:szCs w:val="24"/>
-              </w:rPr>
-              <m:t>GFL</m:t>
-            </m:r>
-          </m:sub>
-        </m:sSub>
-      </m:oMath>
-      <w:r>
-        <w:rPr>
-          <w:sz w:val="32"/>
-          <w:szCs w:val="32"/>
-          <w:cs/>
-        </w:rPr>
-        <w:t xml:space="preserve"> และ </w:t>
-      </w:r>
-      <m:oMath>
-        <m:sSub>
-          <m:sSubPr>
-            <m:ctrlPr>
-              <w:rPr>
-                <w:rFonts w:ascii="Cambria Math" w:hAnsi="Cambria Math"/>
-                <w:sz w:val="22"/>
-                <w:szCs w:val="22"/>
-              </w:rPr>
-            </m:ctrlPr>
-          </m:sSubPr>
-          <m:e>
-            <m:r>
-              <w:rPr>
-                <w:rFonts w:ascii="Cambria Math" w:hAnsi="Cambria Math"/>
-                <w:sz w:val="24"/>
-                <w:szCs w:val="24"/>
-              </w:rPr>
-              <m:t>x</m:t>
-            </m:r>
-          </m:e>
-          <m:sub>
-            <m:r>
-              <w:rPr>
-                <w:rFonts w:ascii="Cambria Math" w:hAnsi="Cambria Math"/>
-                <w:sz w:val="24"/>
-                <w:szCs w:val="24"/>
-              </w:rPr>
-              <m:t>GFM</m:t>
-            </m:r>
-          </m:sub>
-        </m:sSub>
-      </m:oMath>
-      <w:r>
-        <w:rPr>
-          <w:sz w:val="32"/>
-          <w:szCs w:val="32"/>
-          <w:cs/>
-        </w:rPr>
-        <w:t xml:space="preserve"> เป็น controller states คนละ branch และ </w:t>
-      </w:r>
-      <w:r>
-        <w:rPr>
-          <w:b/>
-          <w:bCs/>
-          <w:sz w:val="32"/>
-          <w:szCs w:val="32"/>
-          <w:cs/>
-        </w:rPr>
-        <w:t>ไม่ถูกใช้งานพร้อมกัน</w:t>
-      </w:r>
-      <w:r>
-        <w:rPr>
-          <w:sz w:val="32"/>
-          <w:szCs w:val="32"/>
-          <w:cs/>
-        </w:rPr>
-        <w:t xml:space="preserve">. เมื่ออุปกรณ์อยู่ในโหมด GFL จะ active เฉพาะ </w:t>
-      </w:r>
-      <m:oMath>
-        <m:sSub>
-          <m:sSubPr>
-            <m:ctrlPr>
-              <w:rPr>
-                <w:rFonts w:ascii="Cambria Math" w:hAnsi="Cambria Math"/>
-                <w:sz w:val="22"/>
-                <w:szCs w:val="22"/>
-              </w:rPr>
-            </m:ctrlPr>
-          </m:sSubPr>
-          <m:e>
-            <m:r>
-              <w:rPr>
-                <w:rFonts w:ascii="Cambria Math" w:hAnsi="Cambria Math"/>
-                <w:sz w:val="24"/>
-                <w:szCs w:val="24"/>
-              </w:rPr>
-              <m:t>x</m:t>
-            </m:r>
-          </m:e>
-          <m:sub>
-            <m:r>
-              <w:rPr>
-                <w:rFonts w:ascii="Cambria Math" w:hAnsi="Cambria Math"/>
-                <w:sz w:val="24"/>
-                <w:szCs w:val="24"/>
-              </w:rPr>
-              <m:t>p</m:t>
-            </m:r>
-          </m:sub>
-        </m:sSub>
-      </m:oMath>
-      <w:r>
-        <w:rPr>
-          <w:sz w:val="32"/>
-          <w:szCs w:val="32"/>
-          <w:cs/>
-        </w:rPr>
-        <w:t xml:space="preserve"> และ </w:t>
-      </w:r>
-      <m:oMath>
-        <m:sSub>
-          <m:sSubPr>
-            <m:ctrlPr>
-              <w:rPr>
-                <w:rFonts w:ascii="Cambria Math" w:hAnsi="Cambria Math"/>
-                <w:sz w:val="22"/>
-                <w:szCs w:val="22"/>
-              </w:rPr>
-            </m:ctrlPr>
-          </m:sSubPr>
-          <m:e>
-            <m:r>
-              <w:rPr>
-                <w:rFonts w:ascii="Cambria Math" w:hAnsi="Cambria Math"/>
-                <w:sz w:val="24"/>
-                <w:szCs w:val="24"/>
-              </w:rPr>
-              <m:t>x</m:t>
-            </m:r>
-          </m:e>
-          <m:sub>
-            <m:r>
-              <w:rPr>
-                <w:rFonts w:ascii="Cambria Math" w:hAnsi="Cambria Math"/>
-                <w:sz w:val="24"/>
-                <w:szCs w:val="24"/>
-              </w:rPr>
-              <m:t>GFL</m:t>
-            </m:r>
-          </m:sub>
-        </m:sSub>
-      </m:oMath>
-      <w:r>
-        <w:rPr>
-          <w:sz w:val="32"/>
-          <w:szCs w:val="32"/>
-          <w:cs/>
-        </w:rPr>
-        <w:t xml:space="preserve"> ขณะที่ </w:t>
-      </w:r>
-      <m:oMath>
-        <m:sSub>
-          <m:sSubPr>
-            <m:ctrlPr>
-              <w:rPr>
-                <w:rFonts w:ascii="Cambria Math" w:hAnsi="Cambria Math"/>
-                <w:sz w:val="22"/>
-                <w:szCs w:val="22"/>
-              </w:rPr>
-            </m:ctrlPr>
-          </m:sSubPr>
-          <m:e>
-            <m:r>
-              <w:rPr>
-                <w:rFonts w:ascii="Cambria Math" w:hAnsi="Cambria Math"/>
-                <w:sz w:val="24"/>
-                <w:szCs w:val="24"/>
-              </w:rPr>
-              <m:t>x</m:t>
-            </m:r>
-          </m:e>
-          <m:sub>
-            <m:r>
-              <w:rPr>
-                <w:rFonts w:ascii="Cambria Math" w:hAnsi="Cambria Math"/>
-                <w:sz w:val="24"/>
-                <w:szCs w:val="24"/>
-              </w:rPr>
-              <m:t>GFM</m:t>
-            </m:r>
-          </m:sub>
-        </m:sSub>
-      </m:oMath>
-      <w:r>
-        <w:rPr>
-          <w:sz w:val="32"/>
-          <w:szCs w:val="32"/>
-          <w:cs/>
-        </w:rPr>
-        <w:t xml:space="preserve"> ถูก hold ด้วย </w:t>
-      </w:r>
-      <m:oMath>
-        <m:sSub>
-          <m:sSubPr>
-            <m:ctrlPr>
-              <w:rPr>
-                <w:rFonts w:ascii="Cambria Math" w:hAnsi="Cambria Math"/>
-                <w:sz w:val="22"/>
-                <w:szCs w:val="22"/>
-              </w:rPr>
-            </m:ctrlPr>
-          </m:sSubPr>
-          <m:e>
-            <m:acc>
-              <m:accPr>
-                <m:chr m:val="̇"/>
-                <m:ctrlPr>
-                  <w:rPr>
-                    <w:rFonts w:ascii="Cambria Math" w:hAnsi="Cambria Math"/>
-                    <w:sz w:val="22"/>
-                    <w:szCs w:val="22"/>
-                  </w:rPr>
-                </m:ctrlPr>
-              </m:accPr>
-              <m:e>
-                <m:r>
-                  <w:rPr>
-                    <w:rFonts w:ascii="Cambria Math" w:hAnsi="Cambria Math"/>
-                    <w:sz w:val="24"/>
-                    <w:szCs w:val="24"/>
-                  </w:rPr>
-                  <m:t>x</m:t>
-                </m:r>
-              </m:e>
-            </m:acc>
-          </m:e>
-          <m:sub>
-            <m:r>
-              <w:rPr>
-                <w:rFonts w:ascii="Cambria Math" w:hAnsi="Cambria Math"/>
-                <w:sz w:val="24"/>
-                <w:szCs w:val="24"/>
-              </w:rPr>
-              <m:t>GFM</m:t>
-            </m:r>
-          </m:sub>
-        </m:sSub>
-        <m:r>
-          <w:rPr>
-            <w:rFonts w:ascii="Cambria Math" w:hAnsi="Cambria Math"/>
-            <w:sz w:val="24"/>
-            <w:szCs w:val="24"/>
-          </w:rPr>
-          <m:t>=0</m:t>
-        </m:r>
-      </m:oMath>
-      <w:r>
-        <w:rPr>
-          <w:sz w:val="32"/>
-          <w:szCs w:val="32"/>
-          <w:cs/>
-        </w:rPr>
-        <w:t xml:space="preserve">; เมื่อสลับเป็น GFM จะ active เฉพาะ </w:t>
-      </w:r>
-      <m:oMath>
-        <m:sSub>
-          <m:sSubPr>
-            <m:ctrlPr>
-              <w:rPr>
-                <w:rFonts w:ascii="Cambria Math" w:hAnsi="Cambria Math"/>
-                <w:sz w:val="22"/>
-                <w:szCs w:val="22"/>
-              </w:rPr>
-            </m:ctrlPr>
-          </m:sSubPr>
-          <m:e>
-            <m:r>
-              <w:rPr>
-                <w:rFonts w:ascii="Cambria Math" w:hAnsi="Cambria Math"/>
-                <w:sz w:val="24"/>
-                <w:szCs w:val="24"/>
-              </w:rPr>
-              <m:t>x</m:t>
-            </m:r>
-          </m:e>
-          <m:sub>
-            <m:r>
-              <w:rPr>
-                <w:rFonts w:ascii="Cambria Math" w:hAnsi="Cambria Math"/>
-                <w:sz w:val="24"/>
-                <w:szCs w:val="24"/>
-              </w:rPr>
-              <m:t>p</m:t>
-            </m:r>
-          </m:sub>
-        </m:sSub>
-      </m:oMath>
-      <w:r>
-        <w:rPr>
-          <w:sz w:val="32"/>
-          <w:szCs w:val="32"/>
-          <w:cs/>
-        </w:rPr>
-        <w:t xml:space="preserve"> และ </w:t>
-      </w:r>
-      <m:oMath>
-        <m:sSub>
-          <m:sSubPr>
-            <m:ctrlPr>
-              <w:rPr>
-                <w:rFonts w:ascii="Cambria Math" w:hAnsi="Cambria Math"/>
-                <w:sz w:val="22"/>
-                <w:szCs w:val="22"/>
-              </w:rPr>
-            </m:ctrlPr>
-          </m:sSubPr>
-          <m:e>
-            <m:r>
-              <w:rPr>
-                <w:rFonts w:ascii="Cambria Math" w:hAnsi="Cambria Math"/>
-                <w:sz w:val="24"/>
-                <w:szCs w:val="24"/>
-              </w:rPr>
-              <m:t>x</m:t>
-            </m:r>
-          </m:e>
-          <m:sub>
-            <m:r>
-              <w:rPr>
-                <w:rFonts w:ascii="Cambria Math" w:hAnsi="Cambria Math"/>
-                <w:sz w:val="24"/>
-                <w:szCs w:val="24"/>
-              </w:rPr>
-              <m:t>GFM</m:t>
-            </m:r>
-          </m:sub>
-        </m:sSub>
-      </m:oMath>
-      <w:r>
-        <w:rPr>
-          <w:sz w:val="32"/>
-          <w:szCs w:val="32"/>
-          <w:cs/>
-        </w:rPr>
-        <w:t xml:space="preserve"> ขณะที่ </w:t>
-      </w:r>
-      <m:oMath>
-        <m:sSub>
-          <m:sSubPr>
-            <m:ctrlPr>
-              <w:rPr>
-                <w:rFonts w:ascii="Cambria Math" w:hAnsi="Cambria Math"/>
-                <w:sz w:val="22"/>
-                <w:szCs w:val="22"/>
-              </w:rPr>
-            </m:ctrlPr>
-          </m:sSubPr>
-          <m:e>
-            <m:r>
-              <w:rPr>
-                <w:rFonts w:ascii="Cambria Math" w:hAnsi="Cambria Math"/>
-                <w:sz w:val="24"/>
-                <w:szCs w:val="24"/>
-              </w:rPr>
-              <m:t>x</m:t>
-            </m:r>
-          </m:e>
-          <m:sub>
-            <m:r>
-              <w:rPr>
-                <w:rFonts w:ascii="Cambria Math" w:hAnsi="Cambria Math"/>
-                <w:sz w:val="24"/>
-                <w:szCs w:val="24"/>
-              </w:rPr>
-              <m:t>GFL</m:t>
-            </m:r>
-          </m:sub>
-        </m:sSub>
-      </m:oMath>
-      <w:r>
-        <w:rPr>
-          <w:sz w:val="32"/>
-          <w:szCs w:val="32"/>
-          <w:cs/>
-        </w:rPr>
-        <w:t xml:space="preserve"> ถูก hold ด้วย </w:t>
-      </w:r>
-      <m:oMath>
-        <m:sSub>
-          <m:sSubPr>
-            <m:ctrlPr>
-              <w:rPr>
-                <w:rFonts w:ascii="Cambria Math" w:hAnsi="Cambria Math"/>
-                <w:sz w:val="22"/>
-                <w:szCs w:val="22"/>
-              </w:rPr>
-            </m:ctrlPr>
-          </m:sSubPr>
-          <m:e>
-            <m:acc>
-              <m:accPr>
-                <m:chr m:val="̇"/>
-                <m:ctrlPr>
-                  <w:rPr>
-                    <w:rFonts w:ascii="Cambria Math" w:hAnsi="Cambria Math"/>
-                    <w:sz w:val="22"/>
-                    <w:szCs w:val="22"/>
-                  </w:rPr>
-                </m:ctrlPr>
-              </m:accPr>
-              <m:e>
-                <m:r>
-                  <w:rPr>
-                    <w:rFonts w:ascii="Cambria Math" w:hAnsi="Cambria Math"/>
-                    <w:sz w:val="24"/>
-                    <w:szCs w:val="24"/>
-                  </w:rPr>
-                  <m:t>x</m:t>
-                </m:r>
-              </m:e>
-            </m:acc>
-          </m:e>
-          <m:sub>
-            <m:r>
-              <w:rPr>
-                <w:rFonts w:ascii="Cambria Math" w:hAnsi="Cambria Math"/>
-                <w:sz w:val="24"/>
-                <w:szCs w:val="24"/>
-              </w:rPr>
-              <m:t>GFL</m:t>
-            </m:r>
-          </m:sub>
-        </m:sSub>
-        <m:r>
-          <w:rPr>
-            <w:rFonts w:ascii="Cambria Math" w:hAnsi="Cambria Math"/>
-            <w:sz w:val="24"/>
-            <w:szCs w:val="24"/>
-          </w:rPr>
-          <m:t>=0</m:t>
-        </m:r>
-      </m:oMath>
-      <w:r>
-        <w:rPr>
-          <w:sz w:val="32"/>
-          <w:szCs w:val="32"/>
-          <w:cs/>
-        </w:rPr>
-        <w:t xml:space="preserve">. ดังนั้นโครงสร้างนี้เป็น </w:t>
-      </w:r>
-      <w:r>
-        <w:rPr>
-          <w:i/>
-          <w:sz w:val="32"/>
-          <w:szCs w:val="32"/>
-          <w:cs/>
-        </w:rPr>
-        <w:t>mode-switched controller</w:t>
-      </w:r>
-      <w:r>
-        <w:rPr>
-          <w:sz w:val="32"/>
-          <w:szCs w:val="32"/>
-          <w:cs/>
-        </w:rPr>
-        <w:t xml:space="preserve"> ไม่ใช่การนำ GFL และ GFM มาควบคุม converter พร้อมกัน</w:t>
+        <w:t>กลุ่ม x_p เป็นตัวแปรสถานะทางกายภาพที่ใช้ร่วมกันในทั้งสองโหมดและเปลี่ยนแปลงตามพลวัตของระบบ ส่วน x_GFL และ x_GFM เป็นตัวแปรสถานะของตัวควบคุมแต่ละโหมดซึ่งไม่ทำงานพร้อมกัน</w:t>
       </w:r>
     </w:p>
     <w:p>
@@ -17032,16 +16464,8 @@
             <w:tcW w:w="2727" w:type="dxa"/>
           </w:tcPr>
           <w:p>
-            <w:pPr>
-              <w:jc w:val="left"/>
-            </w:pPr>
-            <w:r>
-              <w:rPr>
-                <w:sz w:val="32"/>
-                <w:szCs w:val="32"/>
-                <w:cs/>
-              </w:rPr>
-              <w:t>physical AC/DC plant; ใช้ร่วมกันและ evolve ต่อเนื่อง</w:t>
+            <w:r>
+              <w:t>ภาคกายภาพ AC/DC; ใช้ร่วมกันและเปลี่ยนแปลงตามพลวัตอย่างต่อเนื่อง</w:t>
             </w:r>
           </w:p>
         </w:tc>
@@ -27520,10 +26944,7 @@
         <w:jc w:val="left"/>
       </w:pPr>
       <w:r>
-        <w:rPr>
-          <w:sz w:val="32"/>
-        </w:rPr>
-        <w:t>จุดสำคัญของโหมด GFL คือต้องอาศัยแรงดันและมุมเฟสของโครงข่ายเป็นสัญญาณอ้างอิงผ่าน PLL ดังนั้นหลัง SG ถูกปลด ระบบต้องมีแหล่งกำหนดแรงดันและมุมอ้างอิงจาก IBR ที่ทำงานแบบ GFM</w:t>
+        <w:t>จุดสำคัญของโหมด GFL คือต้องอาศัยแรงดันและมุมเฟสของโครงข่ายเป็นสัญญาณอ้างอิงผ่าน PLL ดังนั้นหลัง SG ถูกปลด ระบบต้องมีอุปกรณ์ที่ทำหน้าที่กำหนดแรงดันและมุมอ้างอิง โดยในกรณีศึกษานี้ใช้ IBR ที่ทำงานในโหมด GFM</w:t>
       </w:r>
     </w:p>
     <w:p>
@@ -36169,13 +35590,599 @@
       <w:pPr>
         <w:spacing w:line="320" w:lineRule="exact"/>
         <w:ind w:firstLine="360"/>
-        <w:jc w:val="left"/>
+        <w:jc w:val="thaiDistribute"/>
       </w:pPr>
       <w:r>
         <w:rPr>
           <w:sz w:val="32"/>
+          <w:szCs w:val="32"/>
+          <w:cs/>
         </w:rPr>
-        <w:t>โดย  คือแอดมิตแตนซ์ของโหลดที่จุดทำงาน PF และ  เป็นฟังก์ชันบ่งชี้ที่มีค่า 1 เฉพาะช่วงที่เครือข่ายอยู่ในสถานะ fault พจน์  จึงคือแอดมิตแตนซ์ของ fault ที่ประทับลงบัสเดียวกัน ลำดับเหตุการณ์ชุดนี้ไม่มีการเพิ่มโหลด ตัวคูณ  จึงคงค่าตลอดการรัน และหน้าต่าง – วินาที รวมกระแส fault ไว้ตามที่เกิดขึ้นจริง การทวนสอบความถูกต้องของสภาวะเริ่มต้นกำหนดที่  คือค่าที่คำนวณย้อนได้ต้องเท่ากับข้อมูลโหลดของกรณีศึกษาและแรงดัน PF ภายใน  pu ซึ่งได้  pu,  pu และ  pu ตรงทุกหลัก ทั้งสองกรณี</w:t>
+        <w:t xml:space="preserve">โดย </w:t>
+      </w:r>
+      <m:oMath>
+        <m:sSub>
+          <m:sSubPr>
+            <m:ctrlPr>
+              <w:rPr>
+                <w:rFonts w:ascii="Cambria Math" w:hAnsi="Cambria Math"/>
+                <w:sz w:val="24"/>
+                <w:szCs w:val="24"/>
+              </w:rPr>
+            </m:ctrlPr>
+          </m:sSubPr>
+          <m:e>
+            <m:r>
+              <w:rPr>
+                <w:rFonts w:ascii="Cambria Math" w:hAnsi="Cambria Math"/>
+                <w:sz w:val="24"/>
+                <w:szCs w:val="24"/>
+              </w:rPr>
+              <m:t>y</m:t>
+            </m:r>
+          </m:e>
+          <m:sub>
+            <m:r>
+              <w:rPr>
+                <w:rFonts w:ascii="Cambria Math" w:hAnsi="Cambria Math"/>
+                <w:sz w:val="24"/>
+                <w:szCs w:val="24"/>
+              </w:rPr>
+              <m:t>9</m:t>
+            </m:r>
+          </m:sub>
+        </m:sSub>
+        <m:r>
+          <w:rPr>
+            <w:rFonts w:ascii="Cambria Math" w:hAnsi="Cambria Math"/>
+            <w:sz w:val="24"/>
+            <w:szCs w:val="24"/>
+          </w:rPr>
+          <m:t>=</m:t>
+        </m:r>
+        <m:sSup>
+          <m:sSupPr>
+            <m:ctrlPr>
+              <w:rPr>
+                <w:rFonts w:ascii="Cambria Math" w:hAnsi="Cambria Math"/>
+                <w:sz w:val="24"/>
+                <w:szCs w:val="24"/>
+              </w:rPr>
+            </m:ctrlPr>
+          </m:sSupPr>
+          <m:e>
+            <m:sSub>
+              <m:sSubPr>
+                <m:ctrlPr>
+                  <w:rPr>
+                    <w:rFonts w:ascii="Cambria Math" w:hAnsi="Cambria Math"/>
+                    <w:sz w:val="24"/>
+                    <w:szCs w:val="24"/>
+                  </w:rPr>
+                </m:ctrlPr>
+              </m:sSubPr>
+              <m:e>
+                <m:r>
+                  <w:rPr>
+                    <w:rFonts w:ascii="Cambria Math" w:hAnsi="Cambria Math"/>
+                    <w:sz w:val="24"/>
+                    <w:szCs w:val="24"/>
+                  </w:rPr>
+                  <m:t>S</m:t>
+                </m:r>
+              </m:e>
+              <m:sub>
+                <m:r>
+                  <w:rPr>
+                    <w:rFonts w:ascii="Cambria Math" w:hAnsi="Cambria Math"/>
+                    <w:sz w:val="24"/>
+                    <w:szCs w:val="24"/>
+                  </w:rPr>
+                  <m:t>9</m:t>
+                </m:r>
+              </m:sub>
+            </m:sSub>
+          </m:e>
+          <m:sup>
+            <m:r>
+              <m:rPr>
+                <m:sty m:val="p"/>
+              </m:rPr>
+              <w:rPr>
+                <w:rFonts w:ascii="Cambria Math" w:hAnsi="Cambria Math"/>
+                <w:sz w:val="24"/>
+                <w:szCs w:val="24"/>
+              </w:rPr>
+              <m:t>pf</m:t>
+            </m:r>
+          </m:sup>
+        </m:sSup>
+        <m:r>
+          <w:rPr>
+            <w:rFonts w:ascii="Cambria Math" w:hAnsi="Cambria Math"/>
+            <w:sz w:val="24"/>
+            <w:szCs w:val="24"/>
+          </w:rPr>
+          <m:t>/</m:t>
+        </m:r>
+        <m:sSup>
+          <m:sSupPr>
+            <m:ctrlPr>
+              <w:rPr>
+                <w:rFonts w:ascii="Cambria Math" w:hAnsi="Cambria Math"/>
+                <w:sz w:val="24"/>
+                <w:szCs w:val="24"/>
+              </w:rPr>
+            </m:ctrlPr>
+          </m:sSupPr>
+          <m:e>
+            <m:d>
+              <m:dPr>
+                <m:begChr m:val="|"/>
+                <m:endChr m:val="|"/>
+                <m:ctrlPr>
+                  <w:rPr>
+                    <w:rFonts w:ascii="Cambria Math" w:hAnsi="Cambria Math"/>
+                    <w:sz w:val="24"/>
+                    <w:szCs w:val="24"/>
+                  </w:rPr>
+                </m:ctrlPr>
+              </m:dPr>
+              <m:e>
+                <m:sSup>
+                  <m:sSupPr>
+                    <m:ctrlPr>
+                      <w:rPr>
+                        <w:rFonts w:ascii="Cambria Math" w:hAnsi="Cambria Math"/>
+                        <w:sz w:val="24"/>
+                        <w:szCs w:val="24"/>
+                      </w:rPr>
+                    </m:ctrlPr>
+                  </m:sSupPr>
+                  <m:e>
+                    <m:sSub>
+                      <m:sSubPr>
+                        <m:ctrlPr>
+                          <w:rPr>
+                            <w:rFonts w:ascii="Cambria Math" w:hAnsi="Cambria Math"/>
+                            <w:sz w:val="24"/>
+                            <w:szCs w:val="24"/>
+                          </w:rPr>
+                        </m:ctrlPr>
+                      </m:sSubPr>
+                      <m:e>
+                        <m:r>
+                          <w:rPr>
+                            <w:rFonts w:ascii="Cambria Math" w:hAnsi="Cambria Math"/>
+                            <w:sz w:val="24"/>
+                            <w:szCs w:val="24"/>
+                          </w:rPr>
+                          <m:t>V</m:t>
+                        </m:r>
+                      </m:e>
+                      <m:sub>
+                        <m:r>
+                          <w:rPr>
+                            <w:rFonts w:ascii="Cambria Math" w:hAnsi="Cambria Math"/>
+                            <w:sz w:val="24"/>
+                            <w:szCs w:val="24"/>
+                          </w:rPr>
+                          <m:t>9</m:t>
+                        </m:r>
+                      </m:sub>
+                    </m:sSub>
+                  </m:e>
+                  <m:sup>
+                    <m:r>
+                      <m:rPr>
+                        <m:sty m:val="p"/>
+                      </m:rPr>
+                      <w:rPr>
+                        <w:rFonts w:ascii="Cambria Math" w:hAnsi="Cambria Math"/>
+                        <w:sz w:val="24"/>
+                        <w:szCs w:val="24"/>
+                      </w:rPr>
+                      <m:t>pf</m:t>
+                    </m:r>
+                  </m:sup>
+                </m:sSup>
+              </m:e>
+            </m:d>
+          </m:e>
+          <m:sup>
+            <m:r>
+              <w:rPr>
+                <w:rFonts w:ascii="Cambria Math" w:hAnsi="Cambria Math"/>
+                <w:sz w:val="24"/>
+                <w:szCs w:val="24"/>
+              </w:rPr>
+              <m:t>2</m:t>
+            </m:r>
+          </m:sup>
+        </m:sSup>
+      </m:oMath>
+      <w:r>
+        <w:rPr>
+          <w:sz w:val="32"/>
+          <w:szCs w:val="32"/>
+          <w:cs/>
+        </w:rPr>
+        <w:t xml:space="preserve"> คือแอดมิตแตนซ์ของโหลดที่จุดทำงาน PF และ </w:t>
+      </w:r>
+      <m:oMath>
+        <m:sSub>
+          <m:sSubPr>
+            <m:ctrlPr>
+              <w:rPr>
+                <w:rFonts w:ascii="Cambria Math" w:hAnsi="Cambria Math"/>
+                <w:sz w:val="24"/>
+                <w:szCs w:val="24"/>
+              </w:rPr>
+            </m:ctrlPr>
+          </m:sSubPr>
+          <m:e>
+            <m:r>
+              <w:rPr>
+                <w:rFonts w:ascii="Cambria Math" w:hAnsi="Cambria Math"/>
+                <w:sz w:val="24"/>
+                <w:szCs w:val="24"/>
+              </w:rPr>
+              <m:t>χ</m:t>
+            </m:r>
+          </m:e>
+          <m:sub>
+            <m:r>
+              <w:rPr>
+                <w:rFonts w:ascii="Cambria Math" w:hAnsi="Cambria Math"/>
+                <w:sz w:val="24"/>
+                <w:szCs w:val="24"/>
+              </w:rPr>
+              <m:t>f</m:t>
+            </m:r>
+          </m:sub>
+        </m:sSub>
+      </m:oMath>
+      <w:r>
+        <w:rPr>
+          <w:sz w:val="32"/>
+          <w:szCs w:val="32"/>
+          <w:cs/>
+        </w:rPr>
+        <w:t xml:space="preserve"> เป็นฟังก์ชันบ่งชี้ที่มีค่า 1 เฉพาะช่วงที่เครือข่ายอยู่ในสถานะ fault พจน์ </w:t>
+      </w:r>
+      <m:oMath>
+        <m:sSub>
+          <m:sSubPr>
+            <m:ctrlPr>
+              <w:rPr>
+                <w:rFonts w:ascii="Cambria Math" w:hAnsi="Cambria Math"/>
+                <w:sz w:val="24"/>
+                <w:szCs w:val="24"/>
+              </w:rPr>
+            </m:ctrlPr>
+          </m:sSubPr>
+          <m:e>
+            <m:r>
+              <w:rPr>
+                <w:rFonts w:ascii="Cambria Math" w:hAnsi="Cambria Math"/>
+                <w:sz w:val="24"/>
+                <w:szCs w:val="24"/>
+              </w:rPr>
+              <m:t>χ</m:t>
+            </m:r>
+          </m:e>
+          <m:sub>
+            <m:r>
+              <w:rPr>
+                <w:rFonts w:ascii="Cambria Math" w:hAnsi="Cambria Math"/>
+                <w:sz w:val="24"/>
+                <w:szCs w:val="24"/>
+              </w:rPr>
+              <m:t>f</m:t>
+            </m:r>
+          </m:sub>
+        </m:sSub>
+        <m:r>
+          <w:rPr>
+            <w:rFonts w:ascii="Cambria Math" w:hAnsi="Cambria Math"/>
+            <w:sz w:val="24"/>
+            <w:szCs w:val="24"/>
+          </w:rPr>
+          <m:t>/</m:t>
+        </m:r>
+        <m:sSub>
+          <m:sSubPr>
+            <m:ctrlPr>
+              <w:rPr>
+                <w:rFonts w:ascii="Cambria Math" w:hAnsi="Cambria Math"/>
+                <w:sz w:val="24"/>
+                <w:szCs w:val="24"/>
+              </w:rPr>
+            </m:ctrlPr>
+          </m:sSubPr>
+          <m:e>
+            <m:r>
+              <w:rPr>
+                <w:rFonts w:ascii="Cambria Math" w:hAnsi="Cambria Math"/>
+                <w:sz w:val="24"/>
+                <w:szCs w:val="24"/>
+              </w:rPr>
+              <m:t>Z</m:t>
+            </m:r>
+          </m:e>
+          <m:sub>
+            <m:r>
+              <w:rPr>
+                <w:rFonts w:ascii="Cambria Math" w:hAnsi="Cambria Math"/>
+                <w:sz w:val="24"/>
+                <w:szCs w:val="24"/>
+              </w:rPr>
+              <m:t>f</m:t>
+            </m:r>
+          </m:sub>
+        </m:sSub>
+      </m:oMath>
+      <w:r>
+        <w:rPr>
+          <w:sz w:val="32"/>
+          <w:szCs w:val="32"/>
+          <w:cs/>
+        </w:rPr>
+        <w:t xml:space="preserve"> จึงคือแอดมิตแตนซ์ของ fault ที่ประทับลงบัสเดียวกัน ลำดับเหตุการณ์ชุดนี้ไม่มีการเพิ่มโหลด ตัวคูณ </w:t>
+      </w:r>
+      <m:oMath>
+        <m:r>
+          <w:rPr>
+            <w:rFonts w:ascii="Cambria Math" w:hAnsi="Cambria Math"/>
+            <w:sz w:val="24"/>
+            <w:szCs w:val="24"/>
+          </w:rPr>
+          <m:t>m(t)=1</m:t>
+        </m:r>
+      </m:oMath>
+      <w:r>
+        <w:rPr>
+          <w:sz w:val="32"/>
+          <w:szCs w:val="32"/>
+          <w:cs/>
+        </w:rPr>
+        <w:t xml:space="preserve"> จึงคงค่าตลอดการรัน และหน้าต่าง </w:t>
+      </w:r>
+      <m:oMath>
+        <m:r>
+          <w:rPr>
+            <w:rFonts w:ascii="Cambria Math" w:hAnsi="Cambria Math"/>
+            <w:sz w:val="24"/>
+            <w:szCs w:val="24"/>
+          </w:rPr>
+          <m:t>60.</m:t>
+        </m:r>
+        <m:r>
+          <w:rPr>
+            <w:rFonts w:ascii="Cambria Math" w:hAnsi="Cambria Math"/>
+            <w:sz w:val="22"/>
+            <w:szCs w:val="22"/>
+          </w:rPr>
+          <m:t>000</m:t>
+        </m:r>
+      </m:oMath>
+      <w:r>
+        <w:rPr>
+          <w:sz w:val="32"/>
+          <w:szCs w:val="32"/>
+          <w:cs/>
+        </w:rPr>
+        <w:t>–</w:t>
+      </w:r>
+      <m:oMath>
+        <m:r>
+          <w:rPr>
+            <w:rFonts w:ascii="Cambria Math" w:hAnsi="Cambria Math"/>
+            <w:sz w:val="22"/>
+            <w:szCs w:val="22"/>
+          </w:rPr>
+          <m:t>60</m:t>
+        </m:r>
+        <m:r>
+          <w:rPr>
+            <w:rFonts w:ascii="Cambria Math" w:hAnsi="Cambria Math"/>
+            <w:sz w:val="24"/>
+            <w:szCs w:val="24"/>
+          </w:rPr>
+          <m:t>.150</m:t>
+        </m:r>
+      </m:oMath>
+      <w:r>
+        <w:rPr>
+          <w:sz w:val="32"/>
+          <w:szCs w:val="32"/>
+          <w:cs/>
+        </w:rPr>
+        <w:t xml:space="preserve"> วินาที รวมกระแส fault ไว้ตามที่เกิดขึ้นจริง การตรวจสอบความถูกต้องของสมการนี้อยู่ที่ </w:t>
+      </w:r>
+      <m:oMath>
+        <m:r>
+          <w:rPr>
+            <w:rFonts w:ascii="Cambria Math" w:hAnsi="Cambria Math"/>
+            <w:sz w:val="24"/>
+            <w:szCs w:val="24"/>
+          </w:rPr>
+          <m:t>t=0</m:t>
+        </m:r>
+      </m:oMath>
+      <w:r>
+        <w:rPr>
+          <w:sz w:val="32"/>
+          <w:szCs w:val="32"/>
+          <w:cs/>
+        </w:rPr>
+        <w:t xml:space="preserve"> คือค่าที่คำนวณย้อนได้ต้องเท่ากับข้อมูลโหลดของกรณีศึกษาและแรงดัน PF ภายใน </w:t>
+      </w:r>
+      <m:oMath>
+        <m:r>
+          <w:rPr>
+            <w:rFonts w:ascii="Cambria Math" w:hAnsi="Cambria Math"/>
+            <w:sz w:val="24"/>
+            <w:szCs w:val="24"/>
+          </w:rPr>
+          <w:lastRenderedPageBreak/>
+          <m:t>1</m:t>
+        </m:r>
+        <m:sSup>
+          <m:sSupPr>
+            <m:ctrlPr>
+              <w:rPr>
+                <w:rFonts w:ascii="Cambria Math" w:hAnsi="Cambria Math"/>
+                <w:sz w:val="24"/>
+                <w:szCs w:val="24"/>
+              </w:rPr>
+            </m:ctrlPr>
+          </m:sSupPr>
+          <m:e>
+            <m:r>
+              <w:rPr>
+                <w:rFonts w:ascii="Cambria Math" w:hAnsi="Cambria Math"/>
+                <w:sz w:val="24"/>
+                <w:szCs w:val="24"/>
+              </w:rPr>
+              <m:t>0</m:t>
+            </m:r>
+          </m:e>
+          <m:sup>
+            <m:r>
+              <w:rPr>
+                <w:rFonts w:ascii="Cambria Math" w:hAnsi="Cambria Math"/>
+                <w:sz w:val="24"/>
+                <w:szCs w:val="24"/>
+              </w:rPr>
+              <m:t>-9</m:t>
+            </m:r>
+          </m:sup>
+        </m:sSup>
+      </m:oMath>
+      <w:r>
+        <w:rPr>
+          <w:sz w:val="32"/>
+          <w:szCs w:val="32"/>
+          <w:cs/>
+        </w:rPr>
+        <w:t xml:space="preserve"> pu ซึ่งได้ </w:t>
+      </w:r>
+      <m:oMath>
+        <m:r>
+          <w:rPr>
+            <w:rFonts w:ascii="Cambria Math" w:hAnsi="Cambria Math"/>
+            <w:sz w:val="24"/>
+            <w:szCs w:val="24"/>
+          </w:rPr>
+          <m:t>P=0.</m:t>
+        </m:r>
+        <m:r>
+          <w:rPr>
+            <w:rFonts w:ascii="Cambria Math" w:hAnsi="Cambria Math"/>
+            <w:sz w:val="22"/>
+            <w:szCs w:val="22"/>
+          </w:rPr>
+          <m:t>295000</m:t>
+        </m:r>
+      </m:oMath>
+      <w:r>
+        <w:rPr>
+          <w:sz w:val="32"/>
+          <w:szCs w:val="32"/>
+          <w:cs/>
+        </w:rPr>
+        <w:t xml:space="preserve"> pu, </w:t>
+      </w:r>
+      <m:oMath>
+        <m:r>
+          <w:rPr>
+            <w:rFonts w:ascii="Cambria Math" w:hAnsi="Cambria Math"/>
+            <w:sz w:val="24"/>
+            <w:szCs w:val="24"/>
+          </w:rPr>
+          <m:t>Q=0.</m:t>
+        </m:r>
+        <m:r>
+          <w:rPr>
+            <w:rFonts w:ascii="Cambria Math" w:hAnsi="Cambria Math"/>
+            <w:sz w:val="22"/>
+            <w:szCs w:val="22"/>
+          </w:rPr>
+          <m:t>166000</m:t>
+        </m:r>
+      </m:oMath>
+      <w:r>
+        <w:rPr>
+          <w:sz w:val="32"/>
+          <w:szCs w:val="32"/>
+          <w:cs/>
+        </w:rPr>
+        <w:t xml:space="preserve"> pu และ </w:t>
+      </w:r>
+      <m:oMath>
+        <m:d>
+          <m:dPr>
+            <m:begChr m:val="|"/>
+            <m:endChr m:val="|"/>
+            <m:ctrlPr>
+              <w:rPr>
+                <w:rFonts w:ascii="Cambria Math" w:hAnsi="Cambria Math"/>
+                <w:sz w:val="24"/>
+                <w:szCs w:val="24"/>
+              </w:rPr>
+            </m:ctrlPr>
+          </m:dPr>
+          <m:e>
+            <m:sSub>
+              <m:sSubPr>
+                <m:ctrlPr>
+                  <w:rPr>
+                    <w:rFonts w:ascii="Cambria Math" w:hAnsi="Cambria Math"/>
+                    <w:sz w:val="24"/>
+                    <w:szCs w:val="24"/>
+                  </w:rPr>
+                </m:ctrlPr>
+              </m:sSubPr>
+              <m:e>
+                <m:r>
+                  <w:rPr>
+                    <w:rFonts w:ascii="Cambria Math" w:hAnsi="Cambria Math"/>
+                    <w:sz w:val="24"/>
+                    <w:szCs w:val="24"/>
+                  </w:rPr>
+                  <m:t>V</m:t>
+                </m:r>
+              </m:e>
+              <m:sub>
+                <m:r>
+                  <w:rPr>
+                    <w:rFonts w:ascii="Cambria Math" w:hAnsi="Cambria Math"/>
+                    <w:sz w:val="24"/>
+                    <w:szCs w:val="24"/>
+                  </w:rPr>
+                  <m:t>9</m:t>
+                </m:r>
+              </m:sub>
+            </m:sSub>
+          </m:e>
+        </m:d>
+        <m:r>
+          <w:rPr>
+            <w:rFonts w:ascii="Cambria Math" w:hAnsi="Cambria Math"/>
+            <w:sz w:val="24"/>
+            <w:szCs w:val="24"/>
+          </w:rPr>
+          <m:t>=1.021934</m:t>
+        </m:r>
+      </m:oMath>
+      <w:r>
+        <w:rPr>
+          <w:sz w:val="32"/>
+          <w:szCs w:val="32"/>
+          <w:cs/>
+        </w:rPr>
+        <w:t xml:space="preserve"> pu ตรงทุกหลัก ทั้งสองกรณี</w:t>
       </w:r>
     </w:p>
     <w:p>
@@ -36372,14 +36379,8 @@
             <w:tcW w:type="dxa" w:w="2769"/>
           </w:tcPr>
           <w:p>
-            <w:pPr>
-              <w:jc w:val="center"/>
-            </w:pPr>
-            <w:r>
-              <w:rPr>
-                <w:sz w:val="32"/>
-              </w:rPr>
-              <w:t>ผลสัมฤทธิ์</w:t>
+            <w:r>
+              <w:t>ผลที่ได้</w:t>
             </w:r>
           </w:p>
         </w:tc>
@@ -36394,10 +36395,7 @@
               <w:jc w:val="left"/>
             </w:pPr>
             <w:r>
-              <w:rPr>
-                <w:sz w:val="32"/>
-              </w:rPr>
-              <w:t>สายงานคำนวณ PF–TS</w:t>
+              <w:t>โครงสร้างการคำนวณ PF–TS</w:t>
             </w:r>
           </w:p>
         </w:tc>
@@ -36719,21 +36717,9 @@
         <w:jc w:val="left"/>
       </w:pPr>
       <w:r>
-        <w:rPr>
-          <w:sz w:val="32"/>
-          <w:szCs w:val="32"/>
-          <w:cs/>
-        </w:rPr>
         <w:t>2.</w:t>
-      </w:r>
-      <w:r>
-        <w:rPr>
-          <w:sz w:val="32"/>
-          <w:szCs w:val="32"/>
-          <w:cs/>
-        </w:rPr>
         <w:tab/>
-        <w:t>การสลับโหมดทำให้บทบาทของ controller state เปลี่ยนไป หากแผนที่ถ่ายโอน state ไม่ถูกต้องจะเกิดการกระโดดของกระแสที่จุดเชื่อมต่อ และทำให้ตัวแก้ Newton ในขั้นเวลาถัดไปไม่ลู่เข้า</w:t>
+        <w:t>การสลับโหมดทำให้บทบาทของ controller state เปลี่ยนไป หากกลไกการถ่ายโอนสถานะ (State Transfer Mechanism) ไม่ถูกต้องจะเกิดการกระโดดของกระแสที่จุดเชื่อมต่อ และทำให้ตัวแก้ Newton ในขั้นเวลาถัดไปไม่ลู่เข้า</w:t>
       </w:r>
     </w:p>
     <w:p>
@@ -36979,12 +36965,7 @@
         <w:jc w:val="left"/>
       </w:pPr>
       <w:r>
-        <w:rPr>
-          <w:sz w:val="32"/>
-        </w:rPr>
-        <w:t>4.</w:t>
-        <w:tab/>
-        <w:t>ประยุกต์ใช้วิธีคำนวณแบบสี่เหลี่ยมคางหมูอิมพลิซิตร่วมกับการควบคุมขนาดขั้นเวลาอัตโนมัติ และการจัดตำแหน่งเหตุการณ์ให้ตรงกับขอบเขตขั้นเวลา (Event-to-Time-step Boundary Alignment) เพื่อรักษาความต่อเนื่องทางคณิตศาสตร์และเสถียรภาพเชิงตัวเลขของการจำลอง</w:t>
+        <w:t>กำหนดเวลาเหตุการณ์ให้ตรงกับขอบเขตขั้นเวลาของการคำนวณ เพื่อรักษาความต่อเนื่องทางคณิตศาสตร์และเสถียรภาพเชิงตัวเลขของการจำลอง</w:t>
       </w:r>
     </w:p>
     <w:p>

</xml_diff>

<commit_message>
docs(report): final typo & render defect pass — restored exact SSSA Omega math values and Table 4 row 1, fixed heading hierarchy, repaired 4 clean benefit items, updated translationese and provenance typo
</commit_message>
<xml_diff>
--- a/docs/source/Forming Framework for Inverter-Based Resources.docx
+++ b/docs/source/Forming Framework for Inverter-Based Resources.docx
@@ -1302,13 +1302,6 @@
         </w:rPr>
       </w:pPr>
       <w:r>
-        <w:rPr>
-          <w:b/>
-          <w:bCs/>
-          <w:sz w:val="32"/>
-          <w:szCs w:val="32"/>
-          <w:cs/>
-        </w:rPr>
         <w:t>1. ขอบเขตของงาน ที่มาของข้อมูล</w:t>
       </w:r>
     </w:p>
@@ -1557,415 +1550,9 @@
         <w:spacing w:before="60" w:line="320" w:lineRule="exact"/>
         <w:ind w:firstLine="360"/>
       </w:pPr>
-      <w:proofErr w:type="spellStart"/>
-      <w:r>
-        <w:rPr>
-          <w:sz w:val="32"/>
-          <w:szCs w:val="32"/>
-        </w:rPr>
-        <w:t>ที่มาของข้อมูลนำเข้า</w:t>
-      </w:r>
-      <w:proofErr w:type="spellEnd"/>
-      <w:r>
-        <w:rPr>
-          <w:sz w:val="32"/>
-          <w:szCs w:val="32"/>
-        </w:rPr>
-        <w:t xml:space="preserve">  </w:t>
-      </w:r>
-      <w:proofErr w:type="spellStart"/>
-      <w:r>
-        <w:rPr>
-          <w:sz w:val="32"/>
-          <w:szCs w:val="32"/>
-        </w:rPr>
-        <w:t>ข้อมูลเครือข่าย</w:t>
-      </w:r>
-      <w:proofErr w:type="spellEnd"/>
-      <w:r>
-        <w:rPr>
-          <w:sz w:val="32"/>
-          <w:szCs w:val="32"/>
-        </w:rPr>
-        <w:t xml:space="preserve"> </w:t>
-      </w:r>
-      <w:proofErr w:type="spellStart"/>
-      <w:r>
-        <w:rPr>
-          <w:sz w:val="32"/>
-          <w:szCs w:val="32"/>
-        </w:rPr>
-        <w:t>พิกัดสายส่ง</w:t>
-      </w:r>
-      <w:proofErr w:type="spellEnd"/>
-      <w:r>
-        <w:rPr>
-          <w:sz w:val="32"/>
-          <w:szCs w:val="32"/>
-        </w:rPr>
-        <w:t xml:space="preserve"> </w:t>
-      </w:r>
-      <w:proofErr w:type="spellStart"/>
-      <w:r>
-        <w:rPr>
-          <w:sz w:val="32"/>
-          <w:szCs w:val="32"/>
-        </w:rPr>
-        <w:t>หม้อแปลงที่มีแท็ป</w:t>
-      </w:r>
-      <w:proofErr w:type="spellEnd"/>
-      <w:r>
-        <w:rPr>
-          <w:sz w:val="32"/>
-          <w:szCs w:val="32"/>
-        </w:rPr>
-        <w:t xml:space="preserve"> </w:t>
-      </w:r>
-      <w:proofErr w:type="spellStart"/>
-      <w:r>
-        <w:rPr>
-          <w:sz w:val="32"/>
-          <w:szCs w:val="32"/>
-        </w:rPr>
-        <w:t>และตารางโหลดใช้กรณีทดสอบ</w:t>
-      </w:r>
-      <w:proofErr w:type="spellEnd"/>
-      <w:r>
-        <w:rPr>
-          <w:sz w:val="32"/>
-          <w:szCs w:val="32"/>
-        </w:rPr>
-        <w:t xml:space="preserve"> IEEE 14-bus </w:t>
-      </w:r>
-      <w:proofErr w:type="spellStart"/>
-      <w:r>
-        <w:rPr>
-          <w:sz w:val="32"/>
-          <w:szCs w:val="32"/>
-        </w:rPr>
-        <w:t>ในรูปแบบ</w:t>
-      </w:r>
-      <w:proofErr w:type="spellEnd"/>
-      <w:r>
-        <w:rPr>
-          <w:sz w:val="32"/>
-          <w:szCs w:val="32"/>
-        </w:rPr>
-        <w:t xml:space="preserve"> IEEE Common Data Format </w:t>
-      </w:r>
-      <w:proofErr w:type="spellStart"/>
-      <w:r>
-        <w:rPr>
-          <w:sz w:val="32"/>
-          <w:szCs w:val="32"/>
-        </w:rPr>
-        <w:t>ตามที่เผยแพร่ในชุด</w:t>
-      </w:r>
-      <w:proofErr w:type="spellEnd"/>
-      <w:r>
-        <w:rPr>
-          <w:sz w:val="32"/>
-          <w:szCs w:val="32"/>
-        </w:rPr>
-        <w:t xml:space="preserve"> MATPOWER [5] </w:t>
-      </w:r>
-      <w:proofErr w:type="spellStart"/>
-      <w:r>
-        <w:rPr>
-          <w:sz w:val="32"/>
-          <w:szCs w:val="32"/>
-        </w:rPr>
-        <w:t>พลวัตของ</w:t>
-      </w:r>
-      <w:proofErr w:type="spellEnd"/>
-      <w:r>
-        <w:rPr>
-          <w:sz w:val="32"/>
-          <w:szCs w:val="32"/>
-        </w:rPr>
-        <w:t xml:space="preserve"> SG </w:t>
-      </w:r>
-      <w:proofErr w:type="spellStart"/>
-      <w:r>
-        <w:rPr>
-          <w:sz w:val="32"/>
-          <w:szCs w:val="32"/>
-        </w:rPr>
-        <w:t>ใช้ค่าจากรายงานทางเทคนิคของ</w:t>
-      </w:r>
-      <w:proofErr w:type="spellEnd"/>
-      <w:r>
-        <w:rPr>
-          <w:sz w:val="32"/>
-          <w:szCs w:val="32"/>
-        </w:rPr>
-        <w:t xml:space="preserve"> Kodsi </w:t>
-      </w:r>
-      <w:proofErr w:type="spellStart"/>
-      <w:r>
-        <w:rPr>
-          <w:sz w:val="32"/>
-          <w:szCs w:val="32"/>
-        </w:rPr>
-        <w:t>และ</w:t>
-      </w:r>
-      <w:proofErr w:type="spellEnd"/>
-      <w:r>
-        <w:rPr>
-          <w:sz w:val="32"/>
-          <w:szCs w:val="32"/>
-        </w:rPr>
-        <w:t xml:space="preserve"> Cañizares [6] </w:t>
-      </w:r>
-      <w:proofErr w:type="spellStart"/>
-      <w:r>
-        <w:rPr>
-          <w:sz w:val="32"/>
-          <w:szCs w:val="32"/>
-        </w:rPr>
-        <w:t>โดยแปลงฐานจากฐานเครื่องมาเป็นฐานระบบ</w:t>
-      </w:r>
-      <w:proofErr w:type="spellEnd"/>
-      <w:r>
-        <w:rPr>
-          <w:sz w:val="32"/>
-          <w:szCs w:val="32"/>
-        </w:rPr>
-        <w:t xml:space="preserve"> </w:t>
-      </w:r>
-      <w:proofErr w:type="spellStart"/>
-      <w:r>
-        <w:rPr>
-          <w:sz w:val="32"/>
-          <w:szCs w:val="32"/>
-        </w:rPr>
-        <w:t>ส่วนโครงสร้างของ</w:t>
-      </w:r>
-      <w:proofErr w:type="spellEnd"/>
-      <w:r>
-        <w:rPr>
-          <w:sz w:val="32"/>
-          <w:szCs w:val="32"/>
-        </w:rPr>
-        <w:t xml:space="preserve"> IBR </w:t>
-      </w:r>
-      <w:proofErr w:type="spellStart"/>
-      <w:r>
-        <w:rPr>
-          <w:sz w:val="32"/>
-          <w:szCs w:val="32"/>
-        </w:rPr>
-        <w:t>สองโหมดประกอบขึ้นจากบล็อกมาตรฐานในเอกสารอ้างอิง</w:t>
-      </w:r>
-      <w:proofErr w:type="spellEnd"/>
-      <w:r>
-        <w:rPr>
-          <w:sz w:val="32"/>
-          <w:szCs w:val="32"/>
-        </w:rPr>
-        <w:t xml:space="preserve"> </w:t>
-      </w:r>
-      <w:proofErr w:type="spellStart"/>
-      <w:r>
-        <w:rPr>
-          <w:sz w:val="32"/>
-          <w:szCs w:val="32"/>
-        </w:rPr>
-        <w:t>คือวงควบคุมกระแสและ</w:t>
-      </w:r>
-      <w:proofErr w:type="spellEnd"/>
-      <w:r>
-        <w:rPr>
-          <w:sz w:val="32"/>
-          <w:szCs w:val="32"/>
-        </w:rPr>
-        <w:t xml:space="preserve"> PLL </w:t>
-      </w:r>
-      <w:proofErr w:type="spellStart"/>
-      <w:r>
-        <w:rPr>
-          <w:sz w:val="32"/>
-          <w:szCs w:val="32"/>
-        </w:rPr>
-        <w:t>ตาม</w:t>
-      </w:r>
-      <w:proofErr w:type="spellEnd"/>
-      <w:r>
-        <w:rPr>
-          <w:sz w:val="32"/>
-          <w:szCs w:val="32"/>
-        </w:rPr>
-        <w:t xml:space="preserve"> Yazdani </w:t>
-      </w:r>
-      <w:proofErr w:type="spellStart"/>
-      <w:r>
-        <w:rPr>
-          <w:sz w:val="32"/>
-          <w:szCs w:val="32"/>
-        </w:rPr>
-        <w:t>และ</w:t>
-      </w:r>
-      <w:proofErr w:type="spellEnd"/>
-      <w:r>
-        <w:rPr>
-          <w:sz w:val="32"/>
-          <w:szCs w:val="32"/>
-        </w:rPr>
-        <w:t xml:space="preserve"> Iravani [7] </w:t>
-      </w:r>
-      <w:proofErr w:type="spellStart"/>
-      <w:r>
-        <w:rPr>
-          <w:sz w:val="32"/>
-          <w:szCs w:val="32"/>
-        </w:rPr>
-        <w:t>กับ</w:t>
-      </w:r>
-      <w:proofErr w:type="spellEnd"/>
-      <w:r>
-        <w:rPr>
-          <w:sz w:val="32"/>
-          <w:szCs w:val="32"/>
-        </w:rPr>
-        <w:t xml:space="preserve"> Teodorescu </w:t>
-      </w:r>
-      <w:proofErr w:type="spellStart"/>
-      <w:r>
-        <w:rPr>
-          <w:sz w:val="32"/>
-          <w:szCs w:val="32"/>
-        </w:rPr>
-        <w:t>และคณะ</w:t>
-      </w:r>
-      <w:proofErr w:type="spellEnd"/>
-      <w:r>
-        <w:rPr>
-          <w:sz w:val="32"/>
-          <w:szCs w:val="32"/>
-        </w:rPr>
-        <w:t xml:space="preserve"> [8] </w:t>
-      </w:r>
-      <w:proofErr w:type="spellStart"/>
-      <w:r>
-        <w:rPr>
-          <w:sz w:val="32"/>
-          <w:szCs w:val="32"/>
-        </w:rPr>
-        <w:t>วงกำลังชั้นนอกตาม</w:t>
-      </w:r>
-      <w:proofErr w:type="spellEnd"/>
-      <w:r>
-        <w:rPr>
-          <w:sz w:val="32"/>
-          <w:szCs w:val="32"/>
-        </w:rPr>
-        <w:t xml:space="preserve"> Bacha </w:t>
-      </w:r>
-      <w:proofErr w:type="spellStart"/>
-      <w:r>
-        <w:rPr>
-          <w:sz w:val="32"/>
-          <w:szCs w:val="32"/>
-        </w:rPr>
-        <w:t>และคณะ</w:t>
-      </w:r>
-      <w:proofErr w:type="spellEnd"/>
-      <w:r>
-        <w:rPr>
-          <w:sz w:val="32"/>
-          <w:szCs w:val="32"/>
-        </w:rPr>
-        <w:t xml:space="preserve"> [9] </w:t>
-      </w:r>
-      <w:proofErr w:type="spellStart"/>
-      <w:r>
-        <w:rPr>
-          <w:sz w:val="32"/>
-          <w:szCs w:val="32"/>
-        </w:rPr>
-        <w:t>และเครื่องซิงโครนัสเสมือนแบบไม่มี</w:t>
-      </w:r>
-      <w:proofErr w:type="spellEnd"/>
-      <w:r>
-        <w:rPr>
-          <w:sz w:val="32"/>
-          <w:szCs w:val="32"/>
-        </w:rPr>
-        <w:t xml:space="preserve"> PLL </w:t>
-      </w:r>
-      <w:proofErr w:type="spellStart"/>
-      <w:r>
-        <w:rPr>
-          <w:sz w:val="32"/>
-          <w:szCs w:val="32"/>
-        </w:rPr>
-        <w:t>ตาม</w:t>
-      </w:r>
-      <w:proofErr w:type="spellEnd"/>
-      <w:r>
-        <w:rPr>
-          <w:sz w:val="32"/>
-          <w:szCs w:val="32"/>
-        </w:rPr>
-        <w:t xml:space="preserve"> Sakimoto </w:t>
-      </w:r>
-      <w:proofErr w:type="spellStart"/>
-      <w:r>
-        <w:rPr>
-          <w:sz w:val="32"/>
-          <w:szCs w:val="32"/>
-        </w:rPr>
-        <w:t>และคณะ</w:t>
-      </w:r>
-      <w:proofErr w:type="spellEnd"/>
-      <w:r>
-        <w:rPr>
-          <w:sz w:val="32"/>
-          <w:szCs w:val="32"/>
-        </w:rPr>
-        <w:t xml:space="preserve"> [10] </w:t>
-      </w:r>
-      <w:proofErr w:type="spellStart"/>
-      <w:r>
-        <w:rPr>
-          <w:sz w:val="32"/>
-          <w:szCs w:val="32"/>
-        </w:rPr>
-        <w:t>ส่วนค่าเกนและพารามิเตอร์ของคอนเวอร์เตอร์ในกรณีศึกษานี้เป็นชั้น</w:t>
-      </w:r>
-      <w:proofErr w:type="spellEnd"/>
-      <w:r>
-        <w:rPr>
-          <w:sz w:val="32"/>
-          <w:szCs w:val="32"/>
-        </w:rPr>
-        <w:t xml:space="preserve"> </w:t>
-      </w:r>
-      <w:proofErr w:type="spellStart"/>
-      <w:r>
-        <w:rPr>
-          <w:sz w:val="32"/>
-          <w:szCs w:val="32"/>
-        </w:rPr>
-        <w:t>กำหนดโดยกรณีศึกษา</w:t>
-      </w:r>
-      <w:proofErr w:type="spellEnd"/>
-      <w:r>
-        <w:rPr>
-          <w:sz w:val="32"/>
-          <w:szCs w:val="32"/>
-        </w:rPr>
-        <w:t xml:space="preserve"> </w:t>
-      </w:r>
-      <w:proofErr w:type="spellStart"/>
-      <w:r>
-        <w:rPr>
-          <w:sz w:val="32"/>
-          <w:szCs w:val="32"/>
-        </w:rPr>
-        <w:t>ซึ่งตรึงไว้ก่อนดูผลทุกตัว</w:t>
-      </w:r>
-      <w:proofErr w:type="spellEnd"/>
+      <w:r>
+        <w:t>ที่มาของข้อมูลนำเข้า  ข้อมูลเครือข่าย พิกัดสายส่ง หม้อแปลงที่มีแท็ป และตารางโหลดใช้กรณีทดสอบ IEEE 14-bus ในรูปแบบ IEEE Common Data Format ตามที่เผยแพร่ในชุด MATPOWER [5] พลวัตของ SG ใช้ค่าจากรายงานทางเทคนิคของ Kodsi และ Cañizares [6] โดยแปลงฐานจากฐานเครื่องมาเป็นฐานระบบ ส่วนโครงสร้างของ IBR สองโหมดประกอบขึ้นจากบล็อกมาตรฐานในเอกสารอ้างอิง คือวงควบคุมกระแสและ PLL ตาม Yazdani และ Iravani [7] กับ Teodorescu และคณะ [8] วงกำลังชั้นนอกตาม Bacha และคณะ [9] และเครื่องซิงโครนัสเสมือนแบบไม่มี PLL ตาม Sakimoto และคณะ [10] ส่วนค่าเกนและพารามิเตอร์ของคอนเวอร์เตอร์กำหนดสำหรับกรณีศึกษา และตรึงค่าก่อนการจำลอง</w:t>
+      </w:r>
     </w:p>
     <w:p>
       <w:pPr>
@@ -12914,9 +12501,239 @@
       <w:pPr>
         <w:spacing w:line="320" w:lineRule="exact"/>
         <w:ind w:firstLine="360"/>
-      </w:pPr>
-      <w:r>
-        <w:t>เมื่อ SG offline ชุดย่อยของ IBR ที่เป็นไปได้ทั้งหมดมี  ชุด ระบบแก้จุดสมดุลและ SSSA ของทุกชุดจากเครือข่ายจริงของชุดนั้น ไม่ประมาณจากจำนวน GFM เพียงอย่างเดียว ผลที่ได้คือผ่านเกณฑ์ 7 จาก 15 ชุด โดยชุดที่ให้ ให้ค่า Ω ต่ำสุดในกลุ่มที่ผ่านเกณฑ์คือชุดสองตัวที่บัส 3 และบัส 6 ซึ่งมี   ในขณะที่การให้ทั้งสี่ตัวเป็น GFM ให้   และชุดหนึ่งเครื่องที่ให้ค่า Ω ต่ำสุดให้   ผลนี้แสดงว่าการเพิ่มจำนวน GFM ไม่ได้ทำให้ damping margin ดีขึ้นแบบทางเดียว ซึ่งเป็นเหตุผลที่ตารางชุดอุปกรณ์ที่พิจารณา ต้องคำนวณจริงทุกชุด ไม่สามารถอนุมานจากจำนวนอุปกรณ์ได้</w:t>
+        <w:jc w:val="thaiDistribute"/>
+      </w:pPr>
+      <w:r>
+        <w:rPr>
+          <w:sz w:val="32"/>
+          <w:szCs w:val="32"/>
+          <w:cs/>
+        </w:rPr>
+        <w:t xml:space="preserve">เมื่อ SG offline ชุดย่อยของ IBR ที่เป็นไปได้ทั้งหมดมี </w:t>
+      </w:r>
+      <m:oMath>
+        <m:sSup>
+          <m:sSupPr>
+            <m:ctrlPr>
+              <w:rPr>
+                <w:rFonts w:ascii="Cambria Math" w:hAnsi="Cambria Math"/>
+                <w:sz w:val="22"/>
+                <w:szCs w:val="22"/>
+              </w:rPr>
+            </m:ctrlPr>
+          </m:sSupPr>
+          <m:e>
+            <m:r>
+              <w:rPr>
+                <w:rFonts w:ascii="Cambria Math" w:hAnsi="Cambria Math"/>
+                <w:sz w:val="22"/>
+                <w:szCs w:val="22"/>
+              </w:rPr>
+              <m:t>2</m:t>
+            </m:r>
+          </m:e>
+          <m:sup>
+            <m:r>
+              <w:rPr>
+                <w:rFonts w:ascii="Cambria Math" w:hAnsi="Cambria Math"/>
+                <w:sz w:val="22"/>
+                <w:szCs w:val="22"/>
+              </w:rPr>
+              <m:t>4</m:t>
+            </m:r>
+          </m:sup>
+        </m:sSup>
+        <m:r>
+          <w:rPr>
+            <w:rFonts w:ascii="Cambria Math" w:hAnsi="Cambria Math"/>
+            <w:sz w:val="22"/>
+            <w:szCs w:val="22"/>
+          </w:rPr>
+          <m:t>-1=15</m:t>
+        </m:r>
+      </m:oMath>
+      <w:r>
+        <w:rPr>
+          <w:sz w:val="32"/>
+          <w:szCs w:val="32"/>
+          <w:cs/>
+        </w:rPr>
+        <w:t xml:space="preserve"> ชุด ระบบแก้จุดสมดุลและ SSSA ของทุกชุดจากเครือข่ายจริงของชุดนั้น ไม่ประมาณจากจำนวน GFM เพียงอย่างเดียว ผลที่ได้คือผ่านเกณฑ์ 7 จาก 15 ชุด โดยชุดที่ให้ค่า Ω ต่ำสุดในกลุ่มที่ผ่านเกณฑ์คือชุดสองตัวที่บัส 3 และบัส 6 ซึ่งมี </w:t>
+      </w:r>
+      <m:oMath>
+        <m:r>
+          <w:rPr>
+            <w:rFonts w:ascii="Cambria Math" w:hAnsi="Cambria Math"/>
+            <w:sz w:val="22"/>
+            <w:szCs w:val="22"/>
+          </w:rPr>
+          <m:t>Ω=-0.</m:t>
+        </m:r>
+        <m:r>
+          <w:rPr>
+            <w:rFonts w:ascii="Cambria Math" w:hAnsi="Cambria Math"/>
+            <w:sz w:val="20"/>
+            <w:szCs w:val="20"/>
+          </w:rPr>
+          <m:t>56814</m:t>
+        </m:r>
+      </m:oMath>
+      <w:r>
+        <w:rPr>
+          <w:sz w:val="32"/>
+          <w:szCs w:val="32"/>
+          <w:cs/>
+        </w:rPr>
+        <w:t xml:space="preserve"> </w:t>
+      </w:r>
+      <m:oMath>
+        <m:sSup>
+          <m:sSupPr>
+            <m:ctrlPr>
+              <w:rPr>
+                <w:rFonts w:ascii="Cambria Math" w:hAnsi="Cambria Math"/>
+              </w:rPr>
+            </m:ctrlPr>
+          </m:sSupPr>
+          <m:e>
+            <m:r>
+              <m:rPr>
+                <m:nor/>
+              </m:rPr>
+              <m:t>s</m:t>
+            </m:r>
+          </m:e>
+          <m:sup>
+            <m:r>
+              <w:rPr>
+                <w:rFonts w:ascii="Cambria Math" w:hAnsi="Cambria Math"/>
+              </w:rPr>
+              <m:t>-1</m:t>
+            </m:r>
+          </m:sup>
+        </m:sSup>
+      </m:oMath>
+      <w:r>
+        <w:rPr>
+          <w:sz w:val="32"/>
+          <w:szCs w:val="32"/>
+          <w:cs/>
+        </w:rPr>
+        <w:t xml:space="preserve"> ในขณะที่การให้ทั้งสี่ตัวเป็น GFM ให้ </w:t>
+      </w:r>
+      <m:oMath>
+        <m:r>
+          <w:rPr>
+            <w:rFonts w:ascii="Cambria Math" w:hAnsi="Cambria Math"/>
+            <w:sz w:val="22"/>
+            <w:szCs w:val="22"/>
+          </w:rPr>
+          <m:t>Ω=-0.48291</m:t>
+        </m:r>
+      </m:oMath>
+      <w:r>
+        <w:rPr>
+          <w:sz w:val="32"/>
+          <w:szCs w:val="32"/>
+          <w:cs/>
+        </w:rPr>
+        <w:t xml:space="preserve"> </w:t>
+      </w:r>
+      <m:oMath>
+        <m:sSup>
+          <m:sSupPr>
+            <m:ctrlPr>
+              <w:rPr>
+                <w:rFonts w:ascii="Cambria Math" w:hAnsi="Cambria Math"/>
+              </w:rPr>
+            </m:ctrlPr>
+          </m:sSupPr>
+          <m:e>
+            <m:r>
+              <m:rPr>
+                <m:nor/>
+              </m:rPr>
+              <m:t>s</m:t>
+            </m:r>
+          </m:e>
+          <m:sup>
+            <m:r>
+              <w:rPr>
+                <w:rFonts w:ascii="Cambria Math" w:hAnsi="Cambria Math"/>
+              </w:rPr>
+              <m:t>-1</m:t>
+            </m:r>
+          </m:sup>
+        </m:sSup>
+      </m:oMath>
+      <w:r>
+        <w:rPr>
+          <w:sz w:val="32"/>
+          <w:szCs w:val="32"/>
+          <w:cs/>
+        </w:rPr>
+        <w:t xml:space="preserve"> และชุดหนึ่งเครื่องที่ให้ค่า Ω ต่ำสุดให้ </w:t>
+      </w:r>
+      <m:oMath>
+        <m:r>
+          <w:rPr>
+            <w:rFonts w:ascii="Cambria Math" w:hAnsi="Cambria Math"/>
+            <w:sz w:val="22"/>
+            <w:szCs w:val="22"/>
+          </w:rPr>
+          <m:t>Ω=-0.</m:t>
+        </m:r>
+        <m:r>
+          <w:rPr>
+            <w:rFonts w:ascii="Cambria Math" w:hAnsi="Cambria Math"/>
+            <w:sz w:val="20"/>
+            <w:szCs w:val="20"/>
+          </w:rPr>
+          <m:t>32801</m:t>
+        </m:r>
+      </m:oMath>
+      <w:r>
+        <w:rPr>
+          <w:sz w:val="32"/>
+          <w:szCs w:val="32"/>
+          <w:cs/>
+        </w:rPr>
+        <w:t xml:space="preserve"> </w:t>
+      </w:r>
+      <m:oMath>
+        <m:sSup>
+          <m:sSupPr>
+            <m:ctrlPr>
+              <w:rPr>
+                <w:rFonts w:ascii="Cambria Math" w:hAnsi="Cambria Math"/>
+              </w:rPr>
+            </m:ctrlPr>
+          </m:sSupPr>
+          <m:e>
+            <m:r>
+              <m:rPr>
+                <m:nor/>
+              </m:rPr>
+              <m:t>s</m:t>
+            </m:r>
+          </m:e>
+          <m:sup>
+            <m:r>
+              <w:rPr>
+                <w:rFonts w:ascii="Cambria Math" w:hAnsi="Cambria Math"/>
+              </w:rPr>
+              <m:t>-1</m:t>
+            </m:r>
+          </m:sup>
+        </m:sSup>
+      </m:oMath>
+      <w:r>
+        <w:rPr>
+          <w:sz w:val="32"/>
+          <w:szCs w:val="32"/>
+          <w:cs/>
+        </w:rPr>
+        <w:t xml:space="preserve"> ผลนี้แสดงว่าการเพิ่มจำนวน GFM ไม่ได้ทำให้ damping margin ดีขึ้นแบบทางเดียว ซึ่งเป็นเหตุผลที่ตารางชุดอุปกรณ์ที่พิจารณา ต้องคำนวณจริงทุกชุด ไม่สามารถอนุมานจากจำนวนอุปกรณ์ได้</w:t>
       </w:r>
     </w:p>
     <w:p>
@@ -13126,11 +12943,34 @@
         </w:tc>
         <w:tc>
           <w:tcPr>
-            <w:tcW w:w="5192" w:type="dxa"/>
-          </w:tcPr>
-          <w:p>
-            <w:r>
-              <w:t>ทุกชุดตัวเดียวผ่านการคัดกรองเชิงเส้น; ชุดที่ให้ค่า Ω ต่ำสุดคือบัส 2 ()</w:t>
+            <w:tcW w:w="5759" w:type="dxa"/>
+          </w:tcPr>
+          <w:p>
+            <w:r>
+              <w:rPr>
+                <w:sz w:val="26"/>
+                <w:szCs w:val="26"/>
+                <w:cs/>
+              </w:rPr>
+              <w:t>ทุกชุดตัวเดียวผ่านการคัดกรองเชิงเส้น; ชุดที่ให้ค่า Ω ต่ำสุดคือบัส 2 (</w:t>
+            </w:r>
+            <m:oMath>
+              <m:r>
+                <w:rPr>
+                  <w:rFonts w:ascii="Cambria Math" w:hAnsi="Cambria Math"/>
+                  <w:sz w:val="22"/>
+                  <w:szCs w:val="22"/>
+                </w:rPr>
+                <m:t>Ω=-0.32801</m:t>
+              </m:r>
+            </m:oMath>
+            <w:r>
+              <w:rPr>
+                <w:sz w:val="26"/>
+                <w:szCs w:val="26"/>
+                <w:cs/>
+              </w:rPr>
+              <w:t>)</w:t>
             </w:r>
           </w:p>
         </w:tc>
@@ -16524,12 +16364,7 @@
         </w:rPr>
       </w:pPr>
       <w:r>
-        <w:rPr>
-          <w:sz w:val="32"/>
-          <w:szCs w:val="32"/>
-          <w:cs/>
-        </w:rPr>
-        <w:t>เมื่อนำทั้งสามกลุ่มมาเรียงใน fixed layout จะได้</w:t>
+        <w:t>เมื่อนำทั้งสามกลุ่มมาเรียงในเวกเตอร์สถานะขนาดคงที่ จะได้</w:t>
       </w:r>
     </w:p>
     <w:p>
@@ -37146,145 +36981,30 @@
       </w:r>
     </w:p>
     <w:p>
-      <w:pPr>
-        <w:pStyle w:val="af1"/>
-        <w:numPr>
-          <w:ilvl w:val="0"/>
-          <w:numId w:val="24"/>
-        </w:numPr>
-      </w:pPr>
-      <w:proofErr w:type="spellStart"/>
-      <w:r>
-        <w:rPr>
-          <w:sz w:val="32"/>
-        </w:rPr>
-        <w:t>ได้แบบจำลองอุปกรณ์</w:t>
-      </w:r>
-      <w:proofErr w:type="spellEnd"/>
-      <w:r>
-        <w:rPr>
-          <w:sz w:val="32"/>
-        </w:rPr>
-        <w:t xml:space="preserve"> IBR </w:t>
-      </w:r>
-      <w:proofErr w:type="spellStart"/>
-      <w:r>
-        <w:rPr>
-          <w:sz w:val="32"/>
-        </w:rPr>
-        <w:t>สำหรับการทำงานแบบ</w:t>
-      </w:r>
-      <w:proofErr w:type="spellEnd"/>
-      <w:r>
-        <w:rPr>
-          <w:sz w:val="32"/>
-        </w:rPr>
-        <w:t xml:space="preserve"> GFL (10 สถานะ) และ GFM (11 สถานะ) ภายในอุปกรณ์ชุดเดียวกัน</w:t>
+      <w:r>
+        <w:t>1.</w:t>
+        <w:tab/>
+        <w:t>ได้แบบจำลองอุปกรณ์ IBR สำหรับการทำงานแบบ GFL (10 สถานะ) และ GFM (11 สถานะ) ภายในอุปกรณ์ชุดเดียวกัน</w:t>
       </w:r>
     </w:p>
     <w:p>
-      <w:pPr>
-        <w:pStyle w:val="af1"/>
-        <w:numPr>
-          <w:ilvl w:val="0"/>
-          <w:numId w:val="24"/>
-        </w:numPr>
-      </w:pPr>
-      <w:r>
-        <w:rPr>
-          <w:sz w:val="32"/>
-        </w:rPr>
-        <w:t>ได้กลไกตัวกำกับอัตโนมัติสำหรับการตัดสินใจสลับโหมดตามสภาวะ</w:t>
-      </w:r>
-      <w:proofErr w:type="spellStart"/>
-      <w:r>
-        <w:rPr>
-          <w:sz w:val="32"/>
-        </w:rPr>
-        <w:t>แรงดันและความถี่ของ</w:t>
-      </w:r>
-      <w:proofErr w:type="spellEnd"/>
+      <w:r>
+        <w:t>2.</w:t>
+        <w:tab/>
+        <w:t>ได้กลไกตัวกำกับอัตโนมัติสำหรับการตัดสินใจสลับโหมดตามสภาวะแรงดันและความถี่ของระบบ พร้อมการถ่ายโอนสถานะอย่างต่อเนื่อง</w:t>
+      </w:r>
     </w:p>
     <w:p>
-      <w:pPr>
-        <w:pStyle w:val="af1"/>
-        <w:numPr>
-          <w:ilvl w:val="0"/>
-          <w:numId w:val="24"/>
-        </w:numPr>
-      </w:pPr>
-      <w:proofErr w:type="spellStart"/>
-      <w:r>
-        <w:rPr>
-          <w:sz w:val="32"/>
-        </w:rPr>
-        <w:t>ระบบ</w:t>
-      </w:r>
-      <w:proofErr w:type="spellEnd"/>
-      <w:r>
-        <w:rPr>
-          <w:sz w:val="32"/>
-        </w:rPr>
-        <w:t xml:space="preserve"> </w:t>
-      </w:r>
-      <w:proofErr w:type="spellStart"/>
-      <w:r>
-        <w:rPr>
-          <w:sz w:val="32"/>
-        </w:rPr>
-        <w:t>พร้อมการถ่ายโอนสถานะอย่างต่อเนื่อง</w:t>
-      </w:r>
-      <w:proofErr w:type="spellEnd"/>
+      <w:r>
+        <w:t>3.</w:t>
+        <w:tab/>
+        <w:t>ได้ผลการทดสอบเชิงพลวัตบนระบบ IEEE 14-bus ภายใต้เหตุการณ์ปลดเครื่องกำเนิดไฟฟ้า เกิดฟอลต์ และการต่อคืนเครื่องกำเนิดไฟฟ้าซิงโครนัส</w:t>
+      </w:r>
     </w:p>
     <w:p>
-      <w:pPr>
-        <w:pStyle w:val="af1"/>
-        <w:numPr>
-          <w:ilvl w:val="0"/>
-          <w:numId w:val="24"/>
-        </w:numPr>
-      </w:pPr>
-      <w:proofErr w:type="spellStart"/>
-      <w:r>
-        <w:rPr>
-          <w:sz w:val="32"/>
-        </w:rPr>
-        <w:t>ได้ผลการทดสอบเชิงพลวัตบนระบบ</w:t>
-      </w:r>
-      <w:proofErr w:type="spellEnd"/>
-      <w:r>
-        <w:rPr>
-          <w:sz w:val="32"/>
-        </w:rPr>
-        <w:t xml:space="preserve"> IEEE 14-bus </w:t>
-      </w:r>
-      <w:proofErr w:type="spellStart"/>
-      <w:r>
-        <w:rPr>
-          <w:sz w:val="32"/>
-        </w:rPr>
-        <w:t>ภายใต้เหตุการณ์ปลดเครื่องกำเนิดไฟฟ้า</w:t>
-      </w:r>
-      <w:proofErr w:type="spellEnd"/>
-      <w:r>
-        <w:rPr>
-          <w:sz w:val="32"/>
-        </w:rPr>
-        <w:t xml:space="preserve"> เกิดฟอลต์ และการต่อคืนเครื่องกำเนิดไฟฟ้าซิงโครนัส</w:t>
-      </w:r>
-    </w:p>
-    <w:p>
-      <w:pPr>
-        <w:pStyle w:val="af1"/>
-        <w:numPr>
-          <w:ilvl w:val="0"/>
-          <w:numId w:val="24"/>
-        </w:numPr>
-      </w:pPr>
-      <w:r>
-        <w:rPr>
-          <w:sz w:val="32"/>
-        </w:rPr>
+      <w:r>
+        <w:t>4.</w:t>
+        <w:tab/>
         <w:t>ได้ผลการเปรียบเทียบเชิงวิศวกรรมระหว่างกรณีสลับโหมดกับกรณีตรึงโหมด GFL เพื่อเป็นแนวทางในการศึกษาการรักษาเสถียรภาพระบบไฟฟ้ากำลัง</w:t>
       </w:r>
     </w:p>

</xml_diff>